<commit_message>
tp complejidad: ejercicio 5
</commit_message>
<xml_diff>
--- a/practicas/tp-complejidad/march-graciana-tp-complejidad.docx
+++ b/practicas/tp-complejidad/march-graciana-tp-complejidad.docx
@@ -946,15 +946,18 @@
       </w:r>
     </w:p>
     <w:p>
-      <w:r>
-        <w:t xml:space="preserve">Implementar un algoritmo </w:t>
-      </w:r>
-      <w:r>
-        <w:rPr>
-          <w:b/>
-          <w:bCs/>
-        </w:rPr>
-        <w:t>Contiene-Suma(</w:t>
+      <w:pPr>
+        <w:rPr>
+          <w:b/>
+          <w:bCs/>
+        </w:rPr>
+      </w:pPr>
+      <w:r>
+        <w:rPr>
+          <w:b/>
+          <w:bCs/>
+        </w:rPr>
+        <w:t>Implementar un algoritmo Contiene-Suma(</w:t>
       </w:r>
       <w:proofErr w:type="spellStart"/>
       <w:r>
@@ -970,12 +973,202 @@
           <w:b/>
           <w:bCs/>
         </w:rPr>
-        <w:t>)</w:t>
-      </w:r>
-      <w:r>
-        <w:t xml:space="preserve"> que recibe una lista de enteros A y un entero n y devuelve True si existen en A un par de elementos que sumados den n. Analice el costo computacional.</w:t>
-      </w:r>
-    </w:p>
+        <w:t>) que recibe una lista de enteros A y un entero n y devuelve True si existen en A un par de elementos que sumados den n. Analice el costo computacional.</w:t>
+      </w:r>
+    </w:p>
+    <w:p>
+      <w:r>
+        <w:t>Realicé dos algoritmos para resolver el problema, cada uno con un costo computacional diferente: uno tiene una complejidad de O(n²), mientras que el otro logra reducirla a O(n).</w:t>
+      </w:r>
+    </w:p>
+    <w:tbl>
+      <w:tblPr>
+        <w:tblStyle w:val="Tablaconcuadrcula"/>
+        <w:tblW w:w="0" w:type="auto"/>
+        <w:tblLook w:val="04A0" w:firstRow="1" w:lastRow="0" w:firstColumn="1" w:lastColumn="0" w:noHBand="0" w:noVBand="1"/>
+      </w:tblPr>
+      <w:tblGrid>
+        <w:gridCol w:w="1947"/>
+        <w:gridCol w:w="3860"/>
+        <w:gridCol w:w="2687"/>
+      </w:tblGrid>
+      <w:tr>
+        <w:tc>
+          <w:tcPr>
+            <w:tcW w:w="0" w:type="auto"/>
+            <w:hideMark/>
+          </w:tcPr>
+          <w:p>
+            <w:pPr>
+              <w:spacing w:after="160" w:line="278" w:lineRule="auto"/>
+              <w:rPr>
+                <w:b/>
+                <w:bCs/>
+              </w:rPr>
+            </w:pPr>
+            <w:r>
+              <w:rPr>
+                <w:b/>
+                <w:bCs/>
+              </w:rPr>
+              <w:t>Algoritmo</w:t>
+            </w:r>
+          </w:p>
+        </w:tc>
+        <w:tc>
+          <w:tcPr>
+            <w:tcW w:w="3860" w:type="dxa"/>
+            <w:hideMark/>
+          </w:tcPr>
+          <w:p>
+            <w:pPr>
+              <w:spacing w:after="160" w:line="278" w:lineRule="auto"/>
+              <w:rPr>
+                <w:b/>
+                <w:bCs/>
+              </w:rPr>
+            </w:pPr>
+            <w:r>
+              <w:rPr>
+                <w:b/>
+                <w:bCs/>
+              </w:rPr>
+              <w:t>Características</w:t>
+            </w:r>
+          </w:p>
+        </w:tc>
+        <w:tc>
+          <w:tcPr>
+            <w:tcW w:w="2687" w:type="dxa"/>
+            <w:hideMark/>
+          </w:tcPr>
+          <w:p>
+            <w:pPr>
+              <w:spacing w:after="160" w:line="278" w:lineRule="auto"/>
+              <w:rPr>
+                <w:b/>
+                <w:bCs/>
+              </w:rPr>
+            </w:pPr>
+            <w:r>
+              <w:rPr>
+                <w:b/>
+                <w:bCs/>
+              </w:rPr>
+              <w:t>Costo computacional</w:t>
+            </w:r>
+          </w:p>
+        </w:tc>
+      </w:tr>
+      <w:tr>
+        <w:tc>
+          <w:tcPr>
+            <w:tcW w:w="0" w:type="auto"/>
+            <w:hideMark/>
+          </w:tcPr>
+          <w:p>
+            <w:pPr>
+              <w:spacing w:after="160" w:line="278" w:lineRule="auto"/>
+            </w:pPr>
+            <w:proofErr w:type="spellStart"/>
+            <w:r>
+              <w:t>contiene_suma</w:t>
+            </w:r>
+            <w:proofErr w:type="spellEnd"/>
+          </w:p>
+        </w:tc>
+        <w:tc>
+          <w:tcPr>
+            <w:tcW w:w="3860" w:type="dxa"/>
+            <w:hideMark/>
+          </w:tcPr>
+          <w:p>
+            <w:pPr>
+              <w:spacing w:after="160" w:line="278" w:lineRule="auto"/>
+            </w:pPr>
+            <w:r>
+              <w:t xml:space="preserve">Recorre la lista mediante dos ciclos </w:t>
+            </w:r>
+            <w:proofErr w:type="spellStart"/>
+            <w:r>
+              <w:t>for</w:t>
+            </w:r>
+            <w:proofErr w:type="spellEnd"/>
+            <w:r>
+              <w:t>, comparando cada elemento con los siguientes para encontrar un par cuya suma sea igual a n.</w:t>
+            </w:r>
+          </w:p>
+        </w:tc>
+        <w:tc>
+          <w:tcPr>
+            <w:tcW w:w="2687" w:type="dxa"/>
+            <w:hideMark/>
+          </w:tcPr>
+          <w:p>
+            <w:pPr>
+              <w:spacing w:after="160" w:line="278" w:lineRule="auto"/>
+            </w:pPr>
+            <w:r>
+              <w:rPr>
+                <w:b/>
+                <w:bCs/>
+              </w:rPr>
+              <w:t>O(n²)</w:t>
+            </w:r>
+          </w:p>
+        </w:tc>
+      </w:tr>
+      <w:tr>
+        <w:tc>
+          <w:tcPr>
+            <w:tcW w:w="0" w:type="auto"/>
+            <w:hideMark/>
+          </w:tcPr>
+          <w:p>
+            <w:pPr>
+              <w:spacing w:after="160" w:line="278" w:lineRule="auto"/>
+            </w:pPr>
+            <w:r>
+              <w:lastRenderedPageBreak/>
+              <w:t>contiene_suma2</w:t>
+            </w:r>
+          </w:p>
+        </w:tc>
+        <w:tc>
+          <w:tcPr>
+            <w:tcW w:w="3860" w:type="dxa"/>
+            <w:hideMark/>
+          </w:tcPr>
+          <w:p>
+            <w:pPr>
+              <w:spacing w:after="160" w:line="278" w:lineRule="auto"/>
+            </w:pPr>
+            <w:r>
+              <w:t>Calcula el complemento que necesita cada elemento para alcanzar n y lo busca en un conjunto de elementos ya recorridos.</w:t>
+            </w:r>
+          </w:p>
+        </w:tc>
+        <w:tc>
+          <w:tcPr>
+            <w:tcW w:w="2687" w:type="dxa"/>
+            <w:hideMark/>
+          </w:tcPr>
+          <w:p>
+            <w:pPr>
+              <w:spacing w:after="160" w:line="278" w:lineRule="auto"/>
+            </w:pPr>
+            <w:r>
+              <w:rPr>
+                <w:b/>
+                <w:bCs/>
+              </w:rPr>
+              <w:t>O(n)</w:t>
+            </w:r>
+          </w:p>
+        </w:tc>
+      </w:tr>
+    </w:tbl>
+    <w:p/>
     <w:p>
       <w:pPr>
         <w:rPr>
@@ -1093,7 +1286,6 @@
     </w:p>
     <w:p>
       <w:r>
-        <w:lastRenderedPageBreak/>
         <w:t>[4, 2, 2, 8, 3, 3, 1]</w:t>
       </w:r>
     </w:p>
@@ -1227,6 +1419,7 @@
         </w:numPr>
       </w:pPr>
       <w:r>
+        <w:lastRenderedPageBreak/>
         <w:t>Peor caso: Es O(n + k). Se produce cuando el rango de valores k es muy grande en relación con la cantidad de elementos n, ya que se necesita recorrer y almacenar información para todo el rango.</w:t>
       </w:r>
     </w:p>
@@ -1459,6 +1652,282 @@
           <w:bCs/>
         </w:rPr>
         <w:t xml:space="preserve"> por cada algoritmo implementado del caso mejor, el caso peor y una perspectiva del caso promedio.</w:t>
+      </w:r>
+    </w:p>
+    <w:p>
+      <w:pPr>
+        <w:rPr>
+          <w:b/>
+          <w:bCs/>
+        </w:rPr>
+      </w:pPr>
+      <w:r>
+        <w:rPr>
+          <w:b/>
+          <w:bCs/>
+        </w:rPr>
+        <w:t>Ejercicio 4:</w:t>
+      </w:r>
+    </w:p>
+    <w:p>
+      <w:pPr>
+        <w:rPr>
+          <w:b/>
+          <w:bCs/>
+        </w:rPr>
+      </w:pPr>
+    </w:p>
+    <w:p>
+      <w:pPr>
+        <w:rPr>
+          <w:b/>
+          <w:bCs/>
+        </w:rPr>
+      </w:pPr>
+      <w:r>
+        <w:rPr>
+          <w:b/>
+          <w:bCs/>
+        </w:rPr>
+        <w:t>Ejercicio 5</w:t>
+      </w:r>
+      <w:r>
+        <w:rPr>
+          <w:b/>
+          <w:bCs/>
+        </w:rPr>
+        <w:t>:</w:t>
+      </w:r>
+    </w:p>
+    <w:p>
+      <w:r>
+        <w:rPr>
+          <w:b/>
+          <w:bCs/>
+        </w:rPr>
+        <w:t xml:space="preserve">Algoritmo </w:t>
+      </w:r>
+      <w:proofErr w:type="spellStart"/>
+      <w:r>
+        <w:rPr>
+          <w:b/>
+          <w:bCs/>
+        </w:rPr>
+        <w:t>contiene_suma</w:t>
+      </w:r>
+      <w:proofErr w:type="spellEnd"/>
+      <w:r>
+        <w:rPr>
+          <w:b/>
+          <w:bCs/>
+        </w:rPr>
+        <w:t xml:space="preserve"> </w:t>
+      </w:r>
+      <w:r>
+        <w:rPr>
+          <w:b/>
+          <w:bCs/>
+        </w:rPr>
+        <w:t>-&gt;</w:t>
+      </w:r>
+      <w:r>
+        <w:rPr>
+          <w:b/>
+          <w:bCs/>
+        </w:rPr>
+        <w:t xml:space="preserve"> O(n²)</w:t>
+      </w:r>
+    </w:p>
+    <w:p>
+      <w:pPr>
+        <w:numPr>
+          <w:ilvl w:val="0"/>
+          <w:numId w:val="12"/>
+        </w:numPr>
+      </w:pPr>
+      <w:r>
+        <w:rPr>
+          <w:b/>
+          <w:bCs/>
+        </w:rPr>
+        <w:t>Mejor caso:</w:t>
+      </w:r>
+      <w:r>
+        <w:t xml:space="preserve"> ocurre cuando los dos primeros elementos de la lista suman n. El algoritmo encuentra la solución en la primera comparación, por lo que realiza una cantidad constante de operaciones: </w:t>
+      </w:r>
+      <w:r>
+        <w:rPr>
+          <w:b/>
+          <w:bCs/>
+        </w:rPr>
+        <w:t>O(1)</w:t>
+      </w:r>
+      <w:r>
+        <w:t xml:space="preserve">. </w:t>
+      </w:r>
+    </w:p>
+    <w:p>
+      <w:pPr>
+        <w:numPr>
+          <w:ilvl w:val="0"/>
+          <w:numId w:val="12"/>
+        </w:numPr>
+      </w:pPr>
+      <w:r>
+        <w:rPr>
+          <w:b/>
+          <w:bCs/>
+        </w:rPr>
+        <w:t>Peor caso:</w:t>
+      </w:r>
+      <w:r>
+        <w:t xml:space="preserve"> ocurre cuando no existe ningún par que sume n o cuando el par se encuentra entre los últimos elementos. En este caso debe comparar prácticamente todos los pares posibles: </w:t>
+      </w:r>
+      <w:r>
+        <w:rPr>
+          <w:b/>
+          <w:bCs/>
+        </w:rPr>
+        <w:t>O(n²)</w:t>
+      </w:r>
+      <w:r>
+        <w:t xml:space="preserve">. </w:t>
+      </w:r>
+    </w:p>
+    <w:p>
+      <w:pPr>
+        <w:numPr>
+          <w:ilvl w:val="0"/>
+          <w:numId w:val="12"/>
+        </w:numPr>
+      </w:pPr>
+      <w:r>
+        <w:rPr>
+          <w:b/>
+          <w:bCs/>
+        </w:rPr>
+        <w:lastRenderedPageBreak/>
+        <w:t>Caso promedio:</w:t>
+      </w:r>
+      <w:r>
+        <w:t xml:space="preserve"> en promedio, deberá recorrer una parte considerable de la lista y comparar múltiples pares, por lo que su comportamiento es </w:t>
+      </w:r>
+      <w:r>
+        <w:rPr>
+          <w:b/>
+          <w:bCs/>
+        </w:rPr>
+        <w:t>O(n²)</w:t>
+      </w:r>
+      <w:r>
+        <w:t xml:space="preserve">. </w:t>
+      </w:r>
+    </w:p>
+    <w:p>
+      <w:r>
+        <w:rPr>
+          <w:b/>
+          <w:bCs/>
+        </w:rPr>
+        <w:t xml:space="preserve">Algoritmo contiene_suma2 </w:t>
+      </w:r>
+      <w:r>
+        <w:rPr>
+          <w:b/>
+          <w:bCs/>
+        </w:rPr>
+        <w:t>-&gt;</w:t>
+      </w:r>
+      <w:r>
+        <w:rPr>
+          <w:b/>
+          <w:bCs/>
+        </w:rPr>
+        <w:t xml:space="preserve"> O(n)</w:t>
+      </w:r>
+    </w:p>
+    <w:p>
+      <w:pPr>
+        <w:numPr>
+          <w:ilvl w:val="0"/>
+          <w:numId w:val="13"/>
+        </w:numPr>
+      </w:pPr>
+      <w:r>
+        <w:rPr>
+          <w:b/>
+          <w:bCs/>
+        </w:rPr>
+        <w:t>Mejor caso:</w:t>
+      </w:r>
+      <w:r>
+        <w:t xml:space="preserve"> ocurre cuando el complemento del primer elemento ya se encuentra en el conjunto. En ese caso, termina rápidamente: </w:t>
+      </w:r>
+      <w:r>
+        <w:rPr>
+          <w:b/>
+          <w:bCs/>
+        </w:rPr>
+        <w:t>O(1)</w:t>
+      </w:r>
+      <w:r>
+        <w:t xml:space="preserve">. </w:t>
+      </w:r>
+    </w:p>
+    <w:p>
+      <w:pPr>
+        <w:numPr>
+          <w:ilvl w:val="0"/>
+          <w:numId w:val="13"/>
+        </w:numPr>
+      </w:pPr>
+      <w:r>
+        <w:rPr>
+          <w:b/>
+          <w:bCs/>
+        </w:rPr>
+        <w:t>Peor caso:</w:t>
+      </w:r>
+      <w:r>
+        <w:t xml:space="preserve"> ocurre cuando no existe ningún par que sume n. Debe recorrer todos los elementos de la lista: </w:t>
+      </w:r>
+      <w:r>
+        <w:rPr>
+          <w:b/>
+          <w:bCs/>
+        </w:rPr>
+        <w:t>O(n)</w:t>
+      </w:r>
+      <w:r>
+        <w:t xml:space="preserve">. </w:t>
+      </w:r>
+    </w:p>
+    <w:p>
+      <w:pPr>
+        <w:numPr>
+          <w:ilvl w:val="0"/>
+          <w:numId w:val="13"/>
+        </w:numPr>
+      </w:pPr>
+      <w:r>
+        <w:rPr>
+          <w:b/>
+          <w:bCs/>
+        </w:rPr>
+        <w:t>Caso promedio:</w:t>
+      </w:r>
+      <w:r>
+        <w:t xml:space="preserve"> normalmente deberá recorrer una parte de la lista antes de encontrar un par o determinar que no existe, por lo que su comportamiento es </w:t>
+      </w:r>
+      <w:r>
+        <w:rPr>
+          <w:b/>
+          <w:bCs/>
+        </w:rPr>
+        <w:t>O(n)</w:t>
+      </w:r>
+      <w:r>
+        <w:t>.</w:t>
       </w:r>
     </w:p>
     <w:p/>
@@ -1927,6 +2396,155 @@
     </w:lvl>
   </w:abstractNum>
   <w:abstractNum w:abstractNumId="4" w15:restartNumberingAfterBreak="0">
+    <w:nsid w:val="49D8231B"/>
+    <w:multiLevelType w:val="multilevel"/>
+    <w:tmpl w:val="0E26347A"/>
+    <w:lvl w:ilvl="0">
+      <w:start w:val="1"/>
+      <w:numFmt w:val="bullet"/>
+      <w:lvlText w:val=""/>
+      <w:lvlJc w:val="left"/>
+      <w:pPr>
+        <w:tabs>
+          <w:tab w:val="num" w:pos="720"/>
+        </w:tabs>
+        <w:ind w:left="720" w:hanging="360"/>
+      </w:pPr>
+      <w:rPr>
+        <w:rFonts w:ascii="Symbol" w:hAnsi="Symbol" w:hint="default"/>
+        <w:sz w:val="20"/>
+      </w:rPr>
+    </w:lvl>
+    <w:lvl w:ilvl="1" w:tentative="1">
+      <w:start w:val="1"/>
+      <w:numFmt w:val="bullet"/>
+      <w:lvlText w:val="o"/>
+      <w:lvlJc w:val="left"/>
+      <w:pPr>
+        <w:tabs>
+          <w:tab w:val="num" w:pos="1440"/>
+        </w:tabs>
+        <w:ind w:left="1440" w:hanging="360"/>
+      </w:pPr>
+      <w:rPr>
+        <w:rFonts w:ascii="Courier New" w:hAnsi="Courier New" w:hint="default"/>
+        <w:sz w:val="20"/>
+      </w:rPr>
+    </w:lvl>
+    <w:lvl w:ilvl="2" w:tentative="1">
+      <w:start w:val="1"/>
+      <w:numFmt w:val="bullet"/>
+      <w:lvlText w:val=""/>
+      <w:lvlJc w:val="left"/>
+      <w:pPr>
+        <w:tabs>
+          <w:tab w:val="num" w:pos="2160"/>
+        </w:tabs>
+        <w:ind w:left="2160" w:hanging="360"/>
+      </w:pPr>
+      <w:rPr>
+        <w:rFonts w:ascii="Wingdings" w:hAnsi="Wingdings" w:hint="default"/>
+        <w:sz w:val="20"/>
+      </w:rPr>
+    </w:lvl>
+    <w:lvl w:ilvl="3" w:tentative="1">
+      <w:start w:val="1"/>
+      <w:numFmt w:val="bullet"/>
+      <w:lvlText w:val=""/>
+      <w:lvlJc w:val="left"/>
+      <w:pPr>
+        <w:tabs>
+          <w:tab w:val="num" w:pos="2880"/>
+        </w:tabs>
+        <w:ind w:left="2880" w:hanging="360"/>
+      </w:pPr>
+      <w:rPr>
+        <w:rFonts w:ascii="Wingdings" w:hAnsi="Wingdings" w:hint="default"/>
+        <w:sz w:val="20"/>
+      </w:rPr>
+    </w:lvl>
+    <w:lvl w:ilvl="4" w:tentative="1">
+      <w:start w:val="1"/>
+      <w:numFmt w:val="bullet"/>
+      <w:lvlText w:val=""/>
+      <w:lvlJc w:val="left"/>
+      <w:pPr>
+        <w:tabs>
+          <w:tab w:val="num" w:pos="3600"/>
+        </w:tabs>
+        <w:ind w:left="3600" w:hanging="360"/>
+      </w:pPr>
+      <w:rPr>
+        <w:rFonts w:ascii="Wingdings" w:hAnsi="Wingdings" w:hint="default"/>
+        <w:sz w:val="20"/>
+      </w:rPr>
+    </w:lvl>
+    <w:lvl w:ilvl="5" w:tentative="1">
+      <w:start w:val="1"/>
+      <w:numFmt w:val="bullet"/>
+      <w:lvlText w:val=""/>
+      <w:lvlJc w:val="left"/>
+      <w:pPr>
+        <w:tabs>
+          <w:tab w:val="num" w:pos="4320"/>
+        </w:tabs>
+        <w:ind w:left="4320" w:hanging="360"/>
+      </w:pPr>
+      <w:rPr>
+        <w:rFonts w:ascii="Wingdings" w:hAnsi="Wingdings" w:hint="default"/>
+        <w:sz w:val="20"/>
+      </w:rPr>
+    </w:lvl>
+    <w:lvl w:ilvl="6" w:tentative="1">
+      <w:start w:val="1"/>
+      <w:numFmt w:val="bullet"/>
+      <w:lvlText w:val=""/>
+      <w:lvlJc w:val="left"/>
+      <w:pPr>
+        <w:tabs>
+          <w:tab w:val="num" w:pos="5040"/>
+        </w:tabs>
+        <w:ind w:left="5040" w:hanging="360"/>
+      </w:pPr>
+      <w:rPr>
+        <w:rFonts w:ascii="Wingdings" w:hAnsi="Wingdings" w:hint="default"/>
+        <w:sz w:val="20"/>
+      </w:rPr>
+    </w:lvl>
+    <w:lvl w:ilvl="7" w:tentative="1">
+      <w:start w:val="1"/>
+      <w:numFmt w:val="bullet"/>
+      <w:lvlText w:val=""/>
+      <w:lvlJc w:val="left"/>
+      <w:pPr>
+        <w:tabs>
+          <w:tab w:val="num" w:pos="5760"/>
+        </w:tabs>
+        <w:ind w:left="5760" w:hanging="360"/>
+      </w:pPr>
+      <w:rPr>
+        <w:rFonts w:ascii="Wingdings" w:hAnsi="Wingdings" w:hint="default"/>
+        <w:sz w:val="20"/>
+      </w:rPr>
+    </w:lvl>
+    <w:lvl w:ilvl="8" w:tentative="1">
+      <w:start w:val="1"/>
+      <w:numFmt w:val="bullet"/>
+      <w:lvlText w:val=""/>
+      <w:lvlJc w:val="left"/>
+      <w:pPr>
+        <w:tabs>
+          <w:tab w:val="num" w:pos="6480"/>
+        </w:tabs>
+        <w:ind w:left="6480" w:hanging="360"/>
+      </w:pPr>
+      <w:rPr>
+        <w:rFonts w:ascii="Wingdings" w:hAnsi="Wingdings" w:hint="default"/>
+        <w:sz w:val="20"/>
+      </w:rPr>
+    </w:lvl>
+  </w:abstractNum>
+  <w:abstractNum w:abstractNumId="5" w15:restartNumberingAfterBreak="0">
     <w:nsid w:val="4B13608B"/>
     <w:multiLevelType w:val="multilevel"/>
     <w:tmpl w:val="1DA24352"/>
@@ -2075,7 +2693,156 @@
       </w:rPr>
     </w:lvl>
   </w:abstractNum>
-  <w:abstractNum w:abstractNumId="5" w15:restartNumberingAfterBreak="0">
+  <w:abstractNum w:abstractNumId="6" w15:restartNumberingAfterBreak="0">
+    <w:nsid w:val="584D3962"/>
+    <w:multiLevelType w:val="multilevel"/>
+    <w:tmpl w:val="25300B24"/>
+    <w:lvl w:ilvl="0">
+      <w:start w:val="1"/>
+      <w:numFmt w:val="bullet"/>
+      <w:lvlText w:val=""/>
+      <w:lvlJc w:val="left"/>
+      <w:pPr>
+        <w:tabs>
+          <w:tab w:val="num" w:pos="720"/>
+        </w:tabs>
+        <w:ind w:left="720" w:hanging="360"/>
+      </w:pPr>
+      <w:rPr>
+        <w:rFonts w:ascii="Symbol" w:hAnsi="Symbol" w:hint="default"/>
+        <w:sz w:val="20"/>
+      </w:rPr>
+    </w:lvl>
+    <w:lvl w:ilvl="1" w:tentative="1">
+      <w:start w:val="1"/>
+      <w:numFmt w:val="bullet"/>
+      <w:lvlText w:val="o"/>
+      <w:lvlJc w:val="left"/>
+      <w:pPr>
+        <w:tabs>
+          <w:tab w:val="num" w:pos="1440"/>
+        </w:tabs>
+        <w:ind w:left="1440" w:hanging="360"/>
+      </w:pPr>
+      <w:rPr>
+        <w:rFonts w:ascii="Courier New" w:hAnsi="Courier New" w:hint="default"/>
+        <w:sz w:val="20"/>
+      </w:rPr>
+    </w:lvl>
+    <w:lvl w:ilvl="2" w:tentative="1">
+      <w:start w:val="1"/>
+      <w:numFmt w:val="bullet"/>
+      <w:lvlText w:val=""/>
+      <w:lvlJc w:val="left"/>
+      <w:pPr>
+        <w:tabs>
+          <w:tab w:val="num" w:pos="2160"/>
+        </w:tabs>
+        <w:ind w:left="2160" w:hanging="360"/>
+      </w:pPr>
+      <w:rPr>
+        <w:rFonts w:ascii="Wingdings" w:hAnsi="Wingdings" w:hint="default"/>
+        <w:sz w:val="20"/>
+      </w:rPr>
+    </w:lvl>
+    <w:lvl w:ilvl="3" w:tentative="1">
+      <w:start w:val="1"/>
+      <w:numFmt w:val="bullet"/>
+      <w:lvlText w:val=""/>
+      <w:lvlJc w:val="left"/>
+      <w:pPr>
+        <w:tabs>
+          <w:tab w:val="num" w:pos="2880"/>
+        </w:tabs>
+        <w:ind w:left="2880" w:hanging="360"/>
+      </w:pPr>
+      <w:rPr>
+        <w:rFonts w:ascii="Wingdings" w:hAnsi="Wingdings" w:hint="default"/>
+        <w:sz w:val="20"/>
+      </w:rPr>
+    </w:lvl>
+    <w:lvl w:ilvl="4" w:tentative="1">
+      <w:start w:val="1"/>
+      <w:numFmt w:val="bullet"/>
+      <w:lvlText w:val=""/>
+      <w:lvlJc w:val="left"/>
+      <w:pPr>
+        <w:tabs>
+          <w:tab w:val="num" w:pos="3600"/>
+        </w:tabs>
+        <w:ind w:left="3600" w:hanging="360"/>
+      </w:pPr>
+      <w:rPr>
+        <w:rFonts w:ascii="Wingdings" w:hAnsi="Wingdings" w:hint="default"/>
+        <w:sz w:val="20"/>
+      </w:rPr>
+    </w:lvl>
+    <w:lvl w:ilvl="5" w:tentative="1">
+      <w:start w:val="1"/>
+      <w:numFmt w:val="bullet"/>
+      <w:lvlText w:val=""/>
+      <w:lvlJc w:val="left"/>
+      <w:pPr>
+        <w:tabs>
+          <w:tab w:val="num" w:pos="4320"/>
+        </w:tabs>
+        <w:ind w:left="4320" w:hanging="360"/>
+      </w:pPr>
+      <w:rPr>
+        <w:rFonts w:ascii="Wingdings" w:hAnsi="Wingdings" w:hint="default"/>
+        <w:sz w:val="20"/>
+      </w:rPr>
+    </w:lvl>
+    <w:lvl w:ilvl="6" w:tentative="1">
+      <w:start w:val="1"/>
+      <w:numFmt w:val="bullet"/>
+      <w:lvlText w:val=""/>
+      <w:lvlJc w:val="left"/>
+      <w:pPr>
+        <w:tabs>
+          <w:tab w:val="num" w:pos="5040"/>
+        </w:tabs>
+        <w:ind w:left="5040" w:hanging="360"/>
+      </w:pPr>
+      <w:rPr>
+        <w:rFonts w:ascii="Wingdings" w:hAnsi="Wingdings" w:hint="default"/>
+        <w:sz w:val="20"/>
+      </w:rPr>
+    </w:lvl>
+    <w:lvl w:ilvl="7" w:tentative="1">
+      <w:start w:val="1"/>
+      <w:numFmt w:val="bullet"/>
+      <w:lvlText w:val=""/>
+      <w:lvlJc w:val="left"/>
+      <w:pPr>
+        <w:tabs>
+          <w:tab w:val="num" w:pos="5760"/>
+        </w:tabs>
+        <w:ind w:left="5760" w:hanging="360"/>
+      </w:pPr>
+      <w:rPr>
+        <w:rFonts w:ascii="Wingdings" w:hAnsi="Wingdings" w:hint="default"/>
+        <w:sz w:val="20"/>
+      </w:rPr>
+    </w:lvl>
+    <w:lvl w:ilvl="8" w:tentative="1">
+      <w:start w:val="1"/>
+      <w:numFmt w:val="bullet"/>
+      <w:lvlText w:val=""/>
+      <w:lvlJc w:val="left"/>
+      <w:pPr>
+        <w:tabs>
+          <w:tab w:val="num" w:pos="6480"/>
+        </w:tabs>
+        <w:ind w:left="6480" w:hanging="360"/>
+      </w:pPr>
+      <w:rPr>
+        <w:rFonts w:ascii="Wingdings" w:hAnsi="Wingdings" w:hint="default"/>
+        <w:sz w:val="20"/>
+      </w:rPr>
+    </w:lvl>
+  </w:abstractNum>
+  <w:abstractNum w:abstractNumId="7" w15:restartNumberingAfterBreak="0">
     <w:nsid w:val="6AE51F09"/>
     <w:multiLevelType w:val="hybridMultilevel"/>
     <w:tmpl w:val="633A3BC0"/>
@@ -2256,12 +3023,18 @@
     <w:abstractNumId w:val="1"/>
   </w:num>
   <w:num w:numId="9" w16cid:durableId="1311859611">
-    <w:abstractNumId w:val="5"/>
+    <w:abstractNumId w:val="7"/>
   </w:num>
   <w:num w:numId="10" w16cid:durableId="400099115">
     <w:abstractNumId w:val="2"/>
   </w:num>
   <w:num w:numId="11" w16cid:durableId="208764">
+    <w:abstractNumId w:val="5"/>
+  </w:num>
+  <w:num w:numId="12" w16cid:durableId="1855263633">
+    <w:abstractNumId w:val="6"/>
+  </w:num>
+  <w:num w:numId="13" w16cid:durableId="1571229098">
     <w:abstractNumId w:val="4"/>
   </w:num>
 </w:numbering>
@@ -2870,7 +3643,6 @@
   <w:style w:type="character" w:default="1" w:styleId="Fuentedeprrafopredeter">
     <w:name w:val="Default Paragraph Font"/>
     <w:uiPriority w:val="1"/>
-    <w:semiHidden/>
     <w:unhideWhenUsed/>
   </w:style>
   <w:style w:type="table" w:default="1" w:styleId="Tablanormal">
@@ -3184,6 +3956,25 @@
       <w:spacing w:val="5"/>
     </w:rPr>
   </w:style>
+  <w:style w:type="table" w:styleId="Tablaconcuadrcula">
+    <w:name w:val="Table Grid"/>
+    <w:basedOn w:val="Tablanormal"/>
+    <w:uiPriority w:val="39"/>
+    <w:rsid w:val="00A416A9"/>
+    <w:pPr>
+      <w:spacing w:after="0" w:line="240" w:lineRule="auto"/>
+    </w:pPr>
+    <w:tblPr>
+      <w:tblBorders>
+        <w:top w:val="single" w:sz="4" w:space="0" w:color="auto"/>
+        <w:left w:val="single" w:sz="4" w:space="0" w:color="auto"/>
+        <w:bottom w:val="single" w:sz="4" w:space="0" w:color="auto"/>
+        <w:right w:val="single" w:sz="4" w:space="0" w:color="auto"/>
+        <w:insideH w:val="single" w:sz="4" w:space="0" w:color="auto"/>
+        <w:insideV w:val="single" w:sz="4" w:space="0" w:color="auto"/>
+      </w:tblBorders>
+    </w:tblPr>
+  </w:style>
 </w:styles>
 </file>
 

</xml_diff>

<commit_message>
tp complejidad, carpeta tp arboles avl
</commit_message>
<xml_diff>
--- a/practicas/tp-complejidad/march-graciana-tp-complejidad.docx
+++ b/practicas/tp-complejidad/march-graciana-tp-complejidad.docx
@@ -10,6 +10,7 @@
           <w:bCs/>
         </w:rPr>
       </w:pPr>
+      <w:bookmarkStart w:id="0" w:name="_Hlk238058404"/>
       <w:r>
         <w:rPr>
           <w:b/>
@@ -41,6 +42,7 @@
         <w:t>TP Complejidad</w:t>
       </w:r>
     </w:p>
+    <w:bookmarkEnd w:id="0"/>
     <w:p>
       <w:pPr>
         <w:rPr>
@@ -484,8 +486,13 @@
       <w:r>
         <w:t xml:space="preserve"> </w:t>
       </w:r>
-      <w:r>
-        <w:t>O(n</w:t>
+      <w:proofErr w:type="gramStart"/>
+      <w:r>
+        <w:t>O(</w:t>
+      </w:r>
+      <w:proofErr w:type="gramEnd"/>
+      <w:r>
+        <w:t>n</w:t>
       </w:r>
       <w:r>
         <w:t xml:space="preserve"> </w:t>
@@ -521,7 +528,6 @@
           <w:b/>
           <w:bCs/>
         </w:rPr>
-        <w:lastRenderedPageBreak/>
         <w:t xml:space="preserve">¿Cuál es el tiempo de ejecución de la estrategia Quicksort(A), </w:t>
       </w:r>
       <w:proofErr w:type="spellStart"/>
@@ -591,6 +597,7 @@
       </w:pPr>
       <w:proofErr w:type="spellStart"/>
       <w:r>
+        <w:lastRenderedPageBreak/>
         <w:t>Insertion-Sort</w:t>
       </w:r>
       <w:proofErr w:type="spellEnd"/>
@@ -636,7 +643,15 @@
         <w:t>a</w:t>
       </w:r>
       <w:r>
-        <w:t>unque todos los elementos sean iguales, el algoritmo continúa dividiendo el array y luego combinando las partes. Por lo tanto, su tiempo de ejecución es O(n log n).</w:t>
+        <w:t xml:space="preserve">unque todos los elementos sean iguales, el algoritmo continúa dividiendo el array y luego combinando las partes. Por lo tanto, su tiempo de ejecución es </w:t>
+      </w:r>
+      <w:proofErr w:type="gramStart"/>
+      <w:r>
+        <w:t>O(</w:t>
+      </w:r>
+      <w:proofErr w:type="gramEnd"/>
+      <w:r>
+        <w:t>n log n).</w:t>
       </w:r>
     </w:p>
     <w:p>
@@ -960,6 +975,7 @@
         <w:t>Implementar un algoritmo Contiene-Suma(</w:t>
       </w:r>
       <w:proofErr w:type="spellStart"/>
+      <w:proofErr w:type="gramStart"/>
       <w:r>
         <w:rPr>
           <w:b/>
@@ -968,6 +984,7 @@
         <w:t>A,n</w:t>
       </w:r>
       <w:proofErr w:type="spellEnd"/>
+      <w:proofErr w:type="gramEnd"/>
       <w:r>
         <w:rPr>
           <w:b/>
@@ -1129,7 +1146,6 @@
               <w:spacing w:after="160" w:line="278" w:lineRule="auto"/>
             </w:pPr>
             <w:r>
-              <w:lastRenderedPageBreak/>
               <w:t>contiene_suma2</w:t>
             </w:r>
           </w:p>
@@ -1196,6 +1212,7 @@
           <w:b/>
           <w:bCs/>
         </w:rPr>
+        <w:lastRenderedPageBreak/>
         <w:t xml:space="preserve">Investigar otro algoritmo de ordenamiento como </w:t>
       </w:r>
       <w:proofErr w:type="spellStart"/>
@@ -1379,7 +1396,15 @@
         </w:numPr>
       </w:pPr>
       <w:r>
-        <w:t>Caso promedio: Su complejidad es O(n + k), ya que debe recorrer los elementos del arreglo y el rango de valores para realizar el conteo y construir el arreglo ordenado.</w:t>
+        <w:t xml:space="preserve">Caso promedio: Su complejidad es </w:t>
+      </w:r>
+      <w:proofErr w:type="gramStart"/>
+      <w:r>
+        <w:t>O(</w:t>
+      </w:r>
+      <w:proofErr w:type="gramEnd"/>
+      <w:r>
+        <w:t>n + k), ya que debe recorrer los elementos del arreglo y el rango de valores para realizar el conteo y construir el arreglo ordenado.</w:t>
       </w:r>
     </w:p>
     <w:p>
@@ -1391,7 +1416,15 @@
         </w:numPr>
       </w:pPr>
       <w:r>
-        <w:t xml:space="preserve">Mejor caso: También es O(n + k), porque aunque el arreglo ya esté ordenado o tenga pocos elementos repetidos, </w:t>
+        <w:t xml:space="preserve">Mejor caso: También es </w:t>
+      </w:r>
+      <w:proofErr w:type="gramStart"/>
+      <w:r>
+        <w:t>O(</w:t>
+      </w:r>
+      <w:proofErr w:type="gramEnd"/>
+      <w:r>
+        <w:t xml:space="preserve">n + k), porque aunque el arreglo ya esté ordenado o tenga pocos elementos repetidos, </w:t>
       </w:r>
       <w:proofErr w:type="spellStart"/>
       <w:r>
@@ -1419,8 +1452,15 @@
         </w:numPr>
       </w:pPr>
       <w:r>
-        <w:lastRenderedPageBreak/>
-        <w:t>Peor caso: Es O(n + k). Se produce cuando el rango de valores k es muy grande en relación con la cantidad de elementos n, ya que se necesita recorrer y almacenar información para todo el rango.</w:t>
+        <w:t xml:space="preserve">Peor caso: Es </w:t>
+      </w:r>
+      <w:proofErr w:type="gramStart"/>
+      <w:r>
+        <w:t>O(</w:t>
+      </w:r>
+      <w:proofErr w:type="gramEnd"/>
+      <w:r>
+        <w:t>n + k). Se produce cuando el rango de valores k es muy grande en relación con la cantidad de elementos n, ya que se necesita recorrer y almacenar información para todo el rango.</w:t>
       </w:r>
     </w:p>
     <w:p>
@@ -1462,6 +1502,7 @@
         </w:numPr>
       </w:pPr>
       <w:r>
+        <w:lastRenderedPageBreak/>
         <w:t>T(n) = 2T(n/2) + n</w:t>
       </w:r>
       <w:r>
@@ -1755,12 +1796,21 @@
       <w:r>
         <w:t xml:space="preserve"> ocurre cuando los dos primeros elementos de la lista suman n. El algoritmo encuentra la solución en la primera comparación, por lo que realiza una cantidad constante de operaciones: </w:t>
       </w:r>
-      <w:r>
-        <w:rPr>
-          <w:b/>
-          <w:bCs/>
-        </w:rPr>
-        <w:t>O(1)</w:t>
+      <w:proofErr w:type="gramStart"/>
+      <w:r>
+        <w:rPr>
+          <w:b/>
+          <w:bCs/>
+        </w:rPr>
+        <w:t>O(</w:t>
+      </w:r>
+      <w:proofErr w:type="gramEnd"/>
+      <w:r>
+        <w:rPr>
+          <w:b/>
+          <w:bCs/>
+        </w:rPr>
+        <w:t>1)</w:t>
       </w:r>
       <w:r>
         <w:t xml:space="preserve">. </w:t>
@@ -1806,7 +1856,6 @@
           <w:b/>
           <w:bCs/>
         </w:rPr>
-        <w:lastRenderedPageBreak/>
         <w:t>Caso promedio:</w:t>
       </w:r>
       <w:r>
@@ -1863,12 +1912,21 @@
       <w:r>
         <w:t xml:space="preserve"> ocurre cuando el complemento del primer elemento ya se encuentra en el conjunto. En ese caso, termina rápidamente: </w:t>
       </w:r>
-      <w:r>
-        <w:rPr>
-          <w:b/>
-          <w:bCs/>
-        </w:rPr>
-        <w:t>O(1)</w:t>
+      <w:proofErr w:type="gramStart"/>
+      <w:r>
+        <w:rPr>
+          <w:b/>
+          <w:bCs/>
+        </w:rPr>
+        <w:t>O(</w:t>
+      </w:r>
+      <w:proofErr w:type="gramEnd"/>
+      <w:r>
+        <w:rPr>
+          <w:b/>
+          <w:bCs/>
+        </w:rPr>
+        <w:t>1)</w:t>
       </w:r>
       <w:r>
         <w:t xml:space="preserve">. </w:t>
@@ -1930,15 +1988,88 @@
         <w:t>.</w:t>
       </w:r>
     </w:p>
-    <w:p/>
     <w:sectPr>
+      <w:headerReference w:type="default" r:id="rId7"/>
       <w:pgSz w:w="11906" w:h="16838"/>
-      <w:pgMar w:top="1417" w:right="1701" w:bottom="1417" w:left="1701" w:header="708" w:footer="708" w:gutter="0"/>
+      <w:pgMar w:top="1440" w:right="1080" w:bottom="1440" w:left="1080" w:header="708" w:footer="708" w:gutter="0"/>
       <w:cols w:space="708"/>
       <w:docGrid w:linePitch="360"/>
     </w:sectPr>
   </w:body>
 </w:document>
+</file>
+
+<file path=word/endnotes.xml><?xml version="1.0" encoding="utf-8"?>
+<w:endnotes xmlns:wpc="http://schemas.microsoft.com/office/word/2010/wordprocessingCanvas" xmlns:cx="http://schemas.microsoft.com/office/drawing/2014/chartex" xmlns:cx1="http://schemas.microsoft.com/office/drawing/2015/9/8/chartex" xmlns:cx2="http://schemas.microsoft.com/office/drawing/2015/10/21/chartex" xmlns:cx3="http://schemas.microsoft.com/office/drawing/2016/5/9/chartex" xmlns:cx4="http://schemas.microsoft.com/office/drawing/2016/5/10/chartex" xmlns:cx5="http://schemas.microsoft.com/office/drawing/2016/5/11/chartex" xmlns:cx6="http://schemas.microsoft.com/office/drawing/2016/5/12/chartex" xmlns:cx7="http://schemas.microsoft.com/office/drawing/2016/5/13/chartex" xmlns:cx8="http://schemas.microsoft.com/office/drawing/2016/5/14/chartex" xmlns:mc="http://schemas.openxmlformats.org/markup-compatibility/2006" xmlns:aink="http://schemas.microsoft.com/office/drawing/2016/ink" xmlns:am3d="http://schemas.microsoft.com/office/drawing/2017/model3d" xmlns:o="urn:schemas-microsoft-com:office:office" xmlns:oel="http://schemas.microsoft.com/office/2019/extlst" xmlns:r="http://schemas.openxmlformats.org/officeDocument/2006/relationships" xmlns:m="http://schemas.openxmlformats.org/officeDocument/2006/math" xmlns:v="urn:schemas-microsoft-com:vml" xmlns:wp14="http://schemas.microsoft.com/office/word/2010/wordprocessingDrawing" xmlns:wp="http://schemas.openxmlformats.org/drawingml/2006/wordprocessingDrawing" xmlns:w10="urn:schemas-microsoft-com:office:word" xmlns:w="http://schemas.openxmlformats.org/wordprocessingml/2006/main" xmlns:w14="http://schemas.microsoft.com/office/word/2010/wordml" xmlns:w15="http://schemas.microsoft.com/office/word/2012/wordml" xmlns:w16cex="http://schemas.microsoft.com/office/word/2018/wordml/cex" xmlns:w16cid="http://schemas.microsoft.com/office/word/2016/wordml/cid" xmlns:w16="http://schemas.microsoft.com/office/word/2018/wordml" xmlns:w16sdtdh="http://schemas.microsoft.com/office/word/2020/wordml/sdtdatahash" xmlns:w16se="http://schemas.microsoft.com/office/word/2015/wordml/symex" xmlns:wpg="http://schemas.microsoft.com/office/word/2010/wordprocessingGroup" xmlns:wpi="http://schemas.microsoft.com/office/word/2010/wordprocessingInk" xmlns:wne="http://schemas.microsoft.com/office/word/2006/wordml" xmlns:wps="http://schemas.microsoft.com/office/word/2010/wordprocessingShape" mc:Ignorable="w14 w15 w16se w16cid w16 w16cex w16sdtdh wp14">
+  <w:endnote w:type="separator" w:id="-1">
+    <w:p>
+      <w:pPr>
+        <w:spacing w:after="0" w:line="240" w:lineRule="auto"/>
+      </w:pPr>
+      <w:r>
+        <w:separator/>
+      </w:r>
+    </w:p>
+  </w:endnote>
+  <w:endnote w:type="continuationSeparator" w:id="0">
+    <w:p>
+      <w:pPr>
+        <w:spacing w:after="0" w:line="240" w:lineRule="auto"/>
+      </w:pPr>
+      <w:r>
+        <w:continuationSeparator/>
+      </w:r>
+    </w:p>
+  </w:endnote>
+</w:endnotes>
+</file>
+
+<file path=word/footnotes.xml><?xml version="1.0" encoding="utf-8"?>
+<w:footnotes xmlns:wpc="http://schemas.microsoft.com/office/word/2010/wordprocessingCanvas" xmlns:cx="http://schemas.microsoft.com/office/drawing/2014/chartex" xmlns:cx1="http://schemas.microsoft.com/office/drawing/2015/9/8/chartex" xmlns:cx2="http://schemas.microsoft.com/office/drawing/2015/10/21/chartex" xmlns:cx3="http://schemas.microsoft.com/office/drawing/2016/5/9/chartex" xmlns:cx4="http://schemas.microsoft.com/office/drawing/2016/5/10/chartex" xmlns:cx5="http://schemas.microsoft.com/office/drawing/2016/5/11/chartex" xmlns:cx6="http://schemas.microsoft.com/office/drawing/2016/5/12/chartex" xmlns:cx7="http://schemas.microsoft.com/office/drawing/2016/5/13/chartex" xmlns:cx8="http://schemas.microsoft.com/office/drawing/2016/5/14/chartex" xmlns:mc="http://schemas.openxmlformats.org/markup-compatibility/2006" xmlns:aink="http://schemas.microsoft.com/office/drawing/2016/ink" xmlns:am3d="http://schemas.microsoft.com/office/drawing/2017/model3d" xmlns:o="urn:schemas-microsoft-com:office:office" xmlns:oel="http://schemas.microsoft.com/office/2019/extlst" xmlns:r="http://schemas.openxmlformats.org/officeDocument/2006/relationships" xmlns:m="http://schemas.openxmlformats.org/officeDocument/2006/math" xmlns:v="urn:schemas-microsoft-com:vml" xmlns:wp14="http://schemas.microsoft.com/office/word/2010/wordprocessingDrawing" xmlns:wp="http://schemas.openxmlformats.org/drawingml/2006/wordprocessingDrawing" xmlns:w10="urn:schemas-microsoft-com:office:word" xmlns:w="http://schemas.openxmlformats.org/wordprocessingml/2006/main" xmlns:w14="http://schemas.microsoft.com/office/word/2010/wordml" xmlns:w15="http://schemas.microsoft.com/office/word/2012/wordml" xmlns:w16cex="http://schemas.microsoft.com/office/word/2018/wordml/cex" xmlns:w16cid="http://schemas.microsoft.com/office/word/2016/wordml/cid" xmlns:w16="http://schemas.microsoft.com/office/word/2018/wordml" xmlns:w16sdtdh="http://schemas.microsoft.com/office/word/2020/wordml/sdtdatahash" xmlns:w16se="http://schemas.microsoft.com/office/word/2015/wordml/symex" xmlns:wpg="http://schemas.microsoft.com/office/word/2010/wordprocessingGroup" xmlns:wpi="http://schemas.microsoft.com/office/word/2010/wordprocessingInk" xmlns:wne="http://schemas.microsoft.com/office/word/2006/wordml" xmlns:wps="http://schemas.microsoft.com/office/word/2010/wordprocessingShape" mc:Ignorable="w14 w15 w16se w16cid w16 w16cex w16sdtdh wp14">
+  <w:footnote w:type="separator" w:id="-1">
+    <w:p>
+      <w:pPr>
+        <w:spacing w:after="0" w:line="240" w:lineRule="auto"/>
+      </w:pPr>
+      <w:r>
+        <w:separator/>
+      </w:r>
+    </w:p>
+  </w:footnote>
+  <w:footnote w:type="continuationSeparator" w:id="0">
+    <w:p>
+      <w:pPr>
+        <w:spacing w:after="0" w:line="240" w:lineRule="auto"/>
+      </w:pPr>
+      <w:r>
+        <w:continuationSeparator/>
+      </w:r>
+    </w:p>
+  </w:footnote>
+</w:footnotes>
+</file>
+
+<file path=word/header1.xml><?xml version="1.0" encoding="utf-8"?>
+<w:hdr xmlns:wpc="http://schemas.microsoft.com/office/word/2010/wordprocessingCanvas" xmlns:cx="http://schemas.microsoft.com/office/drawing/2014/chartex" xmlns:cx1="http://schemas.microsoft.com/office/drawing/2015/9/8/chartex" xmlns:cx2="http://schemas.microsoft.com/office/drawing/2015/10/21/chartex" xmlns:cx3="http://schemas.microsoft.com/office/drawing/2016/5/9/chartex" xmlns:cx4="http://schemas.microsoft.com/office/drawing/2016/5/10/chartex" xmlns:cx5="http://schemas.microsoft.com/office/drawing/2016/5/11/chartex" xmlns:cx6="http://schemas.microsoft.com/office/drawing/2016/5/12/chartex" xmlns:cx7="http://schemas.microsoft.com/office/drawing/2016/5/13/chartex" xmlns:cx8="http://schemas.microsoft.com/office/drawing/2016/5/14/chartex" xmlns:mc="http://schemas.openxmlformats.org/markup-compatibility/2006" xmlns:aink="http://schemas.microsoft.com/office/drawing/2016/ink" xmlns:am3d="http://schemas.microsoft.com/office/drawing/2017/model3d" xmlns:o="urn:schemas-microsoft-com:office:office" xmlns:oel="http://schemas.microsoft.com/office/2019/extlst" xmlns:r="http://schemas.openxmlformats.org/officeDocument/2006/relationships" xmlns:m="http://schemas.openxmlformats.org/officeDocument/2006/math" xmlns:v="urn:schemas-microsoft-com:vml" xmlns:wp14="http://schemas.microsoft.com/office/word/2010/wordprocessingDrawing" xmlns:wp="http://schemas.openxmlformats.org/drawingml/2006/wordprocessingDrawing" xmlns:w10="urn:schemas-microsoft-com:office:word" xmlns:w="http://schemas.openxmlformats.org/wordprocessingml/2006/main" xmlns:w14="http://schemas.microsoft.com/office/word/2010/wordml" xmlns:w15="http://schemas.microsoft.com/office/word/2012/wordml" xmlns:w16cex="http://schemas.microsoft.com/office/word/2018/wordml/cex" xmlns:w16cid="http://schemas.microsoft.com/office/word/2016/wordml/cid" xmlns:w16="http://schemas.microsoft.com/office/word/2018/wordml" xmlns:w16sdtdh="http://schemas.microsoft.com/office/word/2020/wordml/sdtdatahash" xmlns:w16se="http://schemas.microsoft.com/office/word/2015/wordml/symex" xmlns:wpg="http://schemas.microsoft.com/office/word/2010/wordprocessingGroup" xmlns:wpi="http://schemas.microsoft.com/office/word/2010/wordprocessingInk" xmlns:wne="http://schemas.microsoft.com/office/word/2006/wordml" xmlns:wps="http://schemas.microsoft.com/office/word/2010/wordprocessingShape" mc:Ignorable="w14 w15 w16se w16cid w16 w16cex w16sdtdh wp14">
+  <w:p>
+    <w:pPr>
+      <w:pStyle w:val="Encabezado"/>
+    </w:pPr>
+    <w:r>
+      <w:t>Nombre: Graciana March</w:t>
+    </w:r>
+    <w:r>
+      <w:tab/>
+    </w:r>
+    <w:r>
+      <w:tab/>
+    </w:r>
+    <w:r>
+      <w:tab/>
+      <w:t>2026</w:t>
+    </w:r>
+  </w:p>
+</w:hdr>
 </file>
 
 <file path=word/numbering.xml><?xml version="1.0" encoding="utf-8"?>
@@ -3643,6 +3774,7 @@
   <w:style w:type="character" w:default="1" w:styleId="Fuentedeprrafopredeter">
     <w:name w:val="Default Paragraph Font"/>
     <w:uiPriority w:val="1"/>
+    <w:semiHidden/>
     <w:unhideWhenUsed/>
   </w:style>
   <w:style w:type="table" w:default="1" w:styleId="Tablanormal">
@@ -3975,6 +4107,50 @@
       </w:tblBorders>
     </w:tblPr>
   </w:style>
+  <w:style w:type="paragraph" w:styleId="Encabezado">
+    <w:name w:val="header"/>
+    <w:basedOn w:val="Normal"/>
+    <w:link w:val="EncabezadoCar"/>
+    <w:uiPriority w:val="99"/>
+    <w:unhideWhenUsed/>
+    <w:rsid w:val="0009137A"/>
+    <w:pPr>
+      <w:tabs>
+        <w:tab w:val="center" w:pos="4252"/>
+        <w:tab w:val="right" w:pos="8504"/>
+      </w:tabs>
+      <w:spacing w:after="0" w:line="240" w:lineRule="auto"/>
+    </w:pPr>
+  </w:style>
+  <w:style w:type="character" w:customStyle="1" w:styleId="EncabezadoCar">
+    <w:name w:val="Encabezado Car"/>
+    <w:basedOn w:val="Fuentedeprrafopredeter"/>
+    <w:link w:val="Encabezado"/>
+    <w:uiPriority w:val="99"/>
+    <w:rsid w:val="0009137A"/>
+  </w:style>
+  <w:style w:type="paragraph" w:styleId="Piedepgina">
+    <w:name w:val="footer"/>
+    <w:basedOn w:val="Normal"/>
+    <w:link w:val="PiedepginaCar"/>
+    <w:uiPriority w:val="99"/>
+    <w:unhideWhenUsed/>
+    <w:rsid w:val="0009137A"/>
+    <w:pPr>
+      <w:tabs>
+        <w:tab w:val="center" w:pos="4252"/>
+        <w:tab w:val="right" w:pos="8504"/>
+      </w:tabs>
+      <w:spacing w:after="0" w:line="240" w:lineRule="auto"/>
+    </w:pPr>
+  </w:style>
+  <w:style w:type="character" w:customStyle="1" w:styleId="PiedepginaCar">
+    <w:name w:val="Pie de página Car"/>
+    <w:basedOn w:val="Fuentedeprrafopredeter"/>
+    <w:link w:val="Piedepgina"/>
+    <w:uiPriority w:val="99"/>
+    <w:rsid w:val="0009137A"/>
+  </w:style>
 </w:styles>
 </file>
 

</xml_diff>

<commit_message>
tp complejidad: ejercicio 4 y 7
</commit_message>
<xml_diff>
--- a/practicas/tp-complejidad/march-graciana-tp-complejidad.docx
+++ b/practicas/tp-complejidad/march-graciana-tp-complejidad.docx
@@ -164,13 +164,8 @@
       <w:r>
         <w:t xml:space="preserve"> </w:t>
       </w:r>
-      <w:proofErr w:type="spellStart"/>
-      <w:r>
-        <w:t>cf</w:t>
-      </w:r>
-      <w:proofErr w:type="spellEnd"/>
-      <w:r>
-        <w:t>(n), para todo n</w:t>
+      <w:r>
+        <w:t>cf(n), para todo n</w:t>
       </w:r>
       <w:r>
         <w:t xml:space="preserve"> </w:t>
@@ -486,13 +481,8 @@
       <w:r>
         <w:t xml:space="preserve"> </w:t>
       </w:r>
-      <w:proofErr w:type="gramStart"/>
-      <w:r>
-        <w:t>O(</w:t>
-      </w:r>
-      <w:proofErr w:type="gramEnd"/>
-      <w:r>
-        <w:t>n</w:t>
+      <w:r>
+        <w:t>O(n</w:t>
       </w:r>
       <w:r>
         <w:t xml:space="preserve"> </w:t>
@@ -528,39 +518,7 @@
           <w:b/>
           <w:bCs/>
         </w:rPr>
-        <w:t xml:space="preserve">¿Cuál es el tiempo de ejecución de la estrategia Quicksort(A), </w:t>
-      </w:r>
-      <w:proofErr w:type="spellStart"/>
-      <w:r>
-        <w:rPr>
-          <w:b/>
-          <w:bCs/>
-        </w:rPr>
-        <w:t>Insertion-Sort</w:t>
-      </w:r>
-      <w:proofErr w:type="spellEnd"/>
-      <w:r>
-        <w:rPr>
-          <w:b/>
-          <w:bCs/>
-        </w:rPr>
-        <w:t xml:space="preserve">(A) y </w:t>
-      </w:r>
-      <w:proofErr w:type="spellStart"/>
-      <w:r>
-        <w:rPr>
-          <w:b/>
-          <w:bCs/>
-        </w:rPr>
-        <w:t>Merge-Sort</w:t>
-      </w:r>
-      <w:proofErr w:type="spellEnd"/>
-      <w:r>
-        <w:rPr>
-          <w:b/>
-          <w:bCs/>
-        </w:rPr>
-        <w:t>(A) cuando todos los elementos del array A tienen el mismo valor?</w:t>
+        <w:t>¿Cuál es el tiempo de ejecución de la estrategia Quicksort(A), Insertion-Sort(A) y Merge-Sort(A) cuando todos los elementos del array A tienen el mismo valor?</w:t>
       </w:r>
     </w:p>
     <w:p>
@@ -595,14 +553,9 @@
           <w:numId w:val="9"/>
         </w:numPr>
       </w:pPr>
-      <w:proofErr w:type="spellStart"/>
       <w:r>
         <w:lastRenderedPageBreak/>
-        <w:t>Insertion-Sort</w:t>
-      </w:r>
-      <w:proofErr w:type="spellEnd"/>
-      <w:r>
-        <w:t xml:space="preserve">(A): </w:t>
+        <w:t xml:space="preserve">Insertion-Sort(A): </w:t>
       </w:r>
       <w:r>
         <w:t>c</w:t>
@@ -631,27 +584,14 @@
           <w:numId w:val="9"/>
         </w:numPr>
       </w:pPr>
-      <w:proofErr w:type="spellStart"/>
-      <w:r>
-        <w:t>Merge-Sort</w:t>
-      </w:r>
-      <w:proofErr w:type="spellEnd"/>
-      <w:r>
-        <w:t xml:space="preserve">(A): </w:t>
+      <w:r>
+        <w:t xml:space="preserve">Merge-Sort(A): </w:t>
       </w:r>
       <w:r>
         <w:t>a</w:t>
       </w:r>
       <w:r>
-        <w:t xml:space="preserve">unque todos los elementos sean iguales, el algoritmo continúa dividiendo el array y luego combinando las partes. Por lo tanto, su tiempo de ejecución es </w:t>
-      </w:r>
-      <w:proofErr w:type="gramStart"/>
-      <w:r>
-        <w:t>O(</w:t>
-      </w:r>
-      <w:proofErr w:type="gramEnd"/>
-      <w:r>
-        <w:t>n log n).</w:t>
+        <w:t>unque todos los elementos sean iguales, el algoritmo continúa dividiendo el array y luego combinando las partes. Por lo tanto, su tiempo de ejecución es O(n log n).</w:t>
       </w:r>
     </w:p>
     <w:p>
@@ -944,7 +884,95 @@
         </w:tc>
       </w:tr>
     </w:tbl>
+    <w:p>
+      <w:r>
+        <w:t xml:space="preserve">La idea de este algoritmo </w:t>
+      </w:r>
+      <w:r>
+        <w:t xml:space="preserve">es </w:t>
+      </w:r>
+      <w:r>
+        <w:t>reorganizar los números alrededor del valor central (el pivote) para cumplir la regla</w:t>
+      </w:r>
+      <w:r>
+        <w:t xml:space="preserve"> (</w:t>
+      </w:r>
+      <w:r>
+        <w:t xml:space="preserve">a la izquierda de él deben estar </w:t>
+      </w:r>
+      <w:r>
+        <w:t xml:space="preserve">la mitad de los elementos menores </w:t>
+      </w:r>
+      <w:r>
+        <w:t>al pivote</w:t>
+      </w:r>
+      <w:r>
+        <w:t>)</w:t>
+      </w:r>
+      <w:r>
+        <w:t xml:space="preserve"> sin que este se mueva de su lugar.</w:t>
+      </w:r>
+    </w:p>
+    <w:p>
+      <w:r>
+        <w:t>Para lograrlo, hace lo siguiente:</w:t>
+      </w:r>
+    </w:p>
+    <w:p>
+      <w:pPr>
+        <w:numPr>
+          <w:ilvl w:val="0"/>
+          <w:numId w:val="14"/>
+        </w:numPr>
+      </w:pPr>
+      <w:r>
+        <w:t>Toma el número que está exactamente en el medio de la lista original</w:t>
+      </w:r>
+      <w:r>
+        <w:t>, el cual</w:t>
+      </w:r>
+      <w:r>
+        <w:t xml:space="preserve"> será nuestro "pivote" y su posición no va a cambiar.</w:t>
+      </w:r>
+    </w:p>
+    <w:p>
+      <w:pPr>
+        <w:numPr>
+          <w:ilvl w:val="0"/>
+          <w:numId w:val="14"/>
+        </w:numPr>
+      </w:pPr>
+      <w:r>
+        <w:t>Busca todos los números de la lista que sean más chicos que el pivote y divide ese grupo en dos mitades iguales. Manda una mitad a la izquierda del pivote y la otra a la derecha</w:t>
+      </w:r>
+      <w:r>
+        <w:t>.</w:t>
+      </w:r>
+    </w:p>
+    <w:p>
+      <w:pPr>
+        <w:numPr>
+          <w:ilvl w:val="0"/>
+          <w:numId w:val="14"/>
+        </w:numPr>
+      </w:pPr>
+      <w:r>
+        <w:t>Como el pivote no se puede mover, el lado izquierdo tiene que mantener la misma cantidad de elementos que tenía al principio. Para lograrlo, el algoritmo usa los números más grandes (los que son mayores o iguales al pivote) para rellenar los lugares que faltan a la izquierda. Los grandes que sobran los manda al lado derecho.</w:t>
+      </w:r>
+    </w:p>
+    <w:p>
+      <w:pPr>
+        <w:numPr>
+          <w:ilvl w:val="0"/>
+          <w:numId w:val="14"/>
+        </w:numPr>
+      </w:pPr>
+      <w:r>
+        <w:t>Finalmente, vuelve a unir todo: el lado izquierdo ya completo, el pivote en el medio, y el lado derecho.</w:t>
+      </w:r>
+    </w:p>
     <w:p/>
+    <w:p/>
     <w:p>
       <w:pPr>
         <w:rPr>
@@ -972,29 +1000,12 @@
           <w:b/>
           <w:bCs/>
         </w:rPr>
-        <w:t>Implementar un algoritmo Contiene-Suma(</w:t>
-      </w:r>
-      <w:proofErr w:type="spellStart"/>
-      <w:proofErr w:type="gramStart"/>
-      <w:r>
-        <w:rPr>
-          <w:b/>
-          <w:bCs/>
-        </w:rPr>
-        <w:t>A,n</w:t>
-      </w:r>
-      <w:proofErr w:type="spellEnd"/>
-      <w:proofErr w:type="gramEnd"/>
-      <w:r>
-        <w:rPr>
-          <w:b/>
-          <w:bCs/>
-        </w:rPr>
-        <w:t>) que recibe una lista de enteros A y un entero n y devuelve True si existen en A un par de elementos que sumados den n. Analice el costo computacional.</w:t>
-      </w:r>
-    </w:p>
-    <w:p>
-      <w:r>
+        <w:t>Implementar un algoritmo Contiene-Suma(A,n) que recibe una lista de enteros A y un entero n y devuelve True si existen en A un par de elementos que sumados den n. Analice el costo computacional.</w:t>
+      </w:r>
+    </w:p>
+    <w:p>
+      <w:r>
+        <w:lastRenderedPageBreak/>
         <w:t>Realicé dos algoritmos para resolver el problema, cada uno con un costo computacional diferente: uno tiene una complejidad de O(n²), mientras que el otro logra reducirla a O(n).</w:t>
       </w:r>
     </w:p>
@@ -1087,11 +1098,9 @@
             <w:pPr>
               <w:spacing w:after="160" w:line="278" w:lineRule="auto"/>
             </w:pPr>
-            <w:proofErr w:type="spellStart"/>
             <w:r>
               <w:t>contiene_suma</w:t>
             </w:r>
-            <w:proofErr w:type="spellEnd"/>
           </w:p>
         </w:tc>
         <w:tc>
@@ -1104,15 +1113,7 @@
               <w:spacing w:after="160" w:line="278" w:lineRule="auto"/>
             </w:pPr>
             <w:r>
-              <w:t xml:space="preserve">Recorre la lista mediante dos ciclos </w:t>
-            </w:r>
-            <w:proofErr w:type="spellStart"/>
-            <w:r>
-              <w:t>for</w:t>
-            </w:r>
-            <w:proofErr w:type="spellEnd"/>
-            <w:r>
-              <w:t>, comparando cada elemento con los siguientes para encontrar un par cuya suma sea igual a n.</w:t>
+              <w:t>Recorre la lista mediante dos ciclos for, comparando cada elemento con los siguientes para encontrar un par cuya suma sea igual a n.</w:t>
             </w:r>
           </w:p>
         </w:tc>
@@ -1212,74 +1213,12 @@
           <w:b/>
           <w:bCs/>
         </w:rPr>
-        <w:lastRenderedPageBreak/>
-        <w:t xml:space="preserve">Investigar otro algoritmo de ordenamiento como </w:t>
-      </w:r>
-      <w:proofErr w:type="spellStart"/>
-      <w:r>
-        <w:rPr>
-          <w:b/>
-          <w:bCs/>
-        </w:rPr>
-        <w:t>BucketSort</w:t>
-      </w:r>
-      <w:proofErr w:type="spellEnd"/>
-      <w:r>
-        <w:rPr>
-          <w:b/>
-          <w:bCs/>
-        </w:rPr>
-        <w:t xml:space="preserve">, </w:t>
-      </w:r>
-      <w:proofErr w:type="spellStart"/>
-      <w:r>
-        <w:rPr>
-          <w:b/>
-          <w:bCs/>
-        </w:rPr>
-        <w:t>HeapSort</w:t>
-      </w:r>
-      <w:proofErr w:type="spellEnd"/>
-      <w:r>
-        <w:rPr>
-          <w:b/>
-          <w:bCs/>
-        </w:rPr>
-        <w:t xml:space="preserve"> o </w:t>
-      </w:r>
-      <w:proofErr w:type="spellStart"/>
-      <w:r>
-        <w:rPr>
-          <w:b/>
-          <w:bCs/>
-        </w:rPr>
-        <w:t>RadixSort</w:t>
-      </w:r>
-      <w:proofErr w:type="spellEnd"/>
-      <w:r>
-        <w:rPr>
-          <w:b/>
-          <w:bCs/>
-        </w:rPr>
-        <w:t>, brindando un ejemplo que explique su funcionamiento en un caso promedio. Mencionar su orden y explicar sus casos promedio, mejor y peor.</w:t>
-      </w:r>
-    </w:p>
-    <w:p>
-      <w:proofErr w:type="spellStart"/>
-      <w:r>
-        <w:t>Counting</w:t>
-      </w:r>
-      <w:proofErr w:type="spellEnd"/>
-      <w:r>
-        <w:t xml:space="preserve"> </w:t>
-      </w:r>
-      <w:proofErr w:type="spellStart"/>
-      <w:r>
-        <w:t>Sort</w:t>
-      </w:r>
-      <w:proofErr w:type="spellEnd"/>
-      <w:r>
-        <w:t xml:space="preserve"> es un algoritmo de ordenamiento que funciona contando la cantidad de ocurrencias de cada elemento en un arreglo. Utiliza esta información para construir el arreglo ordenado de manera eficiente. Funciona bien cuando el rango de valores posibles no es demasiado grande.</w:t>
+        <w:t>Investigar otro algoritmo de ordenamiento como BucketSort, HeapSort o RadixSort, brindando un ejemplo que explique su funcionamiento en un caso promedio. Mencionar su orden y explicar sus casos promedio, mejor y peor.</w:t>
+      </w:r>
+    </w:p>
+    <w:p>
+      <w:r>
+        <w:t>Counting Sort es un algoritmo de ordenamiento que funciona contando la cantidad de ocurrencias de cada elemento en un arreglo. Utiliza esta información para construir el arreglo ordenado de manera eficiente. Funciona bien cuando el rango de valores posibles no es demasiado grande.</w:t>
       </w:r>
     </w:p>
     <w:p>
@@ -1379,6 +1318,7 @@
     </w:p>
     <w:p>
       <w:r>
+        <w:lastRenderedPageBreak/>
         <w:t>Luego se recorren estos valores en orden y se reconstruye el arreglo utilizando las cantidades obtenidas:</w:t>
       </w:r>
     </w:p>
@@ -1396,15 +1336,7 @@
         </w:numPr>
       </w:pPr>
       <w:r>
-        <w:t xml:space="preserve">Caso promedio: Su complejidad es </w:t>
-      </w:r>
-      <w:proofErr w:type="gramStart"/>
-      <w:r>
-        <w:t>O(</w:t>
-      </w:r>
-      <w:proofErr w:type="gramEnd"/>
-      <w:r>
-        <w:t>n + k), ya que debe recorrer los elementos del arreglo y el rango de valores para realizar el conteo y construir el arreglo ordenado.</w:t>
+        <w:t>Caso promedio: Su complejidad es O(n + k), ya que debe recorrer los elementos del arreglo y el rango de valores para realizar el conteo y construir el arreglo ordenado.</w:t>
       </w:r>
     </w:p>
     <w:p>
@@ -1416,31 +1348,7 @@
         </w:numPr>
       </w:pPr>
       <w:r>
-        <w:t xml:space="preserve">Mejor caso: También es </w:t>
-      </w:r>
-      <w:proofErr w:type="gramStart"/>
-      <w:r>
-        <w:t>O(</w:t>
-      </w:r>
-      <w:proofErr w:type="gramEnd"/>
-      <w:r>
-        <w:t xml:space="preserve">n + k), porque aunque el arreglo ya esté ordenado o tenga pocos elementos repetidos, </w:t>
-      </w:r>
-      <w:proofErr w:type="spellStart"/>
-      <w:r>
-        <w:t>Counting</w:t>
-      </w:r>
-      <w:proofErr w:type="spellEnd"/>
-      <w:r>
-        <w:t xml:space="preserve"> </w:t>
-      </w:r>
-      <w:proofErr w:type="spellStart"/>
-      <w:r>
-        <w:t>Sort</w:t>
-      </w:r>
-      <w:proofErr w:type="spellEnd"/>
-      <w:r>
-        <w:t xml:space="preserve"> igualmente debe realizar el conteo y recorrer el rango de valores.</w:t>
+        <w:t>Mejor caso: También es O(n + k), porque aunque el arreglo ya esté ordenado o tenga pocos elementos repetidos, Counting Sort igualmente debe realizar el conteo y recorrer el rango de valores.</w:t>
       </w:r>
     </w:p>
     <w:p>
@@ -1452,15 +1360,7 @@
         </w:numPr>
       </w:pPr>
       <w:r>
-        <w:t xml:space="preserve">Peor caso: Es </w:t>
-      </w:r>
-      <w:proofErr w:type="gramStart"/>
-      <w:r>
-        <w:t>O(</w:t>
-      </w:r>
-      <w:proofErr w:type="gramEnd"/>
-      <w:r>
-        <w:t>n + k). Se produce cuando el rango de valores k es muy grande en relación con la cantidad de elementos n, ya que se necesita recorrer y almacenar información para todo el rango.</w:t>
+        <w:t>Peor caso: Es O(n + k). Se produce cuando el rango de valores k es muy grande en relación con la cantidad de elementos n, ya que se necesita recorrer y almacenar información para todo el rango.</w:t>
       </w:r>
     </w:p>
     <w:p>
@@ -1480,11 +1380,7 @@
     </w:p>
     <w:p>
       <w:r>
-        <w:t xml:space="preserve">A partir de las siguientes ecuaciones de recurrencia, encontrar la complejidad expresada en Θ(n) y ordenarlas de forma ascendente respecto a la velocidad de crecimiento. Asumiendo que T(n) es constante para n &lt;= 2. Resolver 3 de ellas con el método maestro completo: T(n) = a T(n/b) + f(n) y otros 3 con el método maestro simplificado: T(n) = a T(n/b) + </w:t>
-      </w:r>
-      <w:proofErr w:type="spellStart"/>
-      <w:r>
-        <w:t>n</w:t>
+        <w:t>A partir de las siguientes ecuaciones de recurrencia, encontrar la complejidad expresada en Θ(n) y ordenarlas de forma ascendente respecto a la velocidad de crecimiento. Asumiendo que T(n) es constante para n &lt;= 2. Resolver 3 de ellas con el método maestro completo: T(n) = a T(n/b) + f(n) y otros 3 con el método maestro simplificado: T(n) = a T(n/b) + n</w:t>
       </w:r>
       <w:r>
         <w:rPr>
@@ -1492,7 +1388,6 @@
         </w:rPr>
         <w:t>c</w:t>
       </w:r>
-      <w:proofErr w:type="spellEnd"/>
     </w:p>
     <w:p>
       <w:pPr>
@@ -1500,17 +1395,853 @@
           <w:ilvl w:val="0"/>
           <w:numId w:val="1"/>
         </w:numPr>
-      </w:pPr>
-      <w:r>
-        <w:lastRenderedPageBreak/>
+        <w:rPr>
+          <w:b/>
+          <w:bCs/>
+        </w:rPr>
+      </w:pPr>
+      <w:r>
+        <w:rPr>
+          <w:b/>
+          <w:bCs/>
+        </w:rPr>
         <w:t>T(n) = 2T(n/2) + n</w:t>
       </w:r>
       <w:r>
         <w:rPr>
+          <w:b/>
+          <w:bCs/>
           <w:vertAlign w:val="superscript"/>
         </w:rPr>
         <w:t>4</w:t>
       </w:r>
+    </w:p>
+    <w:p>
+      <m:oMathPara>
+        <m:oMath>
+          <m:r>
+            <w:rPr>
+              <w:rFonts w:ascii="Cambria Math" w:hAnsi="Cambria Math"/>
+            </w:rPr>
+            <m:t>a=2,b=2,f</m:t>
+          </m:r>
+          <m:d>
+            <m:dPr>
+              <m:ctrlPr>
+                <w:rPr>
+                  <w:rFonts w:ascii="Cambria Math" w:hAnsi="Cambria Math"/>
+                  <w:i/>
+                </w:rPr>
+              </m:ctrlPr>
+            </m:dPr>
+            <m:e>
+              <m:r>
+                <w:rPr>
+                  <w:rFonts w:ascii="Cambria Math" w:hAnsi="Cambria Math"/>
+                </w:rPr>
+                <m:t>n</m:t>
+              </m:r>
+            </m:e>
+          </m:d>
+          <m:r>
+            <w:rPr>
+              <w:rFonts w:ascii="Cambria Math" w:hAnsi="Cambria Math"/>
+            </w:rPr>
+            <m:t>=</m:t>
+          </m:r>
+          <m:sSup>
+            <m:sSupPr>
+              <m:ctrlPr>
+                <w:rPr>
+                  <w:rFonts w:ascii="Cambria Math" w:hAnsi="Cambria Math"/>
+                  <w:i/>
+                  <w:iCs/>
+                </w:rPr>
+              </m:ctrlPr>
+            </m:sSupPr>
+            <m:e>
+              <m:r>
+                <w:rPr>
+                  <w:rFonts w:ascii="Cambria Math" w:hAnsi="Cambria Math"/>
+                </w:rPr>
+                <m:t>n</m:t>
+              </m:r>
+            </m:e>
+            <m:sup>
+              <m:r>
+                <w:rPr>
+                  <w:rFonts w:ascii="Cambria Math" w:hAnsi="Cambria Math"/>
+                </w:rPr>
+                <m:t>4</m:t>
+              </m:r>
+            </m:sup>
+          </m:sSup>
+        </m:oMath>
+      </m:oMathPara>
+    </w:p>
+    <w:p>
+      <m:oMathPara>
+        <m:oMath>
+          <m:sSub>
+            <m:sSubPr>
+              <m:ctrlPr>
+                <w:rPr>
+                  <w:rFonts w:ascii="Cambria Math" w:hAnsi="Cambria Math"/>
+                  <w:i/>
+                  <w:iCs/>
+                </w:rPr>
+              </m:ctrlPr>
+            </m:sSubPr>
+            <m:e>
+              <m:r>
+                <w:rPr>
+                  <w:rFonts w:ascii="Cambria Math" w:hAnsi="Cambria Math"/>
+                </w:rPr>
+                <m:t>log</m:t>
+              </m:r>
+            </m:e>
+            <m:sub>
+              <m:r>
+                <w:rPr>
+                  <w:rFonts w:ascii="Cambria Math" w:hAnsi="Cambria Math"/>
+                </w:rPr>
+                <m:t>2</m:t>
+              </m:r>
+            </m:sub>
+          </m:sSub>
+          <m:r>
+            <w:rPr>
+              <w:rFonts w:ascii="Cambria Math" w:hAnsi="Cambria Math" w:cs="Arial"/>
+            </w:rPr>
+            <m:t>​</m:t>
+          </m:r>
+          <m:d>
+            <m:dPr>
+              <m:ctrlPr>
+                <w:rPr>
+                  <w:rFonts w:ascii="Cambria Math" w:hAnsi="Cambria Math"/>
+                  <w:i/>
+                </w:rPr>
+              </m:ctrlPr>
+            </m:dPr>
+            <m:e>
+              <m:r>
+                <w:rPr>
+                  <w:rFonts w:ascii="Cambria Math" w:hAnsi="Cambria Math"/>
+                </w:rPr>
+                <m:t>2</m:t>
+              </m:r>
+            </m:e>
+          </m:d>
+          <m:r>
+            <w:rPr>
+              <w:rFonts w:ascii="Cambria Math" w:hAnsi="Cambria Math"/>
+            </w:rPr>
+            <m:t>=1</m:t>
+          </m:r>
+        </m:oMath>
+      </m:oMathPara>
+    </w:p>
+    <w:p>
+      <m:oMathPara>
+        <m:oMath>
+          <m:r>
+            <w:rPr>
+              <w:rFonts w:ascii="Cambria Math" w:hAnsi="Cambria Math"/>
+            </w:rPr>
+            <m:t>1+3=4</m:t>
+          </m:r>
+          <m:r>
+            <w:rPr>
+              <w:rFonts w:ascii="Cambria Math" w:hAnsi="Cambria Math" w:cs="Cambria Math"/>
+            </w:rPr>
+            <m:t>⇒</m:t>
+          </m:r>
+          <m:r>
+            <w:rPr>
+              <w:rFonts w:ascii="Cambria Math" w:hAnsi="Cambria Math"/>
+            </w:rPr>
+            <m:t>ε=3</m:t>
+          </m:r>
+        </m:oMath>
+      </m:oMathPara>
+    </w:p>
+    <w:p>
+      <m:oMathPara>
+        <m:oMath>
+          <m:r>
+            <w:rPr>
+              <w:rFonts w:ascii="Cambria Math" w:hAnsi="Cambria Math"/>
+            </w:rPr>
+            <m:t>f</m:t>
+          </m:r>
+          <m:d>
+            <m:dPr>
+              <m:ctrlPr>
+                <w:rPr>
+                  <w:rFonts w:ascii="Cambria Math" w:hAnsi="Cambria Math"/>
+                  <w:i/>
+                </w:rPr>
+              </m:ctrlPr>
+            </m:dPr>
+            <m:e>
+              <m:r>
+                <w:rPr>
+                  <w:rFonts w:ascii="Cambria Math" w:hAnsi="Cambria Math"/>
+                </w:rPr>
+                <m:t>n</m:t>
+              </m:r>
+            </m:e>
+          </m:d>
+          <m:r>
+            <w:rPr>
+              <w:rFonts w:ascii="Cambria Math" w:hAnsi="Cambria Math"/>
+            </w:rPr>
+            <m:t>=Ω</m:t>
+          </m:r>
+          <m:d>
+            <m:dPr>
+              <m:ctrlPr>
+                <w:rPr>
+                  <w:rFonts w:ascii="Cambria Math" w:hAnsi="Cambria Math"/>
+                  <w:i/>
+                </w:rPr>
+              </m:ctrlPr>
+            </m:dPr>
+            <m:e>
+              <m:sSup>
+                <m:sSupPr>
+                  <m:ctrlPr>
+                    <w:rPr>
+                      <w:rFonts w:ascii="Cambria Math" w:hAnsi="Cambria Math"/>
+                      <w:i/>
+                      <w:iCs/>
+                    </w:rPr>
+                  </m:ctrlPr>
+                </m:sSupPr>
+                <m:e>
+                  <m:r>
+                    <w:rPr>
+                      <w:rFonts w:ascii="Cambria Math" w:hAnsi="Cambria Math"/>
+                    </w:rPr>
+                    <m:t>n</m:t>
+                  </m:r>
+                </m:e>
+                <m:sup>
+                  <m:r>
+                    <w:rPr>
+                      <w:rFonts w:ascii="Cambria Math" w:hAnsi="Cambria Math"/>
+                    </w:rPr>
+                    <m:t>1+3</m:t>
+                  </m:r>
+                </m:sup>
+              </m:sSup>
+            </m:e>
+          </m:d>
+          <m:r>
+            <w:rPr>
+              <w:rFonts w:ascii="Cambria Math" w:hAnsi="Cambria Math"/>
+            </w:rPr>
+            <m:t>=Ω</m:t>
+          </m:r>
+          <m:d>
+            <m:dPr>
+              <m:ctrlPr>
+                <w:rPr>
+                  <w:rFonts w:ascii="Cambria Math" w:hAnsi="Cambria Math"/>
+                  <w:i/>
+                </w:rPr>
+              </m:ctrlPr>
+            </m:dPr>
+            <m:e>
+              <m:sSup>
+                <m:sSupPr>
+                  <m:ctrlPr>
+                    <w:rPr>
+                      <w:rFonts w:ascii="Cambria Math" w:hAnsi="Cambria Math"/>
+                      <w:i/>
+                      <w:iCs/>
+                    </w:rPr>
+                  </m:ctrlPr>
+                </m:sSupPr>
+                <m:e>
+                  <m:r>
+                    <w:rPr>
+                      <w:rFonts w:ascii="Cambria Math" w:hAnsi="Cambria Math"/>
+                    </w:rPr>
+                    <m:t>n</m:t>
+                  </m:r>
+                </m:e>
+                <m:sup>
+                  <m:r>
+                    <w:rPr>
+                      <w:rFonts w:ascii="Cambria Math" w:hAnsi="Cambria Math"/>
+                    </w:rPr>
+                    <m:t>4</m:t>
+                  </m:r>
+                </m:sup>
+              </m:sSup>
+            </m:e>
+          </m:d>
+          <m:r>
+            <w:rPr>
+              <w:rFonts w:ascii="Cambria Math" w:hAnsi="Cambria Math"/>
+            </w:rPr>
+            <m:t>,  3&gt;0</m:t>
+          </m:r>
+        </m:oMath>
+      </m:oMathPara>
+    </w:p>
+    <w:p>
+      <m:oMathPara>
+        <m:oMath>
+          <m:r>
+            <w:rPr>
+              <w:rFonts w:ascii="Cambria Math" w:hAnsi="Cambria Math"/>
+            </w:rPr>
+            <m:t>2f</m:t>
+          </m:r>
+          <m:d>
+            <m:dPr>
+              <m:ctrlPr>
+                <w:rPr>
+                  <w:rFonts w:ascii="Cambria Math" w:hAnsi="Cambria Math"/>
+                  <w:i/>
+                </w:rPr>
+              </m:ctrlPr>
+            </m:dPr>
+            <m:e>
+              <m:f>
+                <m:fPr>
+                  <m:ctrlPr>
+                    <w:rPr>
+                      <w:rFonts w:ascii="Cambria Math" w:hAnsi="Cambria Math"/>
+                      <w:i/>
+                      <w:iCs/>
+                    </w:rPr>
+                  </m:ctrlPr>
+                </m:fPr>
+                <m:num>
+                  <m:r>
+                    <w:rPr>
+                      <w:rFonts w:ascii="Cambria Math" w:hAnsi="Cambria Math"/>
+                    </w:rPr>
+                    <m:t>n</m:t>
+                  </m:r>
+                </m:num>
+                <m:den>
+                  <m:r>
+                    <w:rPr>
+                      <w:rFonts w:ascii="Cambria Math" w:hAnsi="Cambria Math"/>
+                    </w:rPr>
+                    <m:t>2</m:t>
+                  </m:r>
+                </m:den>
+              </m:f>
+            </m:e>
+          </m:d>
+          <m:r>
+            <w:rPr>
+              <w:rFonts w:ascii="Cambria Math" w:hAnsi="Cambria Math"/>
+            </w:rPr>
+            <m:t>≤cf</m:t>
+          </m:r>
+          <m:d>
+            <m:dPr>
+              <m:ctrlPr>
+                <w:rPr>
+                  <w:rFonts w:ascii="Cambria Math" w:hAnsi="Cambria Math"/>
+                  <w:i/>
+                </w:rPr>
+              </m:ctrlPr>
+            </m:dPr>
+            <m:e>
+              <m:r>
+                <w:rPr>
+                  <w:rFonts w:ascii="Cambria Math" w:hAnsi="Cambria Math"/>
+                </w:rPr>
+                <m:t>n</m:t>
+              </m:r>
+            </m:e>
+          </m:d>
+          <m:r>
+            <w:rPr>
+              <w:rFonts w:ascii="Cambria Math" w:hAnsi="Cambria Math"/>
+            </w:rPr>
+            <m:t>,  c&lt;1</m:t>
+          </m:r>
+        </m:oMath>
+      </m:oMathPara>
+    </w:p>
+    <w:p>
+      <m:oMathPara>
+        <m:oMath>
+          <m:r>
+            <w:rPr>
+              <w:rFonts w:ascii="Cambria Math" w:hAnsi="Cambria Math"/>
+            </w:rPr>
+            <m:t>2</m:t>
+          </m:r>
+          <m:sSup>
+            <m:sSupPr>
+              <m:ctrlPr>
+                <w:rPr>
+                  <w:rFonts w:ascii="Cambria Math" w:hAnsi="Cambria Math"/>
+                  <w:i/>
+                </w:rPr>
+              </m:ctrlPr>
+            </m:sSupPr>
+            <m:e>
+              <m:d>
+                <m:dPr>
+                  <m:ctrlPr>
+                    <w:rPr>
+                      <w:rFonts w:ascii="Cambria Math" w:hAnsi="Cambria Math"/>
+                      <w:i/>
+                    </w:rPr>
+                  </m:ctrlPr>
+                </m:dPr>
+                <m:e>
+                  <m:f>
+                    <m:fPr>
+                      <m:ctrlPr>
+                        <w:rPr>
+                          <w:rFonts w:ascii="Cambria Math" w:hAnsi="Cambria Math"/>
+                          <w:i/>
+                          <w:iCs/>
+                        </w:rPr>
+                      </m:ctrlPr>
+                    </m:fPr>
+                    <m:num>
+                      <m:r>
+                        <w:rPr>
+                          <w:rFonts w:ascii="Cambria Math" w:hAnsi="Cambria Math"/>
+                        </w:rPr>
+                        <m:t>n</m:t>
+                      </m:r>
+                    </m:num>
+                    <m:den>
+                      <m:r>
+                        <w:rPr>
+                          <w:rFonts w:ascii="Cambria Math" w:hAnsi="Cambria Math"/>
+                        </w:rPr>
+                        <m:t>2</m:t>
+                      </m:r>
+                    </m:den>
+                  </m:f>
+                </m:e>
+              </m:d>
+            </m:e>
+            <m:sup>
+              <m:r>
+                <w:rPr>
+                  <w:rFonts w:ascii="Cambria Math" w:hAnsi="Cambria Math"/>
+                </w:rPr>
+                <m:t>4</m:t>
+              </m:r>
+            </m:sup>
+          </m:sSup>
+          <m:r>
+            <w:rPr>
+              <w:rFonts w:ascii="Cambria Math" w:hAnsi="Cambria Math"/>
+            </w:rPr>
+            <m:t>≤c</m:t>
+          </m:r>
+          <m:r>
+            <w:rPr>
+              <w:rFonts w:ascii="Cambria Math" w:hAnsi="Cambria Math" w:cs="Cambria Math"/>
+            </w:rPr>
+            <m:t>⋅</m:t>
+          </m:r>
+          <m:sSup>
+            <m:sSupPr>
+              <m:ctrlPr>
+                <w:rPr>
+                  <w:rFonts w:ascii="Cambria Math" w:hAnsi="Cambria Math"/>
+                  <w:i/>
+                  <w:iCs/>
+                </w:rPr>
+              </m:ctrlPr>
+            </m:sSupPr>
+            <m:e>
+              <m:r>
+                <w:rPr>
+                  <w:rFonts w:ascii="Cambria Math" w:hAnsi="Cambria Math"/>
+                </w:rPr>
+                <m:t>n</m:t>
+              </m:r>
+            </m:e>
+            <m:sup>
+              <m:r>
+                <w:rPr>
+                  <w:rFonts w:ascii="Cambria Math" w:hAnsi="Cambria Math"/>
+                </w:rPr>
+                <m:t>4</m:t>
+              </m:r>
+            </m:sup>
+          </m:sSup>
+        </m:oMath>
+      </m:oMathPara>
+    </w:p>
+    <w:p>
+      <m:oMathPara>
+        <m:oMath>
+          <m:f>
+            <m:fPr>
+              <m:ctrlPr>
+                <w:rPr>
+                  <w:rFonts w:ascii="Cambria Math" w:hAnsi="Cambria Math"/>
+                  <w:i/>
+                  <w:iCs/>
+                </w:rPr>
+              </m:ctrlPr>
+            </m:fPr>
+            <m:num>
+              <m:r>
+                <w:rPr>
+                  <w:rFonts w:ascii="Cambria Math" w:hAnsi="Cambria Math"/>
+                </w:rPr>
+                <m:t>2</m:t>
+              </m:r>
+              <m:sSup>
+                <m:sSupPr>
+                  <m:ctrlPr>
+                    <w:rPr>
+                      <w:rFonts w:ascii="Cambria Math" w:hAnsi="Cambria Math"/>
+                      <w:i/>
+                      <w:iCs/>
+                    </w:rPr>
+                  </m:ctrlPr>
+                </m:sSupPr>
+                <m:e>
+                  <m:r>
+                    <w:rPr>
+                      <w:rFonts w:ascii="Cambria Math" w:hAnsi="Cambria Math"/>
+                    </w:rPr>
+                    <m:t>n</m:t>
+                  </m:r>
+                </m:e>
+                <m:sup>
+                  <m:r>
+                    <w:rPr>
+                      <w:rFonts w:ascii="Cambria Math" w:hAnsi="Cambria Math"/>
+                    </w:rPr>
+                    <m:t>4</m:t>
+                  </m:r>
+                </m:sup>
+              </m:sSup>
+            </m:num>
+            <m:den>
+              <m:r>
+                <w:rPr>
+                  <w:rFonts w:ascii="Cambria Math" w:hAnsi="Cambria Math"/>
+                </w:rPr>
+                <m:t>16</m:t>
+              </m:r>
+            </m:den>
+          </m:f>
+          <m:r>
+            <w:rPr>
+              <w:rFonts w:ascii="Cambria Math" w:hAnsi="Cambria Math" w:cs="Arial"/>
+            </w:rPr>
+            <m:t>​</m:t>
+          </m:r>
+          <m:r>
+            <w:rPr>
+              <w:rFonts w:ascii="Cambria Math" w:hAnsi="Cambria Math"/>
+            </w:rPr>
+            <m:t>≤c</m:t>
+          </m:r>
+          <m:r>
+            <w:rPr>
+              <w:rFonts w:ascii="Cambria Math" w:hAnsi="Cambria Math" w:cs="Cambria Math"/>
+            </w:rPr>
+            <m:t>⋅</m:t>
+          </m:r>
+          <m:sSup>
+            <m:sSupPr>
+              <m:ctrlPr>
+                <w:rPr>
+                  <w:rFonts w:ascii="Cambria Math" w:hAnsi="Cambria Math"/>
+                  <w:i/>
+                  <w:iCs/>
+                </w:rPr>
+              </m:ctrlPr>
+            </m:sSupPr>
+            <m:e>
+              <m:r>
+                <w:rPr>
+                  <w:rFonts w:ascii="Cambria Math" w:hAnsi="Cambria Math"/>
+                </w:rPr>
+                <m:t>n</m:t>
+              </m:r>
+            </m:e>
+            <m:sup>
+              <m:r>
+                <w:rPr>
+                  <w:rFonts w:ascii="Cambria Math" w:hAnsi="Cambria Math"/>
+                </w:rPr>
+                <m:t>4</m:t>
+              </m:r>
+            </m:sup>
+          </m:sSup>
+        </m:oMath>
+      </m:oMathPara>
+    </w:p>
+    <w:p>
+      <m:oMathPara>
+        <m:oMath>
+          <m:r>
+            <w:rPr>
+              <w:rFonts w:ascii="Cambria Math" w:hAnsi="Cambria Math"/>
+            </w:rPr>
+            <m:t>8</m:t>
+          </m:r>
+          <m:sSup>
+            <m:sSupPr>
+              <m:ctrlPr>
+                <w:rPr>
+                  <w:rFonts w:ascii="Cambria Math" w:hAnsi="Cambria Math"/>
+                  <w:i/>
+                  <w:iCs/>
+                </w:rPr>
+              </m:ctrlPr>
+            </m:sSupPr>
+            <m:e>
+              <m:r>
+                <w:rPr>
+                  <w:rFonts w:ascii="Cambria Math" w:hAnsi="Cambria Math"/>
+                </w:rPr>
+                <m:t>n</m:t>
+              </m:r>
+            </m:e>
+            <m:sup>
+              <m:r>
+                <w:rPr>
+                  <w:rFonts w:ascii="Cambria Math" w:hAnsi="Cambria Math"/>
+                </w:rPr>
+                <m:t>4</m:t>
+              </m:r>
+            </m:sup>
+          </m:sSup>
+          <m:r>
+            <w:rPr>
+              <w:rFonts w:ascii="Cambria Math" w:hAnsi="Cambria Math" w:cs="Arial"/>
+            </w:rPr>
+            <m:t>​</m:t>
+          </m:r>
+          <m:r>
+            <w:rPr>
+              <w:rFonts w:ascii="Cambria Math" w:hAnsi="Cambria Math"/>
+            </w:rPr>
+            <m:t>≤c</m:t>
+          </m:r>
+          <m:r>
+            <w:rPr>
+              <w:rFonts w:ascii="Cambria Math" w:hAnsi="Cambria Math" w:cs="Cambria Math"/>
+            </w:rPr>
+            <m:t>⋅</m:t>
+          </m:r>
+          <m:sSup>
+            <m:sSupPr>
+              <m:ctrlPr>
+                <w:rPr>
+                  <w:rFonts w:ascii="Cambria Math" w:hAnsi="Cambria Math"/>
+                  <w:i/>
+                  <w:iCs/>
+                </w:rPr>
+              </m:ctrlPr>
+            </m:sSupPr>
+            <m:e>
+              <m:r>
+                <w:rPr>
+                  <w:rFonts w:ascii="Cambria Math" w:hAnsi="Cambria Math"/>
+                </w:rPr>
+                <m:t>n</m:t>
+              </m:r>
+            </m:e>
+            <m:sup>
+              <m:r>
+                <w:rPr>
+                  <w:rFonts w:ascii="Cambria Math" w:hAnsi="Cambria Math"/>
+                </w:rPr>
+                <m:t>4</m:t>
+              </m:r>
+            </m:sup>
+          </m:sSup>
+        </m:oMath>
+      </m:oMathPara>
+    </w:p>
+    <w:p>
+      <w:r>
+        <w:t xml:space="preserve">Por ejemplo, para </w:t>
+      </w:r>
+      <m:oMath>
+        <m:r>
+          <w:rPr>
+            <w:rFonts w:ascii="Cambria Math" w:hAnsi="Cambria Math"/>
+          </w:rPr>
+          <m:t>c=</m:t>
+        </m:r>
+        <m:f>
+          <m:fPr>
+            <m:ctrlPr>
+              <w:rPr>
+                <w:rFonts w:ascii="Cambria Math" w:hAnsi="Cambria Math"/>
+                <w:i/>
+                <w:iCs/>
+              </w:rPr>
+            </m:ctrlPr>
+          </m:fPr>
+          <m:num>
+            <m:r>
+              <w:rPr>
+                <w:rFonts w:ascii="Cambria Math" w:hAnsi="Cambria Math"/>
+              </w:rPr>
+              <m:t>1</m:t>
+            </m:r>
+          </m:num>
+          <m:den>
+            <m:r>
+              <w:rPr>
+                <w:rFonts w:ascii="Cambria Math" w:hAnsi="Cambria Math"/>
+              </w:rPr>
+              <m:t>2</m:t>
+            </m:r>
+          </m:den>
+        </m:f>
+      </m:oMath>
+      <w:r>
+        <w:rPr>
+          <w:rFonts w:ascii="Arial" w:hAnsi="Arial" w:cs="Arial"/>
+        </w:rPr>
+        <w:t>​</w:t>
+      </w:r>
+      <w:r>
+        <w:t>, se cumple la condición.</w:t>
+      </w:r>
+    </w:p>
+    <w:p>
+      <w:r>
+        <w:t>Por lo tanto:</w:t>
+      </w:r>
+    </w:p>
+    <w:p>
+      <m:oMathPara>
+        <m:oMath>
+          <m:r>
+            <w:rPr>
+              <w:rFonts w:ascii="Cambria Math" w:hAnsi="Cambria Math"/>
+            </w:rPr>
+            <m:t>T</m:t>
+          </m:r>
+          <m:d>
+            <m:dPr>
+              <m:ctrlPr>
+                <w:rPr>
+                  <w:rFonts w:ascii="Cambria Math" w:hAnsi="Cambria Math"/>
+                  <w:i/>
+                </w:rPr>
+              </m:ctrlPr>
+            </m:dPr>
+            <m:e>
+              <m:r>
+                <w:rPr>
+                  <w:rFonts w:ascii="Cambria Math" w:hAnsi="Cambria Math"/>
+                </w:rPr>
+                <m:t>n</m:t>
+              </m:r>
+            </m:e>
+          </m:d>
+          <m:r>
+            <w:rPr>
+              <w:rFonts w:ascii="Cambria Math" w:hAnsi="Cambria Math"/>
+            </w:rPr>
+            <m:t>=Θ</m:t>
+          </m:r>
+          <m:d>
+            <m:dPr>
+              <m:ctrlPr>
+                <w:rPr>
+                  <w:rFonts w:ascii="Cambria Math" w:hAnsi="Cambria Math"/>
+                  <w:i/>
+                </w:rPr>
+              </m:ctrlPr>
+            </m:dPr>
+            <m:e>
+              <m:r>
+                <w:rPr>
+                  <w:rFonts w:ascii="Cambria Math" w:hAnsi="Cambria Math"/>
+                </w:rPr>
+                <m:t>f</m:t>
+              </m:r>
+              <m:d>
+                <m:dPr>
+                  <m:ctrlPr>
+                    <w:rPr>
+                      <w:rFonts w:ascii="Cambria Math" w:hAnsi="Cambria Math"/>
+                      <w:i/>
+                    </w:rPr>
+                  </m:ctrlPr>
+                </m:dPr>
+                <m:e>
+                  <m:r>
+                    <w:rPr>
+                      <w:rFonts w:ascii="Cambria Math" w:hAnsi="Cambria Math"/>
+                    </w:rPr>
+                    <m:t>n</m:t>
+                  </m:r>
+                </m:e>
+              </m:d>
+            </m:e>
+          </m:d>
+          <m:r>
+            <w:rPr>
+              <w:rFonts w:ascii="Cambria Math" w:hAnsi="Cambria Math"/>
+            </w:rPr>
+            <m:t>=Θ</m:t>
+          </m:r>
+          <m:d>
+            <m:dPr>
+              <m:ctrlPr>
+                <w:rPr>
+                  <w:rFonts w:ascii="Cambria Math" w:hAnsi="Cambria Math"/>
+                  <w:i/>
+                </w:rPr>
+              </m:ctrlPr>
+            </m:dPr>
+            <m:e>
+              <m:sSup>
+                <m:sSupPr>
+                  <m:ctrlPr>
+                    <w:rPr>
+                      <w:rFonts w:ascii="Cambria Math" w:hAnsi="Cambria Math"/>
+                      <w:i/>
+                      <w:iCs/>
+                    </w:rPr>
+                  </m:ctrlPr>
+                </m:sSupPr>
+                <m:e>
+                  <m:r>
+                    <w:rPr>
+                      <w:rFonts w:ascii="Cambria Math" w:hAnsi="Cambria Math"/>
+                    </w:rPr>
+                    <m:t>n</m:t>
+                  </m:r>
+                </m:e>
+                <m:sup>
+                  <m:r>
+                    <w:rPr>
+                      <w:rFonts w:ascii="Cambria Math" w:hAnsi="Cambria Math"/>
+                    </w:rPr>
+                    <m:t>4</m:t>
+                  </m:r>
+                </m:sup>
+              </m:sSup>
+            </m:e>
+          </m:d>
+        </m:oMath>
+      </m:oMathPara>
     </w:p>
     <w:p>
       <w:pPr>
@@ -1518,10 +2249,905 @@
           <w:ilvl w:val="0"/>
           <w:numId w:val="2"/>
         </w:numPr>
-      </w:pPr>
-      <w:r>
+        <w:rPr>
+          <w:b/>
+          <w:bCs/>
+        </w:rPr>
+      </w:pPr>
+      <w:r>
+        <w:rPr>
+          <w:b/>
+          <w:bCs/>
+        </w:rPr>
         <w:t>T(n) = 2T(7n/10) + n</w:t>
       </w:r>
+    </w:p>
+    <w:p>
+      <w:pPr>
+        <w:rPr>
+          <w:rFonts w:ascii="Cambria Math" w:hAnsi="Cambria Math"/>
+          <w:lang w:val="en-US"/>
+          <w:oMath/>
+        </w:rPr>
+      </w:pPr>
+      <m:oMathPara>
+        <m:oMath>
+          <m:r>
+            <w:rPr>
+              <w:rFonts w:ascii="Cambria Math" w:hAnsi="Cambria Math"/>
+              <w:lang w:val="en-US"/>
+            </w:rPr>
+            <m:t>a=2</m:t>
+          </m:r>
+          <m:r>
+            <w:rPr>
+              <w:rFonts w:ascii="Cambria Math" w:hAnsi="Cambria Math"/>
+              <w:lang w:val="en-US"/>
+            </w:rPr>
+            <m:t xml:space="preserve">, </m:t>
+          </m:r>
+          <m:r>
+            <w:rPr>
+              <w:rFonts w:ascii="Cambria Math" w:hAnsi="Cambria Math"/>
+              <w:lang w:val="en-US"/>
+            </w:rPr>
+            <m:t>b=10</m:t>
+          </m:r>
+          <m:r>
+            <m:rPr>
+              <m:lit/>
+            </m:rPr>
+            <w:rPr>
+              <w:rFonts w:ascii="Cambria Math" w:hAnsi="Cambria Math"/>
+              <w:lang w:val="en-US"/>
+            </w:rPr>
+            <m:t>/</m:t>
+          </m:r>
+          <m:r>
+            <w:rPr>
+              <w:rFonts w:ascii="Cambria Math" w:hAnsi="Cambria Math"/>
+              <w:lang w:val="en-US"/>
+            </w:rPr>
+            <m:t>7</m:t>
+          </m:r>
+          <m:r>
+            <w:rPr>
+              <w:rFonts w:ascii="Cambria Math" w:hAnsi="Cambria Math"/>
+              <w:lang w:val="en-US"/>
+            </w:rPr>
+            <m:t xml:space="preserve">, </m:t>
+          </m:r>
+          <m:r>
+            <w:rPr>
+              <w:rFonts w:ascii="Cambria Math" w:hAnsi="Cambria Math"/>
+              <w:lang w:val="en-US"/>
+            </w:rPr>
+            <m:t>f</m:t>
+          </m:r>
+          <m:d>
+            <m:dPr>
+              <m:ctrlPr>
+                <w:rPr>
+                  <w:rFonts w:ascii="Cambria Math" w:hAnsi="Cambria Math"/>
+                  <w:i/>
+                  <w:lang w:val="en-US"/>
+                </w:rPr>
+              </m:ctrlPr>
+            </m:dPr>
+            <m:e>
+              <m:r>
+                <w:rPr>
+                  <w:rFonts w:ascii="Cambria Math" w:hAnsi="Cambria Math"/>
+                  <w:lang w:val="en-US"/>
+                </w:rPr>
+                <m:t>n</m:t>
+              </m:r>
+            </m:e>
+          </m:d>
+          <m:r>
+            <w:rPr>
+              <w:rFonts w:ascii="Cambria Math" w:hAnsi="Cambria Math"/>
+              <w:lang w:val="en-US"/>
+            </w:rPr>
+            <m:t>=n=</m:t>
+          </m:r>
+          <m:sSup>
+            <m:sSupPr>
+              <m:ctrlPr>
+                <w:rPr>
+                  <w:rFonts w:ascii="Cambria Math" w:hAnsi="Cambria Math"/>
+                  <w:i/>
+                  <w:lang w:val="en-US"/>
+                </w:rPr>
+              </m:ctrlPr>
+            </m:sSupPr>
+            <m:e>
+              <m:r>
+                <w:rPr>
+                  <w:rFonts w:ascii="Cambria Math" w:hAnsi="Cambria Math"/>
+                  <w:lang w:val="en-US"/>
+                </w:rPr>
+                <m:t>n</m:t>
+              </m:r>
+            </m:e>
+            <m:sup>
+              <m:r>
+                <w:rPr>
+                  <w:rFonts w:ascii="Cambria Math" w:hAnsi="Cambria Math"/>
+                  <w:lang w:val="en-US"/>
+                </w:rPr>
+                <m:t>1</m:t>
+              </m:r>
+            </m:sup>
+          </m:sSup>
+        </m:oMath>
+      </m:oMathPara>
+    </w:p>
+    <w:p>
+      <w:pPr>
+        <w:rPr>
+          <w:rFonts w:ascii="Cambria Math" w:hAnsi="Cambria Math"/>
+          <w:oMath/>
+        </w:rPr>
+      </w:pPr>
+      <m:oMathPara>
+        <m:oMath>
+          <m:r>
+            <w:rPr>
+              <w:rFonts w:ascii="Cambria Math" w:hAnsi="Cambria Math"/>
+            </w:rPr>
+            <w:lastRenderedPageBreak/>
+            <m:t>lo</m:t>
+          </m:r>
+          <m:sSub>
+            <m:sSubPr>
+              <m:ctrlPr>
+                <w:rPr>
+                  <w:rFonts w:ascii="Cambria Math" w:hAnsi="Cambria Math"/>
+                  <w:i/>
+                </w:rPr>
+              </m:ctrlPr>
+            </m:sSubPr>
+            <m:e>
+              <m:r>
+                <w:rPr>
+                  <w:rFonts w:ascii="Cambria Math" w:hAnsi="Cambria Math"/>
+                </w:rPr>
+                <m:t>g</m:t>
+              </m:r>
+            </m:e>
+            <m:sub>
+              <m:d>
+                <m:dPr>
+                  <m:ctrlPr>
+                    <w:rPr>
+                      <w:rFonts w:ascii="Cambria Math" w:hAnsi="Cambria Math"/>
+                      <w:i/>
+                    </w:rPr>
+                  </m:ctrlPr>
+                </m:dPr>
+                <m:e>
+                  <m:r>
+                    <w:rPr>
+                      <w:rFonts w:ascii="Cambria Math" w:hAnsi="Cambria Math"/>
+                    </w:rPr>
+                    <m:t>10</m:t>
+                  </m:r>
+                  <m:r>
+                    <m:rPr>
+                      <m:lit/>
+                    </m:rPr>
+                    <w:rPr>
+                      <w:rFonts w:ascii="Cambria Math" w:hAnsi="Cambria Math"/>
+                    </w:rPr>
+                    <m:t>/</m:t>
+                  </m:r>
+                  <m:r>
+                    <w:rPr>
+                      <w:rFonts w:ascii="Cambria Math" w:hAnsi="Cambria Math"/>
+                    </w:rPr>
+                    <m:t>7</m:t>
+                  </m:r>
+                </m:e>
+              </m:d>
+            </m:sub>
+          </m:sSub>
+          <m:d>
+            <m:dPr>
+              <m:ctrlPr>
+                <w:rPr>
+                  <w:rFonts w:ascii="Cambria Math" w:hAnsi="Cambria Math"/>
+                  <w:i/>
+                </w:rPr>
+              </m:ctrlPr>
+            </m:dPr>
+            <m:e>
+              <m:r>
+                <w:rPr>
+                  <w:rFonts w:ascii="Cambria Math" w:hAnsi="Cambria Math"/>
+                </w:rPr>
+                <m:t>2</m:t>
+              </m:r>
+            </m:e>
+          </m:d>
+          <m:r>
+            <w:rPr>
+              <w:rFonts w:ascii="Cambria Math" w:hAnsi="Cambria Math"/>
+            </w:rPr>
+            <m:t>=2.0600</m:t>
+          </m:r>
+        </m:oMath>
+      </m:oMathPara>
+    </w:p>
+    <w:p>
+      <w:pPr>
+        <w:rPr>
+          <w:rFonts w:ascii="Cambria Math" w:hAnsi="Cambria Math"/>
+          <w:oMath/>
+        </w:rPr>
+      </w:pPr>
+      <m:oMathPara>
+        <m:oMath>
+          <m:r>
+            <w:rPr>
+              <w:rFonts w:ascii="Cambria Math" w:hAnsi="Cambria Math"/>
+            </w:rPr>
+            <m:t>1&lt;2.0600</m:t>
+          </m:r>
+        </m:oMath>
+      </m:oMathPara>
+    </w:p>
+    <w:p>
+      <w:pPr>
+        <w:rPr>
+          <w:rFonts w:ascii="Cambria Math" w:hAnsi="Cambria Math"/>
+          <w:oMath/>
+        </w:rPr>
+      </w:pPr>
+      <m:oMathPara>
+        <m:oMath>
+          <m:r>
+            <w:rPr>
+              <w:rFonts w:ascii="Cambria Math" w:hAnsi="Cambria Math"/>
+            </w:rPr>
+            <m:t>ε=1</m:t>
+          </m:r>
+        </m:oMath>
+      </m:oMathPara>
+    </w:p>
+    <w:p>
+      <w:pPr>
+        <w:rPr>
+          <w:rFonts w:ascii="Cambria Math" w:hAnsi="Cambria Math"/>
+          <w:oMath/>
+        </w:rPr>
+      </w:pPr>
+      <m:oMathPara>
+        <m:oMath>
+          <m:r>
+            <w:rPr>
+              <w:rFonts w:ascii="Cambria Math" w:hAnsi="Cambria Math"/>
+            </w:rPr>
+            <m:t>f</m:t>
+          </m:r>
+          <m:d>
+            <m:dPr>
+              <m:ctrlPr>
+                <w:rPr>
+                  <w:rFonts w:ascii="Cambria Math" w:hAnsi="Cambria Math"/>
+                  <w:i/>
+                </w:rPr>
+              </m:ctrlPr>
+            </m:dPr>
+            <m:e>
+              <m:r>
+                <w:rPr>
+                  <w:rFonts w:ascii="Cambria Math" w:hAnsi="Cambria Math"/>
+                </w:rPr>
+                <m:t>n</m:t>
+              </m:r>
+            </m:e>
+          </m:d>
+          <m:r>
+            <w:rPr>
+              <w:rFonts w:ascii="Cambria Math" w:hAnsi="Cambria Math"/>
+            </w:rPr>
+            <m:t>=O</m:t>
+          </m:r>
+          <m:d>
+            <m:dPr>
+              <m:ctrlPr>
+                <w:rPr>
+                  <w:rFonts w:ascii="Cambria Math" w:hAnsi="Cambria Math"/>
+                  <w:i/>
+                </w:rPr>
+              </m:ctrlPr>
+            </m:dPr>
+            <m:e>
+              <m:sSup>
+                <m:sSupPr>
+                  <m:ctrlPr>
+                    <w:rPr>
+                      <w:rFonts w:ascii="Cambria Math" w:hAnsi="Cambria Math"/>
+                      <w:i/>
+                    </w:rPr>
+                  </m:ctrlPr>
+                </m:sSupPr>
+                <m:e>
+                  <m:r>
+                    <w:rPr>
+                      <w:rFonts w:ascii="Cambria Math" w:hAnsi="Cambria Math"/>
+                    </w:rPr>
+                    <m:t>n</m:t>
+                  </m:r>
+                </m:e>
+                <m:sup>
+                  <m:d>
+                    <m:dPr>
+                      <m:ctrlPr>
+                        <w:rPr>
+                          <w:rFonts w:ascii="Cambria Math" w:hAnsi="Cambria Math"/>
+                          <w:i/>
+                        </w:rPr>
+                      </m:ctrlPr>
+                    </m:dPr>
+                    <m:e>
+                      <m:r>
+                        <w:rPr>
+                          <w:rFonts w:ascii="Cambria Math" w:hAnsi="Cambria Math"/>
+                        </w:rPr>
+                        <m:t>lo</m:t>
+                      </m:r>
+                      <m:sSub>
+                        <m:sSubPr>
+                          <m:ctrlPr>
+                            <w:rPr>
+                              <w:rFonts w:ascii="Cambria Math" w:hAnsi="Cambria Math"/>
+                              <w:i/>
+                            </w:rPr>
+                          </m:ctrlPr>
+                        </m:sSubPr>
+                        <m:e>
+                          <m:r>
+                            <w:rPr>
+                              <w:rFonts w:ascii="Cambria Math" w:hAnsi="Cambria Math"/>
+                            </w:rPr>
+                            <m:t>g</m:t>
+                          </m:r>
+                        </m:e>
+                        <m:sub>
+                          <m:d>
+                            <m:dPr>
+                              <m:ctrlPr>
+                                <w:rPr>
+                                  <w:rFonts w:ascii="Cambria Math" w:hAnsi="Cambria Math"/>
+                                  <w:i/>
+                                </w:rPr>
+                              </m:ctrlPr>
+                            </m:dPr>
+                            <m:e>
+                              <m:r>
+                                <w:rPr>
+                                  <w:rFonts w:ascii="Cambria Math" w:hAnsi="Cambria Math"/>
+                                </w:rPr>
+                                <m:t>10</m:t>
+                              </m:r>
+                              <m:r>
+                                <m:rPr>
+                                  <m:lit/>
+                                </m:rPr>
+                                <w:rPr>
+                                  <w:rFonts w:ascii="Cambria Math" w:hAnsi="Cambria Math"/>
+                                </w:rPr>
+                                <m:t>/</m:t>
+                              </m:r>
+                              <m:r>
+                                <w:rPr>
+                                  <w:rFonts w:ascii="Cambria Math" w:hAnsi="Cambria Math"/>
+                                </w:rPr>
+                                <m:t>7</m:t>
+                              </m:r>
+                            </m:e>
+                          </m:d>
+                        </m:sub>
+                      </m:sSub>
+                      <m:d>
+                        <m:dPr>
+                          <m:ctrlPr>
+                            <w:rPr>
+                              <w:rFonts w:ascii="Cambria Math" w:hAnsi="Cambria Math"/>
+                              <w:i/>
+                            </w:rPr>
+                          </m:ctrlPr>
+                        </m:dPr>
+                        <m:e>
+                          <m:r>
+                            <w:rPr>
+                              <w:rFonts w:ascii="Cambria Math" w:hAnsi="Cambria Math"/>
+                            </w:rPr>
+                            <m:t>2</m:t>
+                          </m:r>
+                        </m:e>
+                      </m:d>
+                      <m:r>
+                        <w:rPr>
+                          <w:rFonts w:ascii="Cambria Math" w:hAnsi="Cambria Math"/>
+                        </w:rPr>
+                        <m:t>-ε</m:t>
+                      </m:r>
+                    </m:e>
+                  </m:d>
+                </m:sup>
+              </m:sSup>
+            </m:e>
+          </m:d>
+        </m:oMath>
+      </m:oMathPara>
+    </w:p>
+    <w:p>
+      <w:pPr>
+        <w:rPr>
+          <w:rFonts w:ascii="Cambria Math" w:hAnsi="Cambria Math"/>
+          <w:oMath/>
+        </w:rPr>
+      </w:pPr>
+      <m:oMathPara>
+        <m:oMath>
+          <m:r>
+            <w:rPr>
+              <w:rFonts w:ascii="Cambria Math" w:hAnsi="Cambria Math"/>
+            </w:rPr>
+            <m:t>f</m:t>
+          </m:r>
+          <m:d>
+            <m:dPr>
+              <m:ctrlPr>
+                <w:rPr>
+                  <w:rFonts w:ascii="Cambria Math" w:hAnsi="Cambria Math"/>
+                  <w:i/>
+                </w:rPr>
+              </m:ctrlPr>
+            </m:dPr>
+            <m:e>
+              <m:r>
+                <w:rPr>
+                  <w:rFonts w:ascii="Cambria Math" w:hAnsi="Cambria Math"/>
+                </w:rPr>
+                <m:t>n</m:t>
+              </m:r>
+            </m:e>
+          </m:d>
+          <m:r>
+            <w:rPr>
+              <w:rFonts w:ascii="Cambria Math" w:hAnsi="Cambria Math"/>
+            </w:rPr>
+            <m:t>=O</m:t>
+          </m:r>
+          <m:d>
+            <m:dPr>
+              <m:ctrlPr>
+                <w:rPr>
+                  <w:rFonts w:ascii="Cambria Math" w:hAnsi="Cambria Math"/>
+                  <w:i/>
+                </w:rPr>
+              </m:ctrlPr>
+            </m:dPr>
+            <m:e>
+              <m:sSup>
+                <m:sSupPr>
+                  <m:ctrlPr>
+                    <w:rPr>
+                      <w:rFonts w:ascii="Cambria Math" w:hAnsi="Cambria Math"/>
+                      <w:i/>
+                    </w:rPr>
+                  </m:ctrlPr>
+                </m:sSupPr>
+                <m:e>
+                  <m:r>
+                    <w:rPr>
+                      <w:rFonts w:ascii="Cambria Math" w:hAnsi="Cambria Math"/>
+                    </w:rPr>
+                    <m:t>n</m:t>
+                  </m:r>
+                </m:e>
+                <m:sup>
+                  <m:d>
+                    <m:dPr>
+                      <m:ctrlPr>
+                        <w:rPr>
+                          <w:rFonts w:ascii="Cambria Math" w:hAnsi="Cambria Math"/>
+                          <w:i/>
+                        </w:rPr>
+                      </m:ctrlPr>
+                    </m:dPr>
+                    <m:e>
+                      <m:r>
+                        <w:rPr>
+                          <w:rFonts w:ascii="Cambria Math" w:hAnsi="Cambria Math"/>
+                        </w:rPr>
+                        <m:t>2.0600-1</m:t>
+                      </m:r>
+                    </m:e>
+                  </m:d>
+                </m:sup>
+              </m:sSup>
+            </m:e>
+          </m:d>
+        </m:oMath>
+      </m:oMathPara>
+    </w:p>
+    <w:p>
+      <w:pPr>
+        <w:rPr>
+          <w:rFonts w:ascii="Cambria Math" w:hAnsi="Cambria Math"/>
+          <w:oMath/>
+        </w:rPr>
+      </w:pPr>
+      <m:oMathPara>
+        <m:oMath>
+          <m:r>
+            <w:rPr>
+              <w:rFonts w:ascii="Cambria Math" w:hAnsi="Cambria Math"/>
+            </w:rPr>
+            <m:t>f</m:t>
+          </m:r>
+          <m:d>
+            <m:dPr>
+              <m:ctrlPr>
+                <w:rPr>
+                  <w:rFonts w:ascii="Cambria Math" w:hAnsi="Cambria Math"/>
+                  <w:i/>
+                </w:rPr>
+              </m:ctrlPr>
+            </m:dPr>
+            <m:e>
+              <m:r>
+                <w:rPr>
+                  <w:rFonts w:ascii="Cambria Math" w:hAnsi="Cambria Math"/>
+                </w:rPr>
+                <m:t>n</m:t>
+              </m:r>
+            </m:e>
+          </m:d>
+          <m:r>
+            <w:rPr>
+              <w:rFonts w:ascii="Cambria Math" w:hAnsi="Cambria Math"/>
+            </w:rPr>
+            <m:t>=O</m:t>
+          </m:r>
+          <m:d>
+            <m:dPr>
+              <m:ctrlPr>
+                <w:rPr>
+                  <w:rFonts w:ascii="Cambria Math" w:hAnsi="Cambria Math"/>
+                  <w:i/>
+                </w:rPr>
+              </m:ctrlPr>
+            </m:dPr>
+            <m:e>
+              <m:sSup>
+                <m:sSupPr>
+                  <m:ctrlPr>
+                    <w:rPr>
+                      <w:rFonts w:ascii="Cambria Math" w:hAnsi="Cambria Math"/>
+                      <w:i/>
+                    </w:rPr>
+                  </m:ctrlPr>
+                </m:sSupPr>
+                <m:e>
+                  <m:r>
+                    <w:rPr>
+                      <w:rFonts w:ascii="Cambria Math" w:hAnsi="Cambria Math"/>
+                    </w:rPr>
+                    <m:t>n</m:t>
+                  </m:r>
+                </m:e>
+                <m:sup>
+                  <m:r>
+                    <w:rPr>
+                      <w:rFonts w:ascii="Cambria Math" w:hAnsi="Cambria Math"/>
+                    </w:rPr>
+                    <m:t>1.</m:t>
+                  </m:r>
+                </m:sup>
+              </m:sSup>
+              <m:r>
+                <w:rPr>
+                  <w:rFonts w:ascii="Cambria Math" w:hAnsi="Cambria Math"/>
+                </w:rPr>
+                <m:t>0600</m:t>
+              </m:r>
+            </m:e>
+          </m:d>
+        </m:oMath>
+      </m:oMathPara>
+    </w:p>
+    <w:p>
+      <w:pPr>
+        <w:rPr>
+          <w:rFonts w:ascii="Cambria Math" w:hAnsi="Cambria Math"/>
+          <w:oMath/>
+        </w:rPr>
+      </w:pPr>
+      <w:r>
+        <w:rPr>
+          <w:rFonts w:eastAsiaTheme="minorEastAsia"/>
+        </w:rPr>
+        <w:t>Por lo tanto, se cumple</w:t>
+      </w:r>
+      <w:r>
+        <w:rPr>
+          <w:rFonts w:eastAsiaTheme="minorEastAsia"/>
+        </w:rPr>
+        <w:t xml:space="preserve"> </w:t>
+      </w:r>
+      <w:r>
+        <w:rPr>
+          <w:rFonts w:eastAsiaTheme="minorEastAsia"/>
+        </w:rPr>
+        <w:t>la</w:t>
+      </w:r>
+      <w:r>
+        <w:rPr>
+          <w:rFonts w:eastAsiaTheme="minorEastAsia"/>
+        </w:rPr>
+        <w:t xml:space="preserve"> </w:t>
+      </w:r>
+      <w:r>
+        <w:rPr>
+          <w:rFonts w:eastAsiaTheme="minorEastAsia"/>
+        </w:rPr>
+        <w:t>condición del caso 1 del Teorema Maestro.</w:t>
+      </w:r>
+    </w:p>
+    <w:p>
+      <w:pPr>
+        <w:rPr>
+          <w:rFonts w:ascii="Cambria Math" w:hAnsi="Cambria Math"/>
+          <w:oMath/>
+        </w:rPr>
+      </w:pPr>
+      <m:oMathPara>
+        <m:oMath>
+          <m:r>
+            <w:rPr>
+              <w:rFonts w:ascii="Cambria Math" w:hAnsi="Cambria Math"/>
+            </w:rPr>
+            <m:t>T</m:t>
+          </m:r>
+          <m:d>
+            <m:dPr>
+              <m:ctrlPr>
+                <w:rPr>
+                  <w:rFonts w:ascii="Cambria Math" w:hAnsi="Cambria Math"/>
+                  <w:i/>
+                </w:rPr>
+              </m:ctrlPr>
+            </m:dPr>
+            <m:e>
+              <m:r>
+                <w:rPr>
+                  <w:rFonts w:ascii="Cambria Math" w:hAnsi="Cambria Math"/>
+                </w:rPr>
+                <m:t>n</m:t>
+              </m:r>
+            </m:e>
+          </m:d>
+          <m:r>
+            <w:rPr>
+              <w:rFonts w:ascii="Cambria Math" w:hAnsi="Cambria Math"/>
+            </w:rPr>
+            <m:t>=Θ</m:t>
+          </m:r>
+          <m:d>
+            <m:dPr>
+              <m:ctrlPr>
+                <w:rPr>
+                  <w:rFonts w:ascii="Cambria Math" w:hAnsi="Cambria Math"/>
+                  <w:i/>
+                </w:rPr>
+              </m:ctrlPr>
+            </m:dPr>
+            <m:e>
+              <m:sSup>
+                <m:sSupPr>
+                  <m:ctrlPr>
+                    <w:rPr>
+                      <w:rFonts w:ascii="Cambria Math" w:hAnsi="Cambria Math"/>
+                      <w:i/>
+                    </w:rPr>
+                  </m:ctrlPr>
+                </m:sSupPr>
+                <m:e>
+                  <m:r>
+                    <w:rPr>
+                      <w:rFonts w:ascii="Cambria Math" w:hAnsi="Cambria Math"/>
+                    </w:rPr>
+                    <m:t>n</m:t>
+                  </m:r>
+                </m:e>
+                <m:sup>
+                  <m:d>
+                    <m:dPr>
+                      <m:ctrlPr>
+                        <w:rPr>
+                          <w:rFonts w:ascii="Cambria Math" w:hAnsi="Cambria Math"/>
+                          <w:i/>
+                        </w:rPr>
+                      </m:ctrlPr>
+                    </m:dPr>
+                    <m:e>
+                      <m:r>
+                        <w:rPr>
+                          <w:rFonts w:ascii="Cambria Math" w:hAnsi="Cambria Math"/>
+                        </w:rPr>
+                        <m:t>lo</m:t>
+                      </m:r>
+                      <m:sSub>
+                        <m:sSubPr>
+                          <m:ctrlPr>
+                            <w:rPr>
+                              <w:rFonts w:ascii="Cambria Math" w:hAnsi="Cambria Math"/>
+                              <w:i/>
+                            </w:rPr>
+                          </m:ctrlPr>
+                        </m:sSubPr>
+                        <m:e>
+                          <m:r>
+                            <w:rPr>
+                              <w:rFonts w:ascii="Cambria Math" w:hAnsi="Cambria Math"/>
+                            </w:rPr>
+                            <m:t>g</m:t>
+                          </m:r>
+                        </m:e>
+                        <m:sub>
+                          <m:d>
+                            <m:dPr>
+                              <m:ctrlPr>
+                                <w:rPr>
+                                  <w:rFonts w:ascii="Cambria Math" w:hAnsi="Cambria Math"/>
+                                  <w:i/>
+                                </w:rPr>
+                              </m:ctrlPr>
+                            </m:dPr>
+                            <m:e>
+                              <m:r>
+                                <w:rPr>
+                                  <w:rFonts w:ascii="Cambria Math" w:hAnsi="Cambria Math"/>
+                                </w:rPr>
+                                <m:t>10</m:t>
+                              </m:r>
+                              <m:r>
+                                <m:rPr>
+                                  <m:lit/>
+                                </m:rPr>
+                                <w:rPr>
+                                  <w:rFonts w:ascii="Cambria Math" w:hAnsi="Cambria Math"/>
+                                </w:rPr>
+                                <m:t>/</m:t>
+                              </m:r>
+                              <m:r>
+                                <w:rPr>
+                                  <w:rFonts w:ascii="Cambria Math" w:hAnsi="Cambria Math"/>
+                                </w:rPr>
+                                <m:t>7</m:t>
+                              </m:r>
+                            </m:e>
+                          </m:d>
+                        </m:sub>
+                      </m:sSub>
+                      <m:d>
+                        <m:dPr>
+                          <m:ctrlPr>
+                            <w:rPr>
+                              <w:rFonts w:ascii="Cambria Math" w:hAnsi="Cambria Math"/>
+                              <w:i/>
+                            </w:rPr>
+                          </m:ctrlPr>
+                        </m:dPr>
+                        <m:e>
+                          <m:r>
+                            <w:rPr>
+                              <w:rFonts w:ascii="Cambria Math" w:hAnsi="Cambria Math"/>
+                            </w:rPr>
+                            <m:t>2</m:t>
+                          </m:r>
+                        </m:e>
+                      </m:d>
+                    </m:e>
+                  </m:d>
+                </m:sup>
+              </m:sSup>
+            </m:e>
+          </m:d>
+        </m:oMath>
+      </m:oMathPara>
+    </w:p>
+    <w:p>
+      <w:pPr>
+        <w:rPr>
+          <w:rFonts w:eastAsiaTheme="minorEastAsia"/>
+          <w:lang w:val="en-US"/>
+        </w:rPr>
+      </w:pPr>
+      <m:oMathPara>
+        <m:oMath>
+          <m:r>
+            <w:rPr>
+              <w:rFonts w:ascii="Cambria Math" w:hAnsi="Cambria Math"/>
+            </w:rPr>
+            <m:t>T</m:t>
+          </m:r>
+          <m:d>
+            <m:dPr>
+              <m:ctrlPr>
+                <w:rPr>
+                  <w:rFonts w:ascii="Cambria Math" w:hAnsi="Cambria Math"/>
+                  <w:i/>
+                </w:rPr>
+              </m:ctrlPr>
+            </m:dPr>
+            <m:e>
+              <m:r>
+                <w:rPr>
+                  <w:rFonts w:ascii="Cambria Math" w:hAnsi="Cambria Math"/>
+                </w:rPr>
+                <m:t>n</m:t>
+              </m:r>
+            </m:e>
+          </m:d>
+          <m:r>
+            <w:rPr>
+              <w:rFonts w:ascii="Cambria Math" w:hAnsi="Cambria Math"/>
+            </w:rPr>
+            <m:t>=Θ</m:t>
+          </m:r>
+          <m:d>
+            <m:dPr>
+              <m:ctrlPr>
+                <w:rPr>
+                  <w:rFonts w:ascii="Cambria Math" w:hAnsi="Cambria Math"/>
+                  <w:i/>
+                </w:rPr>
+              </m:ctrlPr>
+            </m:dPr>
+            <m:e>
+              <m:sSup>
+                <m:sSupPr>
+                  <m:ctrlPr>
+                    <w:rPr>
+                      <w:rFonts w:ascii="Cambria Math" w:hAnsi="Cambria Math"/>
+                      <w:i/>
+                    </w:rPr>
+                  </m:ctrlPr>
+                </m:sSupPr>
+                <m:e>
+                  <m:r>
+                    <w:rPr>
+                      <w:rFonts w:ascii="Cambria Math" w:hAnsi="Cambria Math"/>
+                    </w:rPr>
+                    <m:t>n</m:t>
+                  </m:r>
+                </m:e>
+                <m:sup>
+                  <m:r>
+                    <w:rPr>
+                      <w:rFonts w:ascii="Cambria Math" w:hAnsi="Cambria Math"/>
+                    </w:rPr>
+                    <m:t>2.</m:t>
+                  </m:r>
+                  <m:r>
+                    <w:rPr>
+                      <w:rFonts w:ascii="Cambria Math" w:hAnsi="Cambria Math"/>
+                    </w:rPr>
+                    <m:t>0600</m:t>
+                  </m:r>
+                </m:sup>
+              </m:sSup>
+            </m:e>
+          </m:d>
+        </m:oMath>
+      </m:oMathPara>
     </w:p>
     <w:p>
       <w:pPr>
@@ -1529,16 +3155,927 @@
           <w:ilvl w:val="0"/>
           <w:numId w:val="3"/>
         </w:numPr>
-      </w:pPr>
-      <w:r>
+        <w:rPr>
+          <w:b/>
+          <w:bCs/>
+        </w:rPr>
+      </w:pPr>
+      <w:r>
+        <w:rPr>
+          <w:b/>
+          <w:bCs/>
+        </w:rPr>
         <w:t>T(n) = 16T(n/4) + n</w:t>
       </w:r>
       <w:r>
         <w:rPr>
+          <w:b/>
+          <w:bCs/>
           <w:vertAlign w:val="superscript"/>
         </w:rPr>
         <w:t>2</w:t>
       </w:r>
+    </w:p>
+    <w:p>
+      <w:pPr>
+        <w:rPr>
+          <w:b/>
+          <w:bCs/>
+        </w:rPr>
+      </w:pPr>
+    </w:p>
+    <w:p>
+      <w:pPr>
+        <w:rPr>
+          <w:rFonts w:ascii="Cambria Math" w:hAnsi="Cambria Math"/>
+          <w:oMath/>
+        </w:rPr>
+      </w:pPr>
+      <m:oMathPara>
+        <m:oMath>
+          <m:r>
+            <w:rPr>
+              <w:rFonts w:ascii="Cambria Math" w:hAnsi="Cambria Math"/>
+            </w:rPr>
+            <m:t>a=16</m:t>
+          </m:r>
+          <m:r>
+            <w:rPr>
+              <w:rFonts w:ascii="Cambria Math" w:hAnsi="Cambria Math"/>
+            </w:rPr>
+            <m:t xml:space="preserve">, </m:t>
+          </m:r>
+          <m:r>
+            <w:rPr>
+              <w:rFonts w:ascii="Cambria Math" w:hAnsi="Cambria Math"/>
+            </w:rPr>
+            <m:t>b=4</m:t>
+          </m:r>
+          <m:r>
+            <w:rPr>
+              <w:rFonts w:ascii="Cambria Math" w:hAnsi="Cambria Math"/>
+            </w:rPr>
+            <m:t xml:space="preserve">, </m:t>
+          </m:r>
+          <m:r>
+            <w:rPr>
+              <w:rFonts w:ascii="Cambria Math" w:hAnsi="Cambria Math"/>
+            </w:rPr>
+            <m:t>f</m:t>
+          </m:r>
+          <m:d>
+            <m:dPr>
+              <m:ctrlPr>
+                <w:rPr>
+                  <w:rFonts w:ascii="Cambria Math" w:hAnsi="Cambria Math"/>
+                  <w:i/>
+                </w:rPr>
+              </m:ctrlPr>
+            </m:dPr>
+            <m:e>
+              <m:r>
+                <w:rPr>
+                  <w:rFonts w:ascii="Cambria Math" w:hAnsi="Cambria Math"/>
+                </w:rPr>
+                <m:t>n</m:t>
+              </m:r>
+            </m:e>
+          </m:d>
+          <m:r>
+            <w:rPr>
+              <w:rFonts w:ascii="Cambria Math" w:hAnsi="Cambria Math"/>
+            </w:rPr>
+            <m:t>=</m:t>
+          </m:r>
+          <m:sSup>
+            <m:sSupPr>
+              <m:ctrlPr>
+                <w:rPr>
+                  <w:rFonts w:ascii="Cambria Math" w:hAnsi="Cambria Math"/>
+                  <w:i/>
+                </w:rPr>
+              </m:ctrlPr>
+            </m:sSupPr>
+            <m:e>
+              <m:r>
+                <w:rPr>
+                  <w:rFonts w:ascii="Cambria Math" w:hAnsi="Cambria Math"/>
+                </w:rPr>
+                <m:t>n</m:t>
+              </m:r>
+            </m:e>
+            <m:sup>
+              <m:r>
+                <w:rPr>
+                  <w:rFonts w:ascii="Cambria Math" w:hAnsi="Cambria Math"/>
+                </w:rPr>
+                <m:t>2</m:t>
+              </m:r>
+            </m:sup>
+          </m:sSup>
+        </m:oMath>
+      </m:oMathPara>
+    </w:p>
+    <w:p>
+      <w:pPr>
+        <w:rPr>
+          <w:rFonts w:ascii="Cambria Math" w:hAnsi="Cambria Math"/>
+          <w:oMath/>
+        </w:rPr>
+      </w:pPr>
+      <m:oMathPara>
+        <m:oMath>
+          <m:r>
+            <w:rPr>
+              <w:rFonts w:ascii="Cambria Math" w:hAnsi="Cambria Math"/>
+            </w:rPr>
+            <m:t>lo</m:t>
+          </m:r>
+          <m:sSub>
+            <m:sSubPr>
+              <m:ctrlPr>
+                <w:rPr>
+                  <w:rFonts w:ascii="Cambria Math" w:hAnsi="Cambria Math"/>
+                  <w:i/>
+                </w:rPr>
+              </m:ctrlPr>
+            </m:sSubPr>
+            <m:e>
+              <m:r>
+                <w:rPr>
+                  <w:rFonts w:ascii="Cambria Math" w:hAnsi="Cambria Math"/>
+                </w:rPr>
+                <m:t>g</m:t>
+              </m:r>
+            </m:e>
+            <m:sub>
+              <m:r>
+                <w:rPr>
+                  <w:rFonts w:ascii="Cambria Math" w:hAnsi="Cambria Math"/>
+                </w:rPr>
+                <m:t>4</m:t>
+              </m:r>
+            </m:sub>
+          </m:sSub>
+          <m:d>
+            <m:dPr>
+              <m:ctrlPr>
+                <w:rPr>
+                  <w:rFonts w:ascii="Cambria Math" w:hAnsi="Cambria Math"/>
+                  <w:i/>
+                </w:rPr>
+              </m:ctrlPr>
+            </m:dPr>
+            <m:e>
+              <m:r>
+                <w:rPr>
+                  <w:rFonts w:ascii="Cambria Math" w:hAnsi="Cambria Math"/>
+                </w:rPr>
+                <m:t>16</m:t>
+              </m:r>
+            </m:e>
+          </m:d>
+          <m:r>
+            <w:rPr>
+              <w:rFonts w:ascii="Cambria Math" w:hAnsi="Cambria Math"/>
+            </w:rPr>
+            <m:t>=2</m:t>
+          </m:r>
+        </m:oMath>
+      </m:oMathPara>
+    </w:p>
+    <w:p>
+      <w:pPr>
+        <w:rPr>
+          <w:rFonts w:ascii="Cambria Math" w:hAnsi="Cambria Math"/>
+          <w:oMath/>
+        </w:rPr>
+      </w:pPr>
+      <m:oMathPara>
+        <m:oMath>
+          <m:sSup>
+            <m:sSupPr>
+              <m:ctrlPr>
+                <w:rPr>
+                  <w:rFonts w:ascii="Cambria Math" w:hAnsi="Cambria Math"/>
+                  <w:i/>
+                </w:rPr>
+              </m:ctrlPr>
+            </m:sSupPr>
+            <m:e>
+              <m:r>
+                <w:rPr>
+                  <w:rFonts w:ascii="Cambria Math" w:hAnsi="Cambria Math"/>
+                </w:rPr>
+                <m:t>n</m:t>
+              </m:r>
+            </m:e>
+            <m:sup>
+              <m:d>
+                <m:dPr>
+                  <m:ctrlPr>
+                    <w:rPr>
+                      <w:rFonts w:ascii="Cambria Math" w:hAnsi="Cambria Math"/>
+                      <w:i/>
+                    </w:rPr>
+                  </m:ctrlPr>
+                </m:dPr>
+                <m:e>
+                  <m:r>
+                    <w:rPr>
+                      <w:rFonts w:ascii="Cambria Math" w:hAnsi="Cambria Math"/>
+                    </w:rPr>
+                    <m:t>lo</m:t>
+                  </m:r>
+                  <m:sSub>
+                    <m:sSubPr>
+                      <m:ctrlPr>
+                        <w:rPr>
+                          <w:rFonts w:ascii="Cambria Math" w:hAnsi="Cambria Math"/>
+                          <w:i/>
+                        </w:rPr>
+                      </m:ctrlPr>
+                    </m:sSubPr>
+                    <m:e>
+                      <m:r>
+                        <w:rPr>
+                          <w:rFonts w:ascii="Cambria Math" w:hAnsi="Cambria Math"/>
+                        </w:rPr>
+                        <m:t>g</m:t>
+                      </m:r>
+                    </m:e>
+                    <m:sub>
+                      <m:r>
+                        <w:rPr>
+                          <w:rFonts w:ascii="Cambria Math" w:hAnsi="Cambria Math"/>
+                        </w:rPr>
+                        <m:t>4</m:t>
+                      </m:r>
+                    </m:sub>
+                  </m:sSub>
+                  <m:d>
+                    <m:dPr>
+                      <m:ctrlPr>
+                        <w:rPr>
+                          <w:rFonts w:ascii="Cambria Math" w:hAnsi="Cambria Math"/>
+                          <w:i/>
+                        </w:rPr>
+                      </m:ctrlPr>
+                    </m:dPr>
+                    <m:e>
+                      <m:r>
+                        <w:rPr>
+                          <w:rFonts w:ascii="Cambria Math" w:hAnsi="Cambria Math"/>
+                        </w:rPr>
+                        <m:t>16</m:t>
+                      </m:r>
+                    </m:e>
+                  </m:d>
+                </m:e>
+              </m:d>
+            </m:sup>
+          </m:sSup>
+          <m:r>
+            <w:rPr>
+              <w:rFonts w:ascii="Cambria Math" w:hAnsi="Cambria Math"/>
+            </w:rPr>
+            <m:t>=</m:t>
+          </m:r>
+          <m:sSup>
+            <m:sSupPr>
+              <m:ctrlPr>
+                <w:rPr>
+                  <w:rFonts w:ascii="Cambria Math" w:hAnsi="Cambria Math"/>
+                  <w:i/>
+                </w:rPr>
+              </m:ctrlPr>
+            </m:sSupPr>
+            <m:e>
+              <m:r>
+                <w:rPr>
+                  <w:rFonts w:ascii="Cambria Math" w:hAnsi="Cambria Math"/>
+                </w:rPr>
+                <m:t>n</m:t>
+              </m:r>
+            </m:e>
+            <m:sup>
+              <m:r>
+                <w:rPr>
+                  <w:rFonts w:ascii="Cambria Math" w:hAnsi="Cambria Math"/>
+                </w:rPr>
+                <m:t>2</m:t>
+              </m:r>
+            </m:sup>
+          </m:sSup>
+        </m:oMath>
+      </m:oMathPara>
+    </w:p>
+    <w:p>
+      <w:pPr>
+        <w:rPr>
+          <w:rFonts w:ascii="Cambria Math" w:hAnsi="Cambria Math"/>
+          <w:oMath/>
+        </w:rPr>
+      </w:pPr>
+      <m:oMathPara>
+        <m:oMath>
+          <m:r>
+            <w:rPr>
+              <w:rFonts w:ascii="Cambria Math" w:hAnsi="Cambria Math"/>
+            </w:rPr>
+            <m:t>f</m:t>
+          </m:r>
+          <m:d>
+            <m:dPr>
+              <m:ctrlPr>
+                <w:rPr>
+                  <w:rFonts w:ascii="Cambria Math" w:hAnsi="Cambria Math"/>
+                  <w:i/>
+                </w:rPr>
+              </m:ctrlPr>
+            </m:dPr>
+            <m:e>
+              <m:r>
+                <w:rPr>
+                  <w:rFonts w:ascii="Cambria Math" w:hAnsi="Cambria Math"/>
+                </w:rPr>
+                <m:t>n</m:t>
+              </m:r>
+            </m:e>
+          </m:d>
+          <m:r>
+            <w:rPr>
+              <w:rFonts w:ascii="Cambria Math" w:hAnsi="Cambria Math"/>
+            </w:rPr>
+            <m:t>=Θ</m:t>
+          </m:r>
+          <m:d>
+            <m:dPr>
+              <m:ctrlPr>
+                <w:rPr>
+                  <w:rFonts w:ascii="Cambria Math" w:hAnsi="Cambria Math"/>
+                  <w:i/>
+                </w:rPr>
+              </m:ctrlPr>
+            </m:dPr>
+            <m:e>
+              <m:sSup>
+                <m:sSupPr>
+                  <m:ctrlPr>
+                    <w:rPr>
+                      <w:rFonts w:ascii="Cambria Math" w:hAnsi="Cambria Math"/>
+                      <w:i/>
+                    </w:rPr>
+                  </m:ctrlPr>
+                </m:sSupPr>
+                <m:e>
+                  <m:r>
+                    <w:rPr>
+                      <w:rFonts w:ascii="Cambria Math" w:hAnsi="Cambria Math"/>
+                    </w:rPr>
+                    <m:t>n</m:t>
+                  </m:r>
+                </m:e>
+                <m:sup>
+                  <m:d>
+                    <m:dPr>
+                      <m:ctrlPr>
+                        <w:rPr>
+                          <w:rFonts w:ascii="Cambria Math" w:hAnsi="Cambria Math"/>
+                          <w:i/>
+                        </w:rPr>
+                      </m:ctrlPr>
+                    </m:dPr>
+                    <m:e>
+                      <m:r>
+                        <w:rPr>
+                          <w:rFonts w:ascii="Cambria Math" w:hAnsi="Cambria Math"/>
+                        </w:rPr>
+                        <m:t>lo</m:t>
+                      </m:r>
+                      <m:sSub>
+                        <m:sSubPr>
+                          <m:ctrlPr>
+                            <w:rPr>
+                              <w:rFonts w:ascii="Cambria Math" w:hAnsi="Cambria Math"/>
+                              <w:i/>
+                            </w:rPr>
+                          </m:ctrlPr>
+                        </m:sSubPr>
+                        <m:e>
+                          <m:r>
+                            <w:rPr>
+                              <w:rFonts w:ascii="Cambria Math" w:hAnsi="Cambria Math"/>
+                            </w:rPr>
+                            <m:t>g</m:t>
+                          </m:r>
+                        </m:e>
+                        <m:sub>
+                          <m:r>
+                            <w:rPr>
+                              <w:rFonts w:ascii="Cambria Math" w:hAnsi="Cambria Math"/>
+                            </w:rPr>
+                            <m:t>4</m:t>
+                          </m:r>
+                        </m:sub>
+                      </m:sSub>
+                      <m:d>
+                        <m:dPr>
+                          <m:ctrlPr>
+                            <w:rPr>
+                              <w:rFonts w:ascii="Cambria Math" w:hAnsi="Cambria Math"/>
+                              <w:i/>
+                            </w:rPr>
+                          </m:ctrlPr>
+                        </m:dPr>
+                        <m:e>
+                          <m:r>
+                            <w:rPr>
+                              <w:rFonts w:ascii="Cambria Math" w:hAnsi="Cambria Math"/>
+                            </w:rPr>
+                            <m:t>16</m:t>
+                          </m:r>
+                        </m:e>
+                      </m:d>
+                    </m:e>
+                  </m:d>
+                </m:sup>
+              </m:sSup>
+            </m:e>
+          </m:d>
+        </m:oMath>
+      </m:oMathPara>
+    </w:p>
+    <w:p>
+      <w:pPr>
+        <w:rPr>
+          <w:rFonts w:ascii="Cambria Math" w:hAnsi="Cambria Math"/>
+          <w:oMath/>
+        </w:rPr>
+      </w:pPr>
+      <m:oMathPara>
+        <m:oMath>
+          <m:r>
+            <w:rPr>
+              <w:rFonts w:ascii="Cambria Math" w:hAnsi="Cambria Math"/>
+            </w:rPr>
+            <m:t>f</m:t>
+          </m:r>
+          <m:d>
+            <m:dPr>
+              <m:ctrlPr>
+                <w:rPr>
+                  <w:rFonts w:ascii="Cambria Math" w:hAnsi="Cambria Math"/>
+                  <w:i/>
+                </w:rPr>
+              </m:ctrlPr>
+            </m:dPr>
+            <m:e>
+              <m:r>
+                <w:rPr>
+                  <w:rFonts w:ascii="Cambria Math" w:hAnsi="Cambria Math"/>
+                </w:rPr>
+                <m:t>n</m:t>
+              </m:r>
+            </m:e>
+          </m:d>
+          <m:r>
+            <w:rPr>
+              <w:rFonts w:ascii="Cambria Math" w:hAnsi="Cambria Math"/>
+            </w:rPr>
+            <m:t>=Θ</m:t>
+          </m:r>
+          <m:d>
+            <m:dPr>
+              <m:ctrlPr>
+                <w:rPr>
+                  <w:rFonts w:ascii="Cambria Math" w:hAnsi="Cambria Math"/>
+                  <w:i/>
+                </w:rPr>
+              </m:ctrlPr>
+            </m:dPr>
+            <m:e>
+              <m:sSup>
+                <m:sSupPr>
+                  <m:ctrlPr>
+                    <w:rPr>
+                      <w:rFonts w:ascii="Cambria Math" w:hAnsi="Cambria Math"/>
+                      <w:i/>
+                    </w:rPr>
+                  </m:ctrlPr>
+                </m:sSupPr>
+                <m:e>
+                  <m:r>
+                    <w:rPr>
+                      <w:rFonts w:ascii="Cambria Math" w:hAnsi="Cambria Math"/>
+                    </w:rPr>
+                    <m:t>n</m:t>
+                  </m:r>
+                </m:e>
+                <m:sup>
+                  <m:r>
+                    <w:rPr>
+                      <w:rFonts w:ascii="Cambria Math" w:hAnsi="Cambria Math"/>
+                    </w:rPr>
+                    <m:t>2</m:t>
+                  </m:r>
+                </m:sup>
+              </m:sSup>
+            </m:e>
+          </m:d>
+        </m:oMath>
+      </m:oMathPara>
+    </w:p>
+    <w:p>
+      <w:pPr>
+        <w:rPr>
+          <w:rFonts w:ascii="Cambria Math" w:hAnsi="Cambria Math"/>
+          <w:oMath/>
+        </w:rPr>
+      </w:pPr>
+      <w:r>
+        <w:rPr>
+          <w:rFonts w:eastAsiaTheme="minorEastAsia"/>
+        </w:rPr>
+        <w:t>Por</w:t>
+      </w:r>
+      <w:r>
+        <w:rPr>
+          <w:rFonts w:eastAsiaTheme="minorEastAsia"/>
+        </w:rPr>
+        <w:t xml:space="preserve"> </w:t>
+      </w:r>
+      <w:r>
+        <w:rPr>
+          <w:rFonts w:eastAsiaTheme="minorEastAsia"/>
+        </w:rPr>
+        <w:t>lo</w:t>
+      </w:r>
+      <w:r>
+        <w:rPr>
+          <w:rFonts w:eastAsiaTheme="minorEastAsia"/>
+        </w:rPr>
+        <w:t xml:space="preserve"> </w:t>
+      </w:r>
+      <w:r>
+        <w:rPr>
+          <w:rFonts w:eastAsiaTheme="minorEastAsia"/>
+        </w:rPr>
+        <w:t>tanto</w:t>
+      </w:r>
+      <w:r>
+        <w:rPr>
+          <w:rFonts w:eastAsiaTheme="minorEastAsia"/>
+        </w:rPr>
+        <w:t>,</w:t>
+      </w:r>
+      <w:r>
+        <w:rPr>
+          <w:rFonts w:eastAsiaTheme="minorEastAsia"/>
+        </w:rPr>
+        <w:t xml:space="preserve"> </w:t>
+      </w:r>
+      <w:r>
+        <w:rPr>
+          <w:rFonts w:eastAsiaTheme="minorEastAsia"/>
+        </w:rPr>
+        <w:t>se cumple</w:t>
+      </w:r>
+      <w:r>
+        <w:rPr>
+          <w:rFonts w:eastAsiaTheme="minorEastAsia"/>
+        </w:rPr>
+        <w:t xml:space="preserve"> </w:t>
+      </w:r>
+      <w:r>
+        <w:rPr>
+          <w:rFonts w:eastAsiaTheme="minorEastAsia"/>
+        </w:rPr>
+        <w:t>la condición del caso 2 del Teorema Maestro.</w:t>
+      </w:r>
+    </w:p>
+    <w:p>
+      <w:pPr>
+        <w:rPr>
+          <w:rFonts w:ascii="Cambria Math" w:hAnsi="Cambria Math"/>
+          <w:oMath/>
+        </w:rPr>
+      </w:pPr>
+      <m:oMathPara>
+        <m:oMath>
+          <m:r>
+            <w:rPr>
+              <w:rFonts w:ascii="Cambria Math" w:hAnsi="Cambria Math"/>
+            </w:rPr>
+            <m:t>T</m:t>
+          </m:r>
+          <m:d>
+            <m:dPr>
+              <m:ctrlPr>
+                <w:rPr>
+                  <w:rFonts w:ascii="Cambria Math" w:hAnsi="Cambria Math"/>
+                  <w:i/>
+                </w:rPr>
+              </m:ctrlPr>
+            </m:dPr>
+            <m:e>
+              <m:r>
+                <w:rPr>
+                  <w:rFonts w:ascii="Cambria Math" w:hAnsi="Cambria Math"/>
+                </w:rPr>
+                <m:t>n</m:t>
+              </m:r>
+            </m:e>
+          </m:d>
+          <m:r>
+            <w:rPr>
+              <w:rFonts w:ascii="Cambria Math" w:hAnsi="Cambria Math"/>
+            </w:rPr>
+            <m:t>=Θ</m:t>
+          </m:r>
+          <m:d>
+            <m:dPr>
+              <m:ctrlPr>
+                <w:rPr>
+                  <w:rFonts w:ascii="Cambria Math" w:hAnsi="Cambria Math"/>
+                  <w:i/>
+                </w:rPr>
+              </m:ctrlPr>
+            </m:dPr>
+            <m:e>
+              <m:sSup>
+                <m:sSupPr>
+                  <m:ctrlPr>
+                    <w:rPr>
+                      <w:rFonts w:ascii="Cambria Math" w:hAnsi="Cambria Math"/>
+                      <w:i/>
+                    </w:rPr>
+                  </m:ctrlPr>
+                </m:sSupPr>
+                <m:e>
+                  <m:r>
+                    <w:rPr>
+                      <w:rFonts w:ascii="Cambria Math" w:hAnsi="Cambria Math"/>
+                    </w:rPr>
+                    <m:t>n</m:t>
+                  </m:r>
+                </m:e>
+                <m:sup>
+                  <m:d>
+                    <m:dPr>
+                      <m:ctrlPr>
+                        <w:rPr>
+                          <w:rFonts w:ascii="Cambria Math" w:hAnsi="Cambria Math"/>
+                          <w:i/>
+                        </w:rPr>
+                      </m:ctrlPr>
+                    </m:dPr>
+                    <m:e>
+                      <m:r>
+                        <w:rPr>
+                          <w:rFonts w:ascii="Cambria Math" w:hAnsi="Cambria Math"/>
+                        </w:rPr>
+                        <m:t>lo</m:t>
+                      </m:r>
+                      <m:sSub>
+                        <m:sSubPr>
+                          <m:ctrlPr>
+                            <w:rPr>
+                              <w:rFonts w:ascii="Cambria Math" w:hAnsi="Cambria Math"/>
+                              <w:i/>
+                            </w:rPr>
+                          </m:ctrlPr>
+                        </m:sSubPr>
+                        <m:e>
+                          <m:r>
+                            <w:rPr>
+                              <w:rFonts w:ascii="Cambria Math" w:hAnsi="Cambria Math"/>
+                            </w:rPr>
+                            <m:t>g</m:t>
+                          </m:r>
+                        </m:e>
+                        <m:sub>
+                          <m:r>
+                            <w:rPr>
+                              <w:rFonts w:ascii="Cambria Math" w:hAnsi="Cambria Math"/>
+                            </w:rPr>
+                            <m:t>4</m:t>
+                          </m:r>
+                        </m:sub>
+                      </m:sSub>
+                      <m:d>
+                        <m:dPr>
+                          <m:ctrlPr>
+                            <w:rPr>
+                              <w:rFonts w:ascii="Cambria Math" w:hAnsi="Cambria Math"/>
+                              <w:i/>
+                            </w:rPr>
+                          </m:ctrlPr>
+                        </m:dPr>
+                        <m:e>
+                          <m:r>
+                            <w:rPr>
+                              <w:rFonts w:ascii="Cambria Math" w:hAnsi="Cambria Math"/>
+                            </w:rPr>
+                            <m:t>16</m:t>
+                          </m:r>
+                        </m:e>
+                      </m:d>
+                    </m:e>
+                  </m:d>
+                </m:sup>
+              </m:sSup>
+              <m:r>
+                <w:rPr>
+                  <w:rFonts w:ascii="Cambria Math" w:hAnsi="Cambria Math"/>
+                </w:rPr>
+                <m:t>logn</m:t>
+              </m:r>
+            </m:e>
+          </m:d>
+        </m:oMath>
+      </m:oMathPara>
+    </w:p>
+    <w:p>
+      <w:pPr>
+        <w:rPr>
+          <w:rFonts w:ascii="Cambria Math" w:hAnsi="Cambria Math"/>
+          <w:oMath/>
+        </w:rPr>
+      </w:pPr>
+      <m:oMathPara>
+        <m:oMath>
+          <m:r>
+            <w:rPr>
+              <w:rFonts w:ascii="Cambria Math" w:hAnsi="Cambria Math"/>
+            </w:rPr>
+            <m:t>T</m:t>
+          </m:r>
+          <m:d>
+            <m:dPr>
+              <m:ctrlPr>
+                <w:rPr>
+                  <w:rFonts w:ascii="Cambria Math" w:hAnsi="Cambria Math"/>
+                  <w:i/>
+                </w:rPr>
+              </m:ctrlPr>
+            </m:dPr>
+            <m:e>
+              <m:r>
+                <w:rPr>
+                  <w:rFonts w:ascii="Cambria Math" w:hAnsi="Cambria Math"/>
+                </w:rPr>
+                <m:t>n</m:t>
+              </m:r>
+            </m:e>
+          </m:d>
+          <m:r>
+            <w:rPr>
+              <w:rFonts w:ascii="Cambria Math" w:hAnsi="Cambria Math"/>
+            </w:rPr>
+            <m:t>=Θ</m:t>
+          </m:r>
+          <m:d>
+            <m:dPr>
+              <m:ctrlPr>
+                <w:rPr>
+                  <w:rFonts w:ascii="Cambria Math" w:hAnsi="Cambria Math"/>
+                  <w:i/>
+                </w:rPr>
+              </m:ctrlPr>
+            </m:dPr>
+            <m:e>
+              <m:sSup>
+                <m:sSupPr>
+                  <m:ctrlPr>
+                    <w:rPr>
+                      <w:rFonts w:ascii="Cambria Math" w:hAnsi="Cambria Math"/>
+                      <w:i/>
+                    </w:rPr>
+                  </m:ctrlPr>
+                </m:sSupPr>
+                <m:e>
+                  <m:r>
+                    <w:rPr>
+                      <w:rFonts w:ascii="Cambria Math" w:hAnsi="Cambria Math"/>
+                    </w:rPr>
+                    <m:t>n</m:t>
+                  </m:r>
+                </m:e>
+                <m:sup>
+                  <m:r>
+                    <w:rPr>
+                      <w:rFonts w:ascii="Cambria Math" w:hAnsi="Cambria Math"/>
+                    </w:rPr>
+                    <m:t>2</m:t>
+                  </m:r>
+                </m:sup>
+              </m:sSup>
+              <m:r>
+                <w:rPr>
+                  <w:rFonts w:ascii="Cambria Math" w:hAnsi="Cambria Math"/>
+                </w:rPr>
+                <m:t>logn</m:t>
+              </m:r>
+            </m:e>
+          </m:d>
+        </m:oMath>
+      </m:oMathPara>
+    </w:p>
+    <w:p>
+      <w:pPr>
+        <w:rPr>
+          <w:rFonts w:ascii="Cambria Math" w:hAnsi="Cambria Math"/>
+          <w:oMath/>
+        </w:rPr>
+      </w:pPr>
+      <m:oMathPara>
+        <m:oMath>
+          <m:r>
+            <w:rPr>
+              <w:rFonts w:ascii="Cambria Math" w:hAnsi="Cambria Math"/>
+            </w:rPr>
+            <m:t>T</m:t>
+          </m:r>
+          <m:d>
+            <m:dPr>
+              <m:ctrlPr>
+                <w:rPr>
+                  <w:rFonts w:ascii="Cambria Math" w:hAnsi="Cambria Math"/>
+                  <w:i/>
+                </w:rPr>
+              </m:ctrlPr>
+            </m:dPr>
+            <m:e>
+              <m:r>
+                <w:rPr>
+                  <w:rFonts w:ascii="Cambria Math" w:hAnsi="Cambria Math"/>
+                </w:rPr>
+                <m:t>n</m:t>
+              </m:r>
+            </m:e>
+          </m:d>
+          <m:r>
+            <w:rPr>
+              <w:rFonts w:ascii="Cambria Math" w:hAnsi="Cambria Math"/>
+            </w:rPr>
+            <m:t>=Θ</m:t>
+          </m:r>
+          <m:d>
+            <m:dPr>
+              <m:ctrlPr>
+                <w:rPr>
+                  <w:rFonts w:ascii="Cambria Math" w:hAnsi="Cambria Math"/>
+                  <w:i/>
+                </w:rPr>
+              </m:ctrlPr>
+            </m:dPr>
+            <m:e>
+              <m:sSup>
+                <m:sSupPr>
+                  <m:ctrlPr>
+                    <w:rPr>
+                      <w:rFonts w:ascii="Cambria Math" w:hAnsi="Cambria Math"/>
+                      <w:i/>
+                    </w:rPr>
+                  </m:ctrlPr>
+                </m:sSupPr>
+                <m:e>
+                  <m:r>
+                    <w:rPr>
+                      <w:rFonts w:ascii="Cambria Math" w:hAnsi="Cambria Math"/>
+                    </w:rPr>
+                    <m:t>n</m:t>
+                  </m:r>
+                </m:e>
+                <m:sup>
+                  <m:r>
+                    <w:rPr>
+                      <w:rFonts w:ascii="Cambria Math" w:hAnsi="Cambria Math"/>
+                    </w:rPr>
+                    <m:t>2</m:t>
+                  </m:r>
+                </m:sup>
+              </m:sSup>
+              <m:r>
+                <w:rPr>
+                  <w:rFonts w:ascii="Cambria Math" w:hAnsi="Cambria Math"/>
+                </w:rPr>
+                <m:t>logn</m:t>
+              </m:r>
+            </m:e>
+          </m:d>
+        </m:oMath>
+      </m:oMathPara>
+    </w:p>
+    <w:p>
+      <w:pPr>
+        <w:rPr>
+          <w:b/>
+          <w:bCs/>
+          <w:vertAlign w:val="superscript"/>
+        </w:rPr>
+      </w:pPr>
     </w:p>
     <w:p>
       <w:pPr>
@@ -1546,16 +4083,311 @@
           <w:ilvl w:val="0"/>
           <w:numId w:val="4"/>
         </w:numPr>
-      </w:pPr>
-      <w:r>
+        <w:rPr>
+          <w:b/>
+          <w:bCs/>
+        </w:rPr>
+      </w:pPr>
+      <w:r>
+        <w:rPr>
+          <w:b/>
+          <w:bCs/>
+        </w:rPr>
         <w:t>T(n) = 7T(n/3) + n</w:t>
       </w:r>
       <w:r>
         <w:rPr>
+          <w:b/>
+          <w:bCs/>
           <w:vertAlign w:val="superscript"/>
         </w:rPr>
         <w:t>2</w:t>
       </w:r>
+    </w:p>
+    <w:p>
+      <w:pPr>
+        <w:rPr>
+          <w:rFonts w:ascii="Cambria Math" w:hAnsi="Cambria Math"/>
+          <w:oMath/>
+        </w:rPr>
+      </w:pPr>
+      <m:oMathPara>
+        <m:oMath>
+          <m:r>
+            <w:rPr>
+              <w:rFonts w:ascii="Cambria Math" w:hAnsi="Cambria Math"/>
+            </w:rPr>
+            <m:t>a=7</m:t>
+          </m:r>
+          <m:r>
+            <w:rPr>
+              <w:rFonts w:ascii="Cambria Math" w:hAnsi="Cambria Math"/>
+            </w:rPr>
+            <m:t xml:space="preserve">, </m:t>
+          </m:r>
+          <m:r>
+            <w:rPr>
+              <w:rFonts w:ascii="Cambria Math" w:hAnsi="Cambria Math"/>
+            </w:rPr>
+            <m:t>b=3</m:t>
+          </m:r>
+          <m:r>
+            <w:rPr>
+              <w:rFonts w:ascii="Cambria Math" w:hAnsi="Cambria Math"/>
+            </w:rPr>
+            <m:t xml:space="preserve">, </m:t>
+          </m:r>
+          <m:r>
+            <w:rPr>
+              <w:rFonts w:ascii="Cambria Math" w:hAnsi="Cambria Math"/>
+            </w:rPr>
+            <m:t>c=2</m:t>
+          </m:r>
+        </m:oMath>
+      </m:oMathPara>
+    </w:p>
+    <w:p>
+      <w:pPr>
+        <w:rPr>
+          <w:rFonts w:ascii="Cambria Math" w:hAnsi="Cambria Math"/>
+          <w:oMath/>
+        </w:rPr>
+      </w:pPr>
+      <m:oMathPara>
+        <m:oMath>
+          <m:r>
+            <w:rPr>
+              <w:rFonts w:ascii="Cambria Math" w:hAnsi="Cambria Math"/>
+            </w:rPr>
+            <m:t>lo</m:t>
+          </m:r>
+          <m:sSub>
+            <m:sSubPr>
+              <m:ctrlPr>
+                <w:rPr>
+                  <w:rFonts w:ascii="Cambria Math" w:hAnsi="Cambria Math"/>
+                  <w:i/>
+                </w:rPr>
+              </m:ctrlPr>
+            </m:sSubPr>
+            <m:e>
+              <m:r>
+                <w:rPr>
+                  <w:rFonts w:ascii="Cambria Math" w:hAnsi="Cambria Math"/>
+                </w:rPr>
+                <m:t>g</m:t>
+              </m:r>
+            </m:e>
+            <m:sub>
+              <m:r>
+                <w:rPr>
+                  <w:rFonts w:ascii="Cambria Math" w:hAnsi="Cambria Math"/>
+                </w:rPr>
+                <m:t>3</m:t>
+              </m:r>
+            </m:sub>
+          </m:sSub>
+          <m:d>
+            <m:dPr>
+              <m:ctrlPr>
+                <w:rPr>
+                  <w:rFonts w:ascii="Cambria Math" w:hAnsi="Cambria Math"/>
+                  <w:i/>
+                </w:rPr>
+              </m:ctrlPr>
+            </m:dPr>
+            <m:e>
+              <m:r>
+                <w:rPr>
+                  <w:rFonts w:ascii="Cambria Math" w:hAnsi="Cambria Math"/>
+                </w:rPr>
+                <m:t>7</m:t>
+              </m:r>
+            </m:e>
+          </m:d>
+          <m:r>
+            <w:rPr>
+              <w:rFonts w:ascii="Cambria Math" w:hAnsi="Cambria Math"/>
+            </w:rPr>
+            <m:t>≈1.7712</m:t>
+          </m:r>
+        </m:oMath>
+      </m:oMathPara>
+    </w:p>
+    <w:p>
+      <w:pPr>
+        <w:rPr>
+          <w:rFonts w:eastAsiaTheme="minorEastAsia"/>
+        </w:rPr>
+      </w:pPr>
+      <m:oMathPara>
+        <m:oMath>
+          <m:r>
+            <w:rPr>
+              <w:rFonts w:ascii="Cambria Math" w:hAnsi="Cambria Math"/>
+            </w:rPr>
+            <m:t>2&gt;1.7712</m:t>
+          </m:r>
+        </m:oMath>
+      </m:oMathPara>
+    </w:p>
+    <w:p>
+      <w:pPr>
+        <w:rPr>
+          <w:rFonts w:eastAsiaTheme="minorEastAsia"/>
+        </w:rPr>
+      </w:pPr>
+      <w:r>
+        <w:rPr>
+          <w:rFonts w:eastAsiaTheme="minorEastAsia"/>
+        </w:rPr>
+        <w:t>Entonces estamos en el caso 3:</w:t>
+      </w:r>
+    </w:p>
+    <w:p>
+      <w:pPr>
+        <w:rPr>
+          <w:rFonts w:eastAsiaTheme="minorEastAsia"/>
+        </w:rPr>
+      </w:pPr>
+      <m:oMathPara>
+        <m:oMath>
+          <m:r>
+            <w:rPr>
+              <w:rFonts w:ascii="Cambria Math" w:eastAsiaTheme="minorEastAsia" w:hAnsi="Cambria Math"/>
+            </w:rPr>
+            <m:t>T</m:t>
+          </m:r>
+          <m:d>
+            <m:dPr>
+              <m:ctrlPr>
+                <w:rPr>
+                  <w:rFonts w:ascii="Cambria Math" w:eastAsiaTheme="minorEastAsia" w:hAnsi="Cambria Math"/>
+                  <w:i/>
+                </w:rPr>
+              </m:ctrlPr>
+            </m:dPr>
+            <m:e>
+              <m:r>
+                <w:rPr>
+                  <w:rFonts w:ascii="Cambria Math" w:eastAsiaTheme="minorEastAsia" w:hAnsi="Cambria Math"/>
+                </w:rPr>
+                <m:t>n</m:t>
+              </m:r>
+            </m:e>
+          </m:d>
+          <m:r>
+            <w:rPr>
+              <w:rFonts w:ascii="Cambria Math" w:eastAsiaTheme="minorEastAsia" w:hAnsi="Cambria Math"/>
+            </w:rPr>
+            <m:t>=Θ</m:t>
+          </m:r>
+          <m:d>
+            <m:dPr>
+              <m:ctrlPr>
+                <w:rPr>
+                  <w:rFonts w:ascii="Cambria Math" w:eastAsiaTheme="minorEastAsia" w:hAnsi="Cambria Math"/>
+                  <w:i/>
+                </w:rPr>
+              </m:ctrlPr>
+            </m:dPr>
+            <m:e>
+              <m:sSup>
+                <m:sSupPr>
+                  <m:ctrlPr>
+                    <w:rPr>
+                      <w:rFonts w:ascii="Cambria Math" w:eastAsiaTheme="minorEastAsia" w:hAnsi="Cambria Math"/>
+                      <w:i/>
+                    </w:rPr>
+                  </m:ctrlPr>
+                </m:sSupPr>
+                <m:e>
+                  <m:r>
+                    <w:rPr>
+                      <w:rFonts w:ascii="Cambria Math" w:eastAsiaTheme="minorEastAsia" w:hAnsi="Cambria Math"/>
+                    </w:rPr>
+                    <m:t>n</m:t>
+                  </m:r>
+                </m:e>
+                <m:sup>
+                  <m:r>
+                    <w:rPr>
+                      <w:rFonts w:ascii="Cambria Math" w:eastAsiaTheme="minorEastAsia" w:hAnsi="Cambria Math"/>
+                    </w:rPr>
+                    <m:t>c</m:t>
+                  </m:r>
+                </m:sup>
+              </m:sSup>
+            </m:e>
+          </m:d>
+        </m:oMath>
+      </m:oMathPara>
+    </w:p>
+    <w:p>
+      <w:pPr>
+        <w:rPr>
+          <w:rFonts w:eastAsiaTheme="minorEastAsia"/>
+        </w:rPr>
+      </w:pPr>
+      <w:r>
+        <w:rPr>
+          <w:rFonts w:eastAsiaTheme="minorEastAsia"/>
+        </w:rPr>
+        <w:lastRenderedPageBreak/>
+        <w:t>Resultado</w:t>
+      </w:r>
+      <w:r>
+        <w:rPr>
+          <w:rFonts w:eastAsiaTheme="minorEastAsia"/>
+        </w:rPr>
+        <w:t xml:space="preserve">: </w:t>
+      </w:r>
+      <m:oMath>
+        <m:r>
+          <w:rPr>
+            <w:rFonts w:ascii="Cambria Math" w:eastAsiaTheme="minorEastAsia" w:hAnsi="Cambria Math"/>
+          </w:rPr>
+          <m:t>Θ</m:t>
+        </m:r>
+        <m:d>
+          <m:dPr>
+            <m:ctrlPr>
+              <w:rPr>
+                <w:rFonts w:ascii="Cambria Math" w:eastAsiaTheme="minorEastAsia" w:hAnsi="Cambria Math"/>
+                <w:i/>
+              </w:rPr>
+            </m:ctrlPr>
+          </m:dPr>
+          <m:e>
+            <m:sSup>
+              <m:sSupPr>
+                <m:ctrlPr>
+                  <w:rPr>
+                    <w:rFonts w:ascii="Cambria Math" w:eastAsiaTheme="minorEastAsia" w:hAnsi="Cambria Math"/>
+                    <w:i/>
+                  </w:rPr>
+                </m:ctrlPr>
+              </m:sSupPr>
+              <m:e>
+                <m:r>
+                  <w:rPr>
+                    <w:rFonts w:ascii="Cambria Math" w:eastAsiaTheme="minorEastAsia" w:hAnsi="Cambria Math"/>
+                  </w:rPr>
+                  <m:t>n</m:t>
+                </m:r>
+              </m:e>
+              <m:sup>
+                <m:r>
+                  <w:rPr>
+                    <w:rFonts w:ascii="Cambria Math" w:eastAsiaTheme="minorEastAsia" w:hAnsi="Cambria Math"/>
+                  </w:rPr>
+                  <m:t>2</m:t>
+                </m:r>
+              </m:sup>
+            </m:sSup>
+          </m:e>
+        </m:d>
+      </m:oMath>
     </w:p>
     <w:p>
       <w:pPr>
@@ -1563,16 +4395,441 @@
           <w:ilvl w:val="0"/>
           <w:numId w:val="5"/>
         </w:numPr>
-      </w:pPr>
-      <w:r>
+        <w:rPr>
+          <w:b/>
+          <w:bCs/>
+        </w:rPr>
+      </w:pPr>
+      <w:r>
+        <w:rPr>
+          <w:b/>
+          <w:bCs/>
+        </w:rPr>
         <w:t>T(n) = 7T(n/2) + n</w:t>
       </w:r>
       <w:r>
         <w:rPr>
+          <w:b/>
+          <w:bCs/>
           <w:vertAlign w:val="superscript"/>
         </w:rPr>
         <w:t>2</w:t>
       </w:r>
+    </w:p>
+    <w:p>
+      <w:pPr>
+        <w:rPr>
+          <w:rFonts w:ascii="Cambria Math" w:hAnsi="Cambria Math"/>
+          <w:oMath/>
+        </w:rPr>
+      </w:pPr>
+      <m:oMathPara>
+        <m:oMath>
+          <m:r>
+            <w:rPr>
+              <w:rFonts w:ascii="Cambria Math" w:hAnsi="Cambria Math"/>
+            </w:rPr>
+            <m:t>a=7</m:t>
+          </m:r>
+          <m:r>
+            <w:rPr>
+              <w:rFonts w:ascii="Cambria Math" w:hAnsi="Cambria Math"/>
+            </w:rPr>
+            <m:t xml:space="preserve">, </m:t>
+          </m:r>
+          <m:r>
+            <w:rPr>
+              <w:rFonts w:ascii="Cambria Math" w:hAnsi="Cambria Math"/>
+            </w:rPr>
+            <m:t>b=2</m:t>
+          </m:r>
+          <m:r>
+            <w:rPr>
+              <w:rFonts w:ascii="Cambria Math" w:hAnsi="Cambria Math"/>
+            </w:rPr>
+            <m:t xml:space="preserve">, </m:t>
+          </m:r>
+          <m:r>
+            <w:rPr>
+              <w:rFonts w:ascii="Cambria Math" w:hAnsi="Cambria Math"/>
+            </w:rPr>
+            <m:t>c=2</m:t>
+          </m:r>
+        </m:oMath>
+      </m:oMathPara>
+    </w:p>
+    <w:p>
+      <w:pPr>
+        <w:rPr>
+          <w:rFonts w:ascii="Cambria Math" w:hAnsi="Cambria Math"/>
+          <w:oMath/>
+        </w:rPr>
+      </w:pPr>
+      <m:oMathPara>
+        <m:oMath>
+          <m:r>
+            <w:rPr>
+              <w:rFonts w:ascii="Cambria Math" w:hAnsi="Cambria Math"/>
+            </w:rPr>
+            <m:t>lo</m:t>
+          </m:r>
+          <m:sSub>
+            <m:sSubPr>
+              <m:ctrlPr>
+                <w:rPr>
+                  <w:rFonts w:ascii="Cambria Math" w:hAnsi="Cambria Math"/>
+                  <w:i/>
+                </w:rPr>
+              </m:ctrlPr>
+            </m:sSubPr>
+            <m:e>
+              <m:r>
+                <w:rPr>
+                  <w:rFonts w:ascii="Cambria Math" w:hAnsi="Cambria Math"/>
+                </w:rPr>
+                <m:t>g</m:t>
+              </m:r>
+            </m:e>
+            <m:sub>
+              <m:r>
+                <w:rPr>
+                  <w:rFonts w:ascii="Cambria Math" w:hAnsi="Cambria Math"/>
+                </w:rPr>
+                <m:t>2</m:t>
+              </m:r>
+            </m:sub>
+          </m:sSub>
+          <m:d>
+            <m:dPr>
+              <m:ctrlPr>
+                <w:rPr>
+                  <w:rFonts w:ascii="Cambria Math" w:hAnsi="Cambria Math"/>
+                  <w:i/>
+                </w:rPr>
+              </m:ctrlPr>
+            </m:dPr>
+            <m:e>
+              <m:r>
+                <w:rPr>
+                  <w:rFonts w:ascii="Cambria Math" w:hAnsi="Cambria Math"/>
+                </w:rPr>
+                <m:t>7</m:t>
+              </m:r>
+            </m:e>
+          </m:d>
+          <m:r>
+            <w:rPr>
+              <w:rFonts w:ascii="Cambria Math" w:hAnsi="Cambria Math"/>
+            </w:rPr>
+            <m:t>≈2.8074</m:t>
+          </m:r>
+        </m:oMath>
+      </m:oMathPara>
+    </w:p>
+    <w:p>
+      <w:pPr>
+        <w:rPr>
+          <w:rFonts w:ascii="Cambria Math" w:hAnsi="Cambria Math"/>
+          <w:oMath/>
+        </w:rPr>
+      </w:pPr>
+      <m:oMathPara>
+        <m:oMath>
+          <m:r>
+            <w:rPr>
+              <w:rFonts w:ascii="Cambria Math" w:hAnsi="Cambria Math"/>
+            </w:rPr>
+            <m:t>2&lt;2.8074</m:t>
+          </m:r>
+        </m:oMath>
+      </m:oMathPara>
+    </w:p>
+    <w:p>
+      <w:r>
+        <w:t>Entonces estamos en el caso 1:</w:t>
+      </w:r>
+    </w:p>
+    <w:p>
+      <w:pPr>
+        <w:rPr>
+          <w:rFonts w:ascii="Cambria Math" w:hAnsi="Cambria Math"/>
+          <w:oMath/>
+        </w:rPr>
+      </w:pPr>
+      <m:oMathPara>
+        <m:oMath>
+          <m:r>
+            <w:rPr>
+              <w:rFonts w:ascii="Cambria Math" w:hAnsi="Cambria Math"/>
+            </w:rPr>
+            <m:t>T</m:t>
+          </m:r>
+          <m:d>
+            <m:dPr>
+              <m:ctrlPr>
+                <w:rPr>
+                  <w:rFonts w:ascii="Cambria Math" w:hAnsi="Cambria Math"/>
+                  <w:i/>
+                </w:rPr>
+              </m:ctrlPr>
+            </m:dPr>
+            <m:e>
+              <m:r>
+                <w:rPr>
+                  <w:rFonts w:ascii="Cambria Math" w:hAnsi="Cambria Math"/>
+                </w:rPr>
+                <m:t>n</m:t>
+              </m:r>
+            </m:e>
+          </m:d>
+          <m:r>
+            <w:rPr>
+              <w:rFonts w:ascii="Cambria Math" w:hAnsi="Cambria Math"/>
+            </w:rPr>
+            <m:t>=Θ</m:t>
+          </m:r>
+          <m:d>
+            <m:dPr>
+              <m:ctrlPr>
+                <w:rPr>
+                  <w:rFonts w:ascii="Cambria Math" w:hAnsi="Cambria Math"/>
+                  <w:i/>
+                </w:rPr>
+              </m:ctrlPr>
+            </m:dPr>
+            <m:e>
+              <m:sSup>
+                <m:sSupPr>
+                  <m:ctrlPr>
+                    <w:rPr>
+                      <w:rFonts w:ascii="Cambria Math" w:hAnsi="Cambria Math"/>
+                      <w:i/>
+                    </w:rPr>
+                  </m:ctrlPr>
+                </m:sSupPr>
+                <m:e>
+                  <m:r>
+                    <w:rPr>
+                      <w:rFonts w:ascii="Cambria Math" w:hAnsi="Cambria Math"/>
+                    </w:rPr>
+                    <m:t>n</m:t>
+                  </m:r>
+                </m:e>
+                <m:sup>
+                  <m:d>
+                    <m:dPr>
+                      <m:ctrlPr>
+                        <w:rPr>
+                          <w:rFonts w:ascii="Cambria Math" w:hAnsi="Cambria Math"/>
+                          <w:i/>
+                        </w:rPr>
+                      </m:ctrlPr>
+                    </m:dPr>
+                    <m:e>
+                      <m:r>
+                        <w:rPr>
+                          <w:rFonts w:ascii="Cambria Math" w:hAnsi="Cambria Math"/>
+                        </w:rPr>
+                        <m:t>lo</m:t>
+                      </m:r>
+                      <m:sSub>
+                        <m:sSubPr>
+                          <m:ctrlPr>
+                            <w:rPr>
+                              <w:rFonts w:ascii="Cambria Math" w:hAnsi="Cambria Math"/>
+                              <w:i/>
+                            </w:rPr>
+                          </m:ctrlPr>
+                        </m:sSubPr>
+                        <m:e>
+                          <m:r>
+                            <w:rPr>
+                              <w:rFonts w:ascii="Cambria Math" w:hAnsi="Cambria Math"/>
+                            </w:rPr>
+                            <m:t>g</m:t>
+                          </m:r>
+                        </m:e>
+                        <m:sub>
+                          <m:r>
+                            <w:rPr>
+                              <w:rFonts w:ascii="Cambria Math" w:hAnsi="Cambria Math"/>
+                            </w:rPr>
+                            <m:t>2</m:t>
+                          </m:r>
+                        </m:sub>
+                      </m:sSub>
+                      <m:d>
+                        <m:dPr>
+                          <m:ctrlPr>
+                            <w:rPr>
+                              <w:rFonts w:ascii="Cambria Math" w:hAnsi="Cambria Math"/>
+                              <w:i/>
+                            </w:rPr>
+                          </m:ctrlPr>
+                        </m:dPr>
+                        <m:e>
+                          <m:r>
+                            <w:rPr>
+                              <w:rFonts w:ascii="Cambria Math" w:hAnsi="Cambria Math"/>
+                            </w:rPr>
+                            <m:t>7</m:t>
+                          </m:r>
+                        </m:e>
+                      </m:d>
+                    </m:e>
+                  </m:d>
+                </m:sup>
+              </m:sSup>
+            </m:e>
+          </m:d>
+        </m:oMath>
+      </m:oMathPara>
+    </w:p>
+    <w:p>
+      <w:pPr>
+        <w:rPr>
+          <w:rFonts w:ascii="Cambria Math" w:hAnsi="Cambria Math"/>
+          <w:oMath/>
+        </w:rPr>
+      </w:pPr>
+      <m:oMathPara>
+        <m:oMath>
+          <m:r>
+            <w:rPr>
+              <w:rFonts w:ascii="Cambria Math" w:hAnsi="Cambria Math"/>
+            </w:rPr>
+            <m:t>T</m:t>
+          </m:r>
+          <m:d>
+            <m:dPr>
+              <m:ctrlPr>
+                <w:rPr>
+                  <w:rFonts w:ascii="Cambria Math" w:hAnsi="Cambria Math"/>
+                  <w:i/>
+                </w:rPr>
+              </m:ctrlPr>
+            </m:dPr>
+            <m:e>
+              <m:r>
+                <w:rPr>
+                  <w:rFonts w:ascii="Cambria Math" w:hAnsi="Cambria Math"/>
+                </w:rPr>
+                <m:t>n</m:t>
+              </m:r>
+            </m:e>
+          </m:d>
+          <m:r>
+            <w:rPr>
+              <w:rFonts w:ascii="Cambria Math" w:hAnsi="Cambria Math"/>
+            </w:rPr>
+            <m:t>=Θ</m:t>
+          </m:r>
+          <m:d>
+            <m:dPr>
+              <m:ctrlPr>
+                <w:rPr>
+                  <w:rFonts w:ascii="Cambria Math" w:hAnsi="Cambria Math"/>
+                  <w:i/>
+                </w:rPr>
+              </m:ctrlPr>
+            </m:dPr>
+            <m:e>
+              <m:sSup>
+                <m:sSupPr>
+                  <m:ctrlPr>
+                    <w:rPr>
+                      <w:rFonts w:ascii="Cambria Math" w:hAnsi="Cambria Math"/>
+                      <w:i/>
+                    </w:rPr>
+                  </m:ctrlPr>
+                </m:sSupPr>
+                <m:e>
+                  <m:r>
+                    <w:rPr>
+                      <w:rFonts w:ascii="Cambria Math" w:hAnsi="Cambria Math"/>
+                    </w:rPr>
+                    <m:t>n</m:t>
+                  </m:r>
+                </m:e>
+                <m:sup>
+                  <m:r>
+                    <w:rPr>
+                      <w:rFonts w:ascii="Cambria Math" w:hAnsi="Cambria Math"/>
+                    </w:rPr>
+                    <m:t>2.</m:t>
+                  </m:r>
+                  <m:r>
+                    <w:rPr>
+                      <w:rFonts w:ascii="Cambria Math" w:hAnsi="Cambria Math"/>
+                    </w:rPr>
+                    <m:t>8074</m:t>
+                  </m:r>
+                </m:sup>
+              </m:sSup>
+            </m:e>
+          </m:d>
+        </m:oMath>
+      </m:oMathPara>
+    </w:p>
+    <w:p>
+      <w:r>
+        <w:t>Resultado:</w:t>
+      </w:r>
+      <w:r>
+        <w:t xml:space="preserve"> </w:t>
+      </w:r>
+      <m:oMath>
+        <m:r>
+          <w:rPr>
+            <w:rFonts w:ascii="Cambria Math" w:hAnsi="Cambria Math"/>
+          </w:rPr>
+          <m:t>Θ</m:t>
+        </m:r>
+        <m:d>
+          <m:dPr>
+            <m:ctrlPr>
+              <w:rPr>
+                <w:rFonts w:ascii="Cambria Math" w:hAnsi="Cambria Math"/>
+                <w:i/>
+              </w:rPr>
+            </m:ctrlPr>
+          </m:dPr>
+          <m:e>
+            <m:sSup>
+              <m:sSupPr>
+                <m:ctrlPr>
+                  <w:rPr>
+                    <w:rFonts w:ascii="Cambria Math" w:hAnsi="Cambria Math"/>
+                    <w:i/>
+                  </w:rPr>
+                </m:ctrlPr>
+              </m:sSupPr>
+              <m:e>
+                <m:r>
+                  <w:rPr>
+                    <w:rFonts w:ascii="Cambria Math" w:hAnsi="Cambria Math"/>
+                  </w:rPr>
+                  <m:t>n</m:t>
+                </m:r>
+              </m:e>
+              <m:sup>
+                <m:r>
+                  <w:rPr>
+                    <w:rFonts w:ascii="Cambria Math" w:hAnsi="Cambria Math"/>
+                  </w:rPr>
+                  <m:t>2.</m:t>
+                </m:r>
+                <m:r>
+                  <w:rPr>
+                    <w:rFonts w:ascii="Cambria Math" w:hAnsi="Cambria Math"/>
+                  </w:rPr>
+                  <m:t>8074</m:t>
+                </m:r>
+              </m:sup>
+            </m:sSup>
+          </m:e>
+        </m:d>
+      </m:oMath>
     </w:p>
     <w:p>
       <w:pPr>
@@ -1580,11 +4837,457 @@
           <w:ilvl w:val="0"/>
           <w:numId w:val="6"/>
         </w:numPr>
-      </w:pPr>
-      <w:r>
+        <w:rPr>
+          <w:b/>
+          <w:bCs/>
+        </w:rPr>
+      </w:pPr>
+      <w:r>
+        <w:rPr>
+          <w:b/>
+          <w:bCs/>
+        </w:rPr>
         <w:t>T(n) = 2T(n/4) + √n</w:t>
       </w:r>
     </w:p>
+    <w:p>
+      <w:pPr>
+        <w:rPr>
+          <w:rFonts w:ascii="Cambria Math" w:hAnsi="Cambria Math"/>
+          <w:oMath/>
+        </w:rPr>
+      </w:pPr>
+      <m:oMathPara>
+        <m:oMath>
+          <m:r>
+            <w:rPr>
+              <w:rFonts w:ascii="Cambria Math" w:hAnsi="Cambria Math"/>
+            </w:rPr>
+            <m:t>a=2</m:t>
+          </m:r>
+          <m:r>
+            <w:rPr>
+              <w:rFonts w:ascii="Cambria Math" w:hAnsi="Cambria Math"/>
+            </w:rPr>
+            <m:t xml:space="preserve">, </m:t>
+          </m:r>
+          <m:r>
+            <w:rPr>
+              <w:rFonts w:ascii="Cambria Math" w:hAnsi="Cambria Math"/>
+            </w:rPr>
+            <m:t>b=4</m:t>
+          </m:r>
+          <m:r>
+            <w:rPr>
+              <w:rFonts w:ascii="Cambria Math" w:hAnsi="Cambria Math"/>
+            </w:rPr>
+            <m:t xml:space="preserve">, </m:t>
+          </m:r>
+          <m:r>
+            <w:rPr>
+              <w:rFonts w:ascii="Cambria Math" w:hAnsi="Cambria Math"/>
+            </w:rPr>
+            <m:t>c=1</m:t>
+          </m:r>
+          <m:r>
+            <m:rPr>
+              <m:lit/>
+            </m:rPr>
+            <w:rPr>
+              <w:rFonts w:ascii="Cambria Math" w:hAnsi="Cambria Math"/>
+            </w:rPr>
+            <m:t>/</m:t>
+          </m:r>
+          <m:r>
+            <w:rPr>
+              <w:rFonts w:ascii="Cambria Math" w:hAnsi="Cambria Math"/>
+            </w:rPr>
+            <m:t>2</m:t>
+          </m:r>
+        </m:oMath>
+      </m:oMathPara>
+    </w:p>
+    <w:p>
+      <w:pPr>
+        <w:rPr>
+          <w:rFonts w:ascii="Cambria Math" w:hAnsi="Cambria Math"/>
+          <w:oMath/>
+        </w:rPr>
+      </w:pPr>
+      <m:oMathPara>
+        <m:oMath>
+          <m:r>
+            <w:rPr>
+              <w:rFonts w:ascii="Cambria Math" w:hAnsi="Cambria Math"/>
+            </w:rPr>
+            <m:t>lo</m:t>
+          </m:r>
+          <m:sSub>
+            <m:sSubPr>
+              <m:ctrlPr>
+                <w:rPr>
+                  <w:rFonts w:ascii="Cambria Math" w:hAnsi="Cambria Math"/>
+                  <w:i/>
+                  <w:iCs/>
+                </w:rPr>
+              </m:ctrlPr>
+            </m:sSubPr>
+            <m:e>
+              <m:r>
+                <w:rPr>
+                  <w:rFonts w:ascii="Cambria Math" w:hAnsi="Cambria Math"/>
+                </w:rPr>
+                <m:t>g</m:t>
+              </m:r>
+            </m:e>
+            <m:sub>
+              <m:r>
+                <w:rPr>
+                  <w:rFonts w:ascii="Cambria Math" w:hAnsi="Cambria Math"/>
+                </w:rPr>
+                <m:t>4</m:t>
+              </m:r>
+            </m:sub>
+          </m:sSub>
+          <m:d>
+            <m:dPr>
+              <m:ctrlPr>
+                <w:rPr>
+                  <w:rFonts w:ascii="Cambria Math" w:hAnsi="Cambria Math"/>
+                  <w:i/>
+                  <w:iCs/>
+                </w:rPr>
+              </m:ctrlPr>
+            </m:dPr>
+            <m:e>
+              <m:r>
+                <w:rPr>
+                  <w:rFonts w:ascii="Cambria Math" w:hAnsi="Cambria Math"/>
+                </w:rPr>
+                <m:t>2</m:t>
+              </m:r>
+            </m:e>
+          </m:d>
+          <m:r>
+            <w:rPr>
+              <w:rFonts w:ascii="Cambria Math" w:hAnsi="Cambria Math"/>
+            </w:rPr>
+            <m:t>=1</m:t>
+          </m:r>
+          <m:r>
+            <m:rPr>
+              <m:lit/>
+            </m:rPr>
+            <w:rPr>
+              <w:rFonts w:ascii="Cambria Math" w:hAnsi="Cambria Math"/>
+            </w:rPr>
+            <m:t>/</m:t>
+          </m:r>
+          <m:r>
+            <w:rPr>
+              <w:rFonts w:ascii="Cambria Math" w:hAnsi="Cambria Math"/>
+            </w:rPr>
+            <m:t>2</m:t>
+          </m:r>
+        </m:oMath>
+      </m:oMathPara>
+    </w:p>
+    <w:p>
+      <w:r>
+        <w:t>Como:</w:t>
+      </w:r>
+    </w:p>
+    <w:p>
+      <m:oMathPara>
+        <m:oMath>
+          <m:r>
+            <w:rPr>
+              <w:rFonts w:ascii="Cambria Math" w:hAnsi="Cambria Math"/>
+            </w:rPr>
+            <m:t>c=lo</m:t>
+          </m:r>
+          <m:sSub>
+            <m:sSubPr>
+              <m:ctrlPr>
+                <w:rPr>
+                  <w:rFonts w:ascii="Cambria Math" w:hAnsi="Cambria Math"/>
+                  <w:i/>
+                  <w:iCs/>
+                </w:rPr>
+              </m:ctrlPr>
+            </m:sSubPr>
+            <m:e>
+              <m:r>
+                <w:rPr>
+                  <w:rFonts w:ascii="Cambria Math" w:hAnsi="Cambria Math"/>
+                </w:rPr>
+                <m:t>g</m:t>
+              </m:r>
+            </m:e>
+            <m:sub>
+              <m:r>
+                <w:rPr>
+                  <w:rFonts w:ascii="Cambria Math" w:hAnsi="Cambria Math"/>
+                </w:rPr>
+                <m:t>4</m:t>
+              </m:r>
+            </m:sub>
+          </m:sSub>
+          <m:d>
+            <m:dPr>
+              <m:ctrlPr>
+                <w:rPr>
+                  <w:rFonts w:ascii="Cambria Math" w:hAnsi="Cambria Math"/>
+                  <w:i/>
+                  <w:iCs/>
+                </w:rPr>
+              </m:ctrlPr>
+            </m:dPr>
+            <m:e>
+              <m:r>
+                <w:rPr>
+                  <w:rFonts w:ascii="Cambria Math" w:hAnsi="Cambria Math"/>
+                </w:rPr>
+                <m:t>2</m:t>
+              </m:r>
+            </m:e>
+          </m:d>
+        </m:oMath>
+      </m:oMathPara>
+    </w:p>
+    <w:p>
+      <w:r>
+        <w:t>estamos en el caso 2:</w:t>
+      </w:r>
+    </w:p>
+    <w:p>
+      <w:pPr>
+        <w:rPr>
+          <w:rFonts w:ascii="Cambria Math" w:hAnsi="Cambria Math"/>
+          <w:oMath/>
+        </w:rPr>
+      </w:pPr>
+      <m:oMathPara>
+        <m:oMath>
+          <m:r>
+            <w:rPr>
+              <w:rFonts w:ascii="Cambria Math" w:hAnsi="Cambria Math"/>
+            </w:rPr>
+            <m:t>T</m:t>
+          </m:r>
+          <m:d>
+            <m:dPr>
+              <m:ctrlPr>
+                <w:rPr>
+                  <w:rFonts w:ascii="Cambria Math" w:hAnsi="Cambria Math"/>
+                  <w:i/>
+                  <w:iCs/>
+                </w:rPr>
+              </m:ctrlPr>
+            </m:dPr>
+            <m:e>
+              <m:r>
+                <w:rPr>
+                  <w:rFonts w:ascii="Cambria Math" w:hAnsi="Cambria Math"/>
+                </w:rPr>
+                <m:t>n</m:t>
+              </m:r>
+            </m:e>
+          </m:d>
+          <m:r>
+            <w:rPr>
+              <w:rFonts w:ascii="Cambria Math" w:hAnsi="Cambria Math"/>
+            </w:rPr>
+            <m:t>=Θ</m:t>
+          </m:r>
+          <m:d>
+            <m:dPr>
+              <m:ctrlPr>
+                <w:rPr>
+                  <w:rFonts w:ascii="Cambria Math" w:hAnsi="Cambria Math"/>
+                  <w:i/>
+                  <w:iCs/>
+                </w:rPr>
+              </m:ctrlPr>
+            </m:dPr>
+            <m:e>
+              <m:sSup>
+                <m:sSupPr>
+                  <m:ctrlPr>
+                    <w:rPr>
+                      <w:rFonts w:ascii="Cambria Math" w:hAnsi="Cambria Math"/>
+                      <w:i/>
+                      <w:iCs/>
+                    </w:rPr>
+                  </m:ctrlPr>
+                </m:sSupPr>
+                <m:e>
+                  <m:r>
+                    <w:rPr>
+                      <w:rFonts w:ascii="Cambria Math" w:hAnsi="Cambria Math"/>
+                    </w:rPr>
+                    <m:t>n</m:t>
+                  </m:r>
+                </m:e>
+                <m:sup>
+                  <m:r>
+                    <w:rPr>
+                      <w:rFonts w:ascii="Cambria Math" w:hAnsi="Cambria Math"/>
+                    </w:rPr>
+                    <m:t>c</m:t>
+                  </m:r>
+                </m:sup>
+              </m:sSup>
+              <m:r>
+                <w:rPr>
+                  <w:rFonts w:ascii="Cambria Math" w:hAnsi="Cambria Math"/>
+                </w:rPr>
+                <m:t>logn</m:t>
+              </m:r>
+            </m:e>
+          </m:d>
+        </m:oMath>
+      </m:oMathPara>
+    </w:p>
+    <w:p>
+      <w:pPr>
+        <w:rPr>
+          <w:rFonts w:ascii="Cambria Math" w:hAnsi="Cambria Math"/>
+          <w:oMath/>
+        </w:rPr>
+      </w:pPr>
+      <m:oMathPara>
+        <m:oMath>
+          <m:r>
+            <w:rPr>
+              <w:rFonts w:ascii="Cambria Math" w:hAnsi="Cambria Math"/>
+            </w:rPr>
+            <m:t>T</m:t>
+          </m:r>
+          <m:d>
+            <m:dPr>
+              <m:ctrlPr>
+                <w:rPr>
+                  <w:rFonts w:ascii="Cambria Math" w:hAnsi="Cambria Math"/>
+                  <w:i/>
+                  <w:iCs/>
+                </w:rPr>
+              </m:ctrlPr>
+            </m:dPr>
+            <m:e>
+              <m:r>
+                <w:rPr>
+                  <w:rFonts w:ascii="Cambria Math" w:hAnsi="Cambria Math"/>
+                </w:rPr>
+                <m:t>n</m:t>
+              </m:r>
+            </m:e>
+          </m:d>
+          <m:r>
+            <w:rPr>
+              <w:rFonts w:ascii="Cambria Math" w:hAnsi="Cambria Math"/>
+            </w:rPr>
+            <m:t>=Θ</m:t>
+          </m:r>
+          <m:d>
+            <m:dPr>
+              <m:ctrlPr>
+                <w:rPr>
+                  <w:rFonts w:ascii="Cambria Math" w:hAnsi="Cambria Math"/>
+                  <w:i/>
+                  <w:iCs/>
+                </w:rPr>
+              </m:ctrlPr>
+            </m:dPr>
+            <m:e>
+              <m:rad>
+                <m:radPr>
+                  <m:degHide m:val="1"/>
+                  <m:ctrlPr>
+                    <w:rPr>
+                      <w:rFonts w:ascii="Cambria Math" w:hAnsi="Cambria Math"/>
+                      <w:i/>
+                      <w:iCs/>
+                    </w:rPr>
+                  </m:ctrlPr>
+                </m:radPr>
+                <m:deg/>
+                <m:e>
+                  <m:r>
+                    <w:rPr>
+                      <w:rFonts w:ascii="Cambria Math" w:hAnsi="Cambria Math"/>
+                    </w:rPr>
+                    <m:t>n</m:t>
+                  </m:r>
+                </m:e>
+              </m:rad>
+              <m:r>
+                <w:rPr>
+                  <w:rFonts w:ascii="Cambria Math" w:hAnsi="Cambria Math"/>
+                </w:rPr>
+                <m:t>logn</m:t>
+              </m:r>
+            </m:e>
+          </m:d>
+        </m:oMath>
+      </m:oMathPara>
+    </w:p>
+    <w:p>
+      <w:r>
+        <w:t>Resultado:</w:t>
+      </w:r>
+      <w:r>
+        <w:t xml:space="preserve"> </w:t>
+      </w:r>
+      <m:oMath>
+        <m:r>
+          <w:rPr>
+            <w:rFonts w:ascii="Cambria Math" w:hAnsi="Cambria Math"/>
+          </w:rPr>
+          <m:t>Θ</m:t>
+        </m:r>
+        <m:d>
+          <m:dPr>
+            <m:ctrlPr>
+              <w:rPr>
+                <w:rFonts w:ascii="Cambria Math" w:hAnsi="Cambria Math"/>
+                <w:i/>
+                <w:iCs/>
+              </w:rPr>
+            </m:ctrlPr>
+          </m:dPr>
+          <m:e>
+            <m:rad>
+              <m:radPr>
+                <m:degHide m:val="1"/>
+                <m:ctrlPr>
+                  <w:rPr>
+                    <w:rFonts w:ascii="Cambria Math" w:hAnsi="Cambria Math"/>
+                    <w:i/>
+                    <w:iCs/>
+                  </w:rPr>
+                </m:ctrlPr>
+              </m:radPr>
+              <m:deg/>
+              <m:e>
+                <m:r>
+                  <w:rPr>
+                    <w:rFonts w:ascii="Cambria Math" w:hAnsi="Cambria Math"/>
+                  </w:rPr>
+                  <m:t>n</m:t>
+                </m:r>
+              </m:e>
+            </m:rad>
+            <m:r>
+              <w:rPr>
+                <w:rFonts w:ascii="Cambria Math" w:hAnsi="Cambria Math"/>
+              </w:rPr>
+              <m:t>logn</m:t>
+            </m:r>
+          </m:e>
+        </m:d>
+      </m:oMath>
+    </w:p>
     <w:p/>
     <w:p>
       <w:pPr>
@@ -1594,6 +5297,10 @@
         </w:rPr>
       </w:pPr>
       <w:r>
+        <w:rPr>
+          <w:b/>
+          <w:bCs/>
+        </w:rPr>
         <w:t>A tener en cuenta:</w:t>
       </w:r>
     </w:p>
@@ -1641,25 +5348,7 @@
           <w:bCs/>
           <w:strike/>
         </w:rPr>
-        <w:t xml:space="preserve">No se puede utilizar otra Biblioteca mas </w:t>
-      </w:r>
-      <w:proofErr w:type="spellStart"/>
-      <w:r>
-        <w:rPr>
-          <w:b/>
-          <w:bCs/>
-          <w:strike/>
-        </w:rPr>
-        <w:t>alla</w:t>
-      </w:r>
-      <w:proofErr w:type="spellEnd"/>
-      <w:r>
-        <w:rPr>
-          <w:b/>
-          <w:bCs/>
-          <w:strike/>
-        </w:rPr>
-        <w:t xml:space="preserve"> de algo1.py y linkedlist.py</w:t>
+        <w:t>No se puede utilizar otra Biblioteca mas alla de algo1.py y linkedlist.py</w:t>
       </w:r>
     </w:p>
     <w:p>
@@ -1697,11 +5386,14 @@
     </w:p>
     <w:p>
       <w:pPr>
-        <w:rPr>
-          <w:b/>
-          <w:bCs/>
-        </w:rPr>
-      </w:pPr>
+        <w:ind w:left="360"/>
+        <w:rPr>
+          <w:b/>
+          <w:bCs/>
+        </w:rPr>
+      </w:pPr>
+    </w:p>
+    <w:p>
       <w:r>
         <w:rPr>
           <w:b/>
@@ -1711,13 +5403,73 @@
       </w:r>
     </w:p>
     <w:p>
-      <w:pPr>
-        <w:rPr>
-          <w:b/>
-          <w:bCs/>
-        </w:rPr>
-      </w:pPr>
-    </w:p>
+      <w:r>
+        <w:rPr>
+          <w:b/>
+          <w:bCs/>
+        </w:rPr>
+        <w:t>Mejor caso:</w:t>
+      </w:r>
+      <w:r>
+        <w:t xml:space="preserve"> Ocurre si la lista ya cumple la condición desde el principio. Sin embargo, como el algoritmo no tiene forma de saberlo antes de empezar, igual debe recorrer todos los elementos para separarlos. Tiempo: </w:t>
+      </w:r>
+      <w:r>
+        <w:rPr>
+          <w:b/>
+          <w:bCs/>
+        </w:rPr>
+        <w:t>O(n)</w:t>
+      </w:r>
+      <w:r>
+        <w:t>.</w:t>
+      </w:r>
+    </w:p>
+    <w:p/>
+    <w:p>
+      <w:r>
+        <w:rPr>
+          <w:b/>
+          <w:bCs/>
+        </w:rPr>
+        <w:t>Peor caso:</w:t>
+      </w:r>
+      <w:r>
+        <w:t xml:space="preserve"> Ocurre cuando todos los elementos son estrictamente menores o mayores al pivote (el pivote es el extremo). No realiza cálculos extra ni se traba, simplemente hace las mismas separaciones. Tiempo: </w:t>
+      </w:r>
+      <w:r>
+        <w:rPr>
+          <w:b/>
+          <w:bCs/>
+        </w:rPr>
+        <w:t>O(n)</w:t>
+      </w:r>
+      <w:r>
+        <w:t>.</w:t>
+      </w:r>
+    </w:p>
+    <w:p>
+      <w:r>
+        <w:rPr>
+          <w:b/>
+          <w:bCs/>
+        </w:rPr>
+        <w:t>Caso promedio:</w:t>
+      </w:r>
+      <w:r>
+        <w:t xml:space="preserve"> En cualquier lista desordenada al azar, el comportamiento es exactamente igual. Siempre debe recorrer la lista completa para filtrar y luego unir las partes, por lo que su comportamiento es lineal: </w:t>
+      </w:r>
+      <w:r>
+        <w:rPr>
+          <w:b/>
+          <w:bCs/>
+        </w:rPr>
+        <w:t>O(n)</w:t>
+      </w:r>
+      <w:r>
+        <w:t>.</w:t>
+      </w:r>
+    </w:p>
+    <w:p/>
     <w:p>
       <w:pPr>
         <w:rPr>
@@ -1746,23 +5498,7 @@
           <w:b/>
           <w:bCs/>
         </w:rPr>
-        <w:t xml:space="preserve">Algoritmo </w:t>
-      </w:r>
-      <w:proofErr w:type="spellStart"/>
-      <w:r>
-        <w:rPr>
-          <w:b/>
-          <w:bCs/>
-        </w:rPr>
-        <w:t>contiene_suma</w:t>
-      </w:r>
-      <w:proofErr w:type="spellEnd"/>
-      <w:r>
-        <w:rPr>
-          <w:b/>
-          <w:bCs/>
-        </w:rPr>
-        <w:t xml:space="preserve"> </w:t>
+        <w:t xml:space="preserve">Algoritmo contiene_suma </w:t>
       </w:r>
       <w:r>
         <w:rPr>
@@ -1796,21 +5532,12 @@
       <w:r>
         <w:t xml:space="preserve"> ocurre cuando los dos primeros elementos de la lista suman n. El algoritmo encuentra la solución en la primera comparación, por lo que realiza una cantidad constante de operaciones: </w:t>
       </w:r>
-      <w:proofErr w:type="gramStart"/>
-      <w:r>
-        <w:rPr>
-          <w:b/>
-          <w:bCs/>
-        </w:rPr>
-        <w:t>O(</w:t>
-      </w:r>
-      <w:proofErr w:type="gramEnd"/>
-      <w:r>
-        <w:rPr>
-          <w:b/>
-          <w:bCs/>
-        </w:rPr>
-        <w:t>1)</w:t>
+      <w:r>
+        <w:rPr>
+          <w:b/>
+          <w:bCs/>
+        </w:rPr>
+        <w:t>O(1)</w:t>
       </w:r>
       <w:r>
         <w:t xml:space="preserve">. </w:t>
@@ -1912,21 +5639,12 @@
       <w:r>
         <w:t xml:space="preserve"> ocurre cuando el complemento del primer elemento ya se encuentra en el conjunto. En ese caso, termina rápidamente: </w:t>
       </w:r>
-      <w:proofErr w:type="gramStart"/>
-      <w:r>
-        <w:rPr>
-          <w:b/>
-          <w:bCs/>
-        </w:rPr>
-        <w:t>O(</w:t>
-      </w:r>
-      <w:proofErr w:type="gramEnd"/>
-      <w:r>
-        <w:rPr>
-          <w:b/>
-          <w:bCs/>
-        </w:rPr>
-        <w:t>1)</w:t>
+      <w:r>
+        <w:rPr>
+          <w:b/>
+          <w:bCs/>
+        </w:rPr>
+        <w:t>O(1)</w:t>
       </w:r>
       <w:r>
         <w:t xml:space="preserve">. </w:t>
@@ -1989,7 +5707,7 @@
       </w:r>
     </w:p>
     <w:sectPr>
-      <w:headerReference w:type="default" r:id="rId7"/>
+      <w:headerReference w:type="default" r:id="rId8"/>
       <w:pgSz w:w="11906" w:h="16838"/>
       <w:pgMar w:top="1440" w:right="1080" w:bottom="1440" w:left="1080" w:header="708" w:footer="708" w:gutter="0"/>
       <w:cols w:space="708"/>
@@ -2414,6 +6132,119 @@
     </w:lvl>
   </w:abstractNum>
   <w:abstractNum w:abstractNumId="3" w15:restartNumberingAfterBreak="0">
+    <w:nsid w:val="43030ABE"/>
+    <w:multiLevelType w:val="multilevel"/>
+    <w:tmpl w:val="783E41A8"/>
+    <w:lvl w:ilvl="0">
+      <w:start w:val="1"/>
+      <w:numFmt w:val="decimal"/>
+      <w:lvlText w:val="%1."/>
+      <w:lvlJc w:val="left"/>
+      <w:pPr>
+        <w:tabs>
+          <w:tab w:val="num" w:pos="720"/>
+        </w:tabs>
+        <w:ind w:left="720" w:hanging="360"/>
+      </w:pPr>
+    </w:lvl>
+    <w:lvl w:ilvl="1" w:tentative="1">
+      <w:start w:val="1"/>
+      <w:numFmt w:val="decimal"/>
+      <w:lvlText w:val="%2."/>
+      <w:lvlJc w:val="left"/>
+      <w:pPr>
+        <w:tabs>
+          <w:tab w:val="num" w:pos="1440"/>
+        </w:tabs>
+        <w:ind w:left="1440" w:hanging="360"/>
+      </w:pPr>
+    </w:lvl>
+    <w:lvl w:ilvl="2" w:tentative="1">
+      <w:start w:val="1"/>
+      <w:numFmt w:val="decimal"/>
+      <w:lvlText w:val="%3."/>
+      <w:lvlJc w:val="left"/>
+      <w:pPr>
+        <w:tabs>
+          <w:tab w:val="num" w:pos="2160"/>
+        </w:tabs>
+        <w:ind w:left="2160" w:hanging="360"/>
+      </w:pPr>
+    </w:lvl>
+    <w:lvl w:ilvl="3" w:tentative="1">
+      <w:start w:val="1"/>
+      <w:numFmt w:val="decimal"/>
+      <w:lvlText w:val="%4."/>
+      <w:lvlJc w:val="left"/>
+      <w:pPr>
+        <w:tabs>
+          <w:tab w:val="num" w:pos="2880"/>
+        </w:tabs>
+        <w:ind w:left="2880" w:hanging="360"/>
+      </w:pPr>
+    </w:lvl>
+    <w:lvl w:ilvl="4" w:tentative="1">
+      <w:start w:val="1"/>
+      <w:numFmt w:val="decimal"/>
+      <w:lvlText w:val="%5."/>
+      <w:lvlJc w:val="left"/>
+      <w:pPr>
+        <w:tabs>
+          <w:tab w:val="num" w:pos="3600"/>
+        </w:tabs>
+        <w:ind w:left="3600" w:hanging="360"/>
+      </w:pPr>
+    </w:lvl>
+    <w:lvl w:ilvl="5" w:tentative="1">
+      <w:start w:val="1"/>
+      <w:numFmt w:val="decimal"/>
+      <w:lvlText w:val="%6."/>
+      <w:lvlJc w:val="left"/>
+      <w:pPr>
+        <w:tabs>
+          <w:tab w:val="num" w:pos="4320"/>
+        </w:tabs>
+        <w:ind w:left="4320" w:hanging="360"/>
+      </w:pPr>
+    </w:lvl>
+    <w:lvl w:ilvl="6" w:tentative="1">
+      <w:start w:val="1"/>
+      <w:numFmt w:val="decimal"/>
+      <w:lvlText w:val="%7."/>
+      <w:lvlJc w:val="left"/>
+      <w:pPr>
+        <w:tabs>
+          <w:tab w:val="num" w:pos="5040"/>
+        </w:tabs>
+        <w:ind w:left="5040" w:hanging="360"/>
+      </w:pPr>
+    </w:lvl>
+    <w:lvl w:ilvl="7" w:tentative="1">
+      <w:start w:val="1"/>
+      <w:numFmt w:val="decimal"/>
+      <w:lvlText w:val="%8."/>
+      <w:lvlJc w:val="left"/>
+      <w:pPr>
+        <w:tabs>
+          <w:tab w:val="num" w:pos="5760"/>
+        </w:tabs>
+        <w:ind w:left="5760" w:hanging="360"/>
+      </w:pPr>
+    </w:lvl>
+    <w:lvl w:ilvl="8" w:tentative="1">
+      <w:start w:val="1"/>
+      <w:numFmt w:val="decimal"/>
+      <w:lvlText w:val="%9."/>
+      <w:lvlJc w:val="left"/>
+      <w:pPr>
+        <w:tabs>
+          <w:tab w:val="num" w:pos="6480"/>
+        </w:tabs>
+        <w:ind w:left="6480" w:hanging="360"/>
+      </w:pPr>
+    </w:lvl>
+  </w:abstractNum>
+  <w:abstractNum w:abstractNumId="4" w15:restartNumberingAfterBreak="0">
     <w:nsid w:val="494F1050"/>
     <w:multiLevelType w:val="multilevel"/>
     <w:tmpl w:val="12A6D682"/>
@@ -2526,7 +6357,7 @@
       </w:pPr>
     </w:lvl>
   </w:abstractNum>
-  <w:abstractNum w:abstractNumId="4" w15:restartNumberingAfterBreak="0">
+  <w:abstractNum w:abstractNumId="5" w15:restartNumberingAfterBreak="0">
     <w:nsid w:val="49D8231B"/>
     <w:multiLevelType w:val="multilevel"/>
     <w:tmpl w:val="0E26347A"/>
@@ -2675,7 +6506,7 @@
       </w:rPr>
     </w:lvl>
   </w:abstractNum>
-  <w:abstractNum w:abstractNumId="5" w15:restartNumberingAfterBreak="0">
+  <w:abstractNum w:abstractNumId="6" w15:restartNumberingAfterBreak="0">
     <w:nsid w:val="4B13608B"/>
     <w:multiLevelType w:val="multilevel"/>
     <w:tmpl w:val="1DA24352"/>
@@ -2824,7 +6655,7 @@
       </w:rPr>
     </w:lvl>
   </w:abstractNum>
-  <w:abstractNum w:abstractNumId="6" w15:restartNumberingAfterBreak="0">
+  <w:abstractNum w:abstractNumId="7" w15:restartNumberingAfterBreak="0">
     <w:nsid w:val="584D3962"/>
     <w:multiLevelType w:val="multilevel"/>
     <w:tmpl w:val="25300B24"/>
@@ -2973,7 +6804,7 @@
       </w:rPr>
     </w:lvl>
   </w:abstractNum>
-  <w:abstractNum w:abstractNumId="7" w15:restartNumberingAfterBreak="0">
+  <w:abstractNum w:abstractNumId="8" w15:restartNumberingAfterBreak="0">
     <w:nsid w:val="6AE51F09"/>
     <w:multiLevelType w:val="hybridMultilevel"/>
     <w:tmpl w:val="633A3BC0"/>
@@ -3088,7 +6919,7 @@
     </w:lvl>
   </w:abstractNum>
   <w:num w:numId="1" w16cid:durableId="499930013">
-    <w:abstractNumId w:val="3"/>
+    <w:abstractNumId w:val="4"/>
     <w:lvlOverride w:ilvl="0">
       <w:lvl w:ilvl="0">
         <w:numFmt w:val="lowerLetter"/>
@@ -3098,7 +6929,7 @@
     </w:lvlOverride>
   </w:num>
   <w:num w:numId="2" w16cid:durableId="58751315">
-    <w:abstractNumId w:val="3"/>
+    <w:abstractNumId w:val="4"/>
     <w:lvlOverride w:ilvl="0">
       <w:lvl w:ilvl="0">
         <w:numFmt w:val="lowerLetter"/>
@@ -3108,7 +6939,7 @@
     </w:lvlOverride>
   </w:num>
   <w:num w:numId="3" w16cid:durableId="1237595723">
-    <w:abstractNumId w:val="3"/>
+    <w:abstractNumId w:val="4"/>
     <w:lvlOverride w:ilvl="0">
       <w:lvl w:ilvl="0">
         <w:numFmt w:val="lowerLetter"/>
@@ -3118,7 +6949,7 @@
     </w:lvlOverride>
   </w:num>
   <w:num w:numId="4" w16cid:durableId="435101736">
-    <w:abstractNumId w:val="3"/>
+    <w:abstractNumId w:val="4"/>
     <w:lvlOverride w:ilvl="0">
       <w:lvl w:ilvl="0">
         <w:numFmt w:val="lowerLetter"/>
@@ -3128,7 +6959,7 @@
     </w:lvlOverride>
   </w:num>
   <w:num w:numId="5" w16cid:durableId="1116799345">
-    <w:abstractNumId w:val="3"/>
+    <w:abstractNumId w:val="4"/>
     <w:lvlOverride w:ilvl="0">
       <w:lvl w:ilvl="0">
         <w:numFmt w:val="lowerLetter"/>
@@ -3138,7 +6969,7 @@
     </w:lvlOverride>
   </w:num>
   <w:num w:numId="6" w16cid:durableId="917784958">
-    <w:abstractNumId w:val="3"/>
+    <w:abstractNumId w:val="4"/>
     <w:lvlOverride w:ilvl="0">
       <w:lvl w:ilvl="0">
         <w:numFmt w:val="lowerLetter"/>
@@ -3154,19 +6985,22 @@
     <w:abstractNumId w:val="1"/>
   </w:num>
   <w:num w:numId="9" w16cid:durableId="1311859611">
-    <w:abstractNumId w:val="7"/>
+    <w:abstractNumId w:val="8"/>
   </w:num>
   <w:num w:numId="10" w16cid:durableId="400099115">
     <w:abstractNumId w:val="2"/>
   </w:num>
   <w:num w:numId="11" w16cid:durableId="208764">
+    <w:abstractNumId w:val="6"/>
+  </w:num>
+  <w:num w:numId="12" w16cid:durableId="1855263633">
+    <w:abstractNumId w:val="7"/>
+  </w:num>
+  <w:num w:numId="13" w16cid:durableId="1571229098">
     <w:abstractNumId w:val="5"/>
   </w:num>
-  <w:num w:numId="12" w16cid:durableId="1855263633">
-    <w:abstractNumId w:val="6"/>
-  </w:num>
-  <w:num w:numId="13" w16cid:durableId="1571229098">
-    <w:abstractNumId w:val="4"/>
+  <w:num w:numId="14" w16cid:durableId="386614125">
+    <w:abstractNumId w:val="3"/>
   </w:num>
 </w:numbering>
 </file>
@@ -3571,6 +7405,7 @@
   <w:style w:type="paragraph" w:default="1" w:styleId="Normal">
     <w:name w:val="Normal"/>
     <w:qFormat/>
+    <w:rsid w:val="009E2A08"/>
   </w:style>
   <w:style w:type="paragraph" w:styleId="Ttulo1">
     <w:name w:val="heading 1"/>
@@ -3774,7 +7609,6 @@
   <w:style w:type="character" w:default="1" w:styleId="Fuentedeprrafopredeter">
     <w:name w:val="Default Paragraph Font"/>
     <w:uiPriority w:val="1"/>
-    <w:semiHidden/>
     <w:unhideWhenUsed/>
   </w:style>
   <w:style w:type="table" w:default="1" w:styleId="Tablanormal">
@@ -4151,6 +7985,16 @@
     <w:uiPriority w:val="99"/>
     <w:rsid w:val="0009137A"/>
   </w:style>
+  <w:style w:type="character" w:styleId="Textodelmarcadordeposicin">
+    <w:name w:val="Placeholder Text"/>
+    <w:basedOn w:val="Fuentedeprrafopredeter"/>
+    <w:uiPriority w:val="99"/>
+    <w:semiHidden/>
+    <w:rsid w:val="00F77024"/>
+    <w:rPr>
+      <w:color w:val="666666"/>
+    </w:rPr>
+  </w:style>
 </w:styles>
 </file>
 
@@ -4447,4 +8291,16 @@
     </a:ext>
   </a:extLst>
 </a:theme>
+</file>
+
+<file path=customXml/item1.xml><?xml version="1.0" encoding="utf-8"?>
+<b:Sources xmlns:b="http://schemas.openxmlformats.org/officeDocument/2006/bibliography" xmlns="http://schemas.openxmlformats.org/officeDocument/2006/bibliography" SelectedStyle="\APASixthEditionOfficeOnline.xsl" StyleName="APA" Version="6"/>
+</file>
+
+<file path=customXml/itemProps1.xml><?xml version="1.0" encoding="utf-8"?>
+<ds:datastoreItem xmlns:ds="http://schemas.openxmlformats.org/officeDocument/2006/customXml" ds:itemID="{44A20B2A-32A0-4F41-BA93-6C2259B39BDB}">
+  <ds:schemaRefs>
+    <ds:schemaRef ds:uri="http://schemas.openxmlformats.org/officeDocument/2006/bibliography"/>
+  </ds:schemaRefs>
+</ds:datastoreItem>
 </file>
</xml_diff>